<commit_message>
Adjusted for inflation and currency. Also added a breadown by Sex figure
</commit_message>
<xml_diff>
--- a/writings/North_American_Refugee/North American Refuge - jl.docx
+++ b/writings/North_American_Refugee/North American Refuge - jl.docx
@@ -141,21 +141,7 @@
           <w:rFonts w:ascii="Times New Roman" w:hAnsi="Times New Roman" w:cs="Times New Roman"/>
         </w:rPr>
         <w:lastRenderedPageBreak/>
-        <w:t xml:space="preserve">Countries can have multiple paths for immigration and migrants. One of particular emphasis in North America </w:t>
-      </w:r>
-      <w:proofErr w:type="gramStart"/>
-      <w:r>
-        <w:rPr>
-          <w:rFonts w:ascii="Times New Roman" w:hAnsi="Times New Roman" w:cs="Times New Roman"/>
-        </w:rPr>
-        <w:t>are</w:t>
-      </w:r>
-      <w:proofErr w:type="gramEnd"/>
-      <w:r>
-        <w:rPr>
-          <w:rFonts w:ascii="Times New Roman" w:hAnsi="Times New Roman" w:cs="Times New Roman"/>
-        </w:rPr>
-        <w:t xml:space="preserve"> the refugee resettlement systems</w:t>
+        <w:t>Countries can have multiple paths for immigration and migrants. One of particular emphasis in North America are the refugee resettlement systems</w:t>
       </w:r>
       <w:r>
         <w:rPr>
@@ -3513,7 +3499,7 @@
         <w:rPr>
           <w:rFonts w:ascii="Times New Roman" w:hAnsi="Times New Roman" w:cs="Times New Roman"/>
         </w:rPr>
-        <w:instrText xml:space="preserve"> ADDIN ZOTERO_ITEM CSL_CITATION {"citationID":"eVZipgEk","properties":{"formattedCitation":"(Coyne 2013; Lavoie 2016)","plainCitation":"(Coyne 2013; Lavoie 2016)","noteIndex":0},"citationItems":[{"id":"70sExsLm/y9jhnHrm","uris":["http://zotero.org/users/6152647/items/ZRS3JPWR"],"itemData":{"id":1354,"type":"book","abstract":"In 2010, Haiti was ravaged by a brutal earthquake that affected the lives of millions. The call to assist those in need was heard around the globe. Yet two years later humanitarian efforts led by governments and NGOs have largely failed. Resources are not reaching the needy due to bureaucratic red tape, and many assets have been squandered. How can efforts intended to help the suffering fail so badly? In this timely and provocative book, Christopher J. Coyne uses the economic way of thinking to explain why this and other humanitarian efforts that intend to do good end up doing nothing or causing harm. In addition to Haiti, Coyne considers a wide range of interventions. He explains why the U.S. government was ineffective following Hurricane Katrina, why the international humanitarian push to remove Muammar Gaddafi in Libya may very well end up causing more problems than prosperity, and why decades of efforts to respond to crises and foster development around the world have resulted in repeated failures. In place of the dominant approach to state-led humanitarian action, this book offers a bold alternative, focused on establishing an environment of economic freedom. If we are willing to experiment with aid—asking questions about how to foster development as a process of societal discovery, or how else we might engage the private sector, for instance—we increase the range of alternatives to help people and empower them to improve their communities. Anyone concerned with and dedicated to alleviating human suffering in the short term or for the long haul, from policymakers and activists to scholars, will find this book to be an insightful and provocative reframing of humanitarian action.","edition":"First Edition","event-place":"Stanford (Calif.)","ISBN":"978-0-8047-7228-0","language":"English","number-of-pages":"272","publisher":"Stanford University Press","publisher-place":"Stanford (Calif.)","source":"Amazon","title":"Doing Bad by Doing Good: Why Humanitarian Action Fails","title-short":"Doing Bad by Doing Good","author":[{"family":"Coyne","given":"Christopher J."}],"issued":{"date-parts":[["2013",5,1]]}}},{"id":1356,"uris":["http://zotero.org/users/6152647/items/ZNPR2W43"],"itemData":{"id":1356,"type":"book","abstract":"Can a “radical free-market” economy help to end poverty and militarism while avoiding the quagmire of central planning? Don Lavoie makes a strong case that it can in National Economic Planning: What Is Left? Avoiding the conventional pitfalls of the Right and the Left, Lavoie argues with a strong social consciousness that liberal and radical arguments for national economic planning fail to solve the basic problem of coordinating knowledge in society. He shows how decentralized markets solve this problem, while no means exist for a central planner to elicit the information needed to coordinate a complex, interrelated economy. National Economic Planning: What Is Left? begins by showing why there is a need for a scientific-radical perspective and why central planning is not the answer. The author systematically and thoroughly critiques Far Left and Marxist positions, as well as the more popular views of macroeconomic planning, economic democracy, and industrial policy. Lavoie’s premise is that economic planning is not a rationally organized, objective system but rather a dynamic process with only very subjective means for determining which product is “best” or preferred by the consumer. The arbiter for “what is best?” must be free-market competition and not a centralized planner. Planning can do nothing but disrupt social and economic coordination and worsen the serious problems of modern economies. Constantly sensitive to the social concerns that have inspired “radicals” from Thomas Jefferson to Karl Marx, Lavoie demonstrates where and why the traditional policies of the Left have failed, why today’s liberal and neoconservative variations on economic planning cannot accomplish their goals, and what alternative policies can produce progressive social change in a prosperous and growing economy. Economic planning, Lavoie contends, is an unworkable and ultimately reactionary policy that must be rejected by the Left if radicals seek to offer real solutions to pressing social problems. This book challenges radicals—and their critics—to begin reformulating their whole conception of progressive economic change without reliance on central planning. National Economic Planning: What Is Left? is as comprehensive as it is controversial. Written for lay readers as well as economists and social analysts, its arguments rely as heavily on common sense as they do on scientific method and will challenge thinkers and policymakers of every political persuasion. Praise for the Book“Don Lavoie’s book will serve a very important function. After more than fifty years of discussion in which the socialists at first just would not listen, their position has now collapsed. Yet this long discussion was not without benefits. We have learnt much from this resistance to seeing the truth, and we shall also learn much from studying this systematic exposition of the present state of our knowledge of the problems.” —F. A. Hayek, Nobel laureate“Lavoie’s superb study develops an immensely powerful case for the irrationality of national economic planning. It is distinctive in showing that conventional ideas of economic planning depend upon conceptions of human knowledge that are philosophically untenable. It will be of great interest to economists, political scientists, philosophers, and all those concerned with current trends in public policy.” —John Gray, Oxford University","edition":"1st edition","event-place":"Arlington, Virginia","ISBN":"978-1-942951-26-1","language":"English","number-of-pages":"322","publisher":"Mercatus Center at George Mason University","publisher-place":"Arlington, Virginia","source":"Amazon","title":"National Economic Planning: What Is Left?","title-short":"National Economic Planning","author":[{"family":"Lavoie","given":"Don"}],"issued":{"date-parts":[["2016",8,5]]}}}],"schema":"https://github.com/citation-style-language/schema/raw/master/csl-citation.json"} </w:instrText>
+        <w:instrText xml:space="preserve"> ADDIN ZOTERO_ITEM CSL_CITATION {"citationID":"eVZipgEk","properties":{"formattedCitation":"(Coyne 2013; Lavoie 2016)","plainCitation":"(Coyne 2013; Lavoie 2016)","noteIndex":0},"citationItems":[{"id":"gPO8l3UR/4YhStm8K","uris":["http://zotero.org/users/6152647/items/ZRS3JPWR"],"itemData":{"id":1354,"type":"book","abstract":"In 2010, Haiti was ravaged by a brutal earthquake that affected the lives of millions. The call to assist those in need was heard around the globe. Yet two years later humanitarian efforts led by governments and NGOs have largely failed. Resources are not reaching the needy due to bureaucratic red tape, and many assets have been squandered. How can efforts intended to help the suffering fail so badly? In this timely and provocative book, Christopher J. Coyne uses the economic way of thinking to explain why this and other humanitarian efforts that intend to do good end up doing nothing or causing harm. In addition to Haiti, Coyne considers a wide range of interventions. He explains why the U.S. government was ineffective following Hurricane Katrina, why the international humanitarian push to remove Muammar Gaddafi in Libya may very well end up causing more problems than prosperity, and why decades of efforts to respond to crises and foster development around the world have resulted in repeated failures. In place of the dominant approach to state-led humanitarian action, this book offers a bold alternative, focused on establishing an environment of economic freedom. If we are willing to experiment with aid—asking questions about how to foster development as a process of societal discovery, or how else we might engage the private sector, for instance—we increase the range of alternatives to help people and empower them to improve their communities. Anyone concerned with and dedicated to alleviating human suffering in the short term or for the long haul, from policymakers and activists to scholars, will find this book to be an insightful and provocative reframing of humanitarian action.","edition":"First Edition","event-place":"Stanford (Calif.)","ISBN":"978-0-8047-7228-0","language":"English","number-of-pages":"272","publisher":"Stanford University Press","publisher-place":"Stanford (Calif.)","source":"Amazon","title":"Doing Bad by Doing Good: Why Humanitarian Action Fails","title-short":"Doing Bad by Doing Good","author":[{"family":"Coyne","given":"Christopher J."}],"issued":{"date-parts":[["2013",5,1]]}}},{"id":1356,"uris":["http://zotero.org/users/6152647/items/ZNPR2W43"],"itemData":{"id":1356,"type":"book","abstract":"Can a “radical free-market” economy help to end poverty and militarism while avoiding the quagmire of central planning? Don Lavoie makes a strong case that it can in National Economic Planning: What Is Left? Avoiding the conventional pitfalls of the Right and the Left, Lavoie argues with a strong social consciousness that liberal and radical arguments for national economic planning fail to solve the basic problem of coordinating knowledge in society. He shows how decentralized markets solve this problem, while no means exist for a central planner to elicit the information needed to coordinate a complex, interrelated economy. National Economic Planning: What Is Left? begins by showing why there is a need for a scientific-radical perspective and why central planning is not the answer. The author systematically and thoroughly critiques Far Left and Marxist positions, as well as the more popular views of macroeconomic planning, economic democracy, and industrial policy. Lavoie’s premise is that economic planning is not a rationally organized, objective system but rather a dynamic process with only very subjective means for determining which product is “best” or preferred by the consumer. The arbiter for “what is best?” must be free-market competition and not a centralized planner. Planning can do nothing but disrupt social and economic coordination and worsen the serious problems of modern economies. Constantly sensitive to the social concerns that have inspired “radicals” from Thomas Jefferson to Karl Marx, Lavoie demonstrates where and why the traditional policies of the Left have failed, why today’s liberal and neoconservative variations on economic planning cannot accomplish their goals, and what alternative policies can produce progressive social change in a prosperous and growing economy. Economic planning, Lavoie contends, is an unworkable and ultimately reactionary policy that must be rejected by the Left if radicals seek to offer real solutions to pressing social problems. This book challenges radicals—and their critics—to begin reformulating their whole conception of progressive economic change without reliance on central planning. National Economic Planning: What Is Left? is as comprehensive as it is controversial. Written for lay readers as well as economists and social analysts, its arguments rely as heavily on common sense as they do on scientific method and will challenge thinkers and policymakers of every political persuasion. Praise for the Book“Don Lavoie’s book will serve a very important function. After more than fifty years of discussion in which the socialists at first just would not listen, their position has now collapsed. Yet this long discussion was not without benefits. We have learnt much from this resistance to seeing the truth, and we shall also learn much from studying this systematic exposition of the present state of our knowledge of the problems.” —F. A. Hayek, Nobel laureate“Lavoie’s superb study develops an immensely powerful case for the irrationality of national economic planning. It is distinctive in showing that conventional ideas of economic planning depend upon conceptions of human knowledge that are philosophically untenable. It will be of great interest to economists, political scientists, philosophers, and all those concerned with current trends in public policy.” —John Gray, Oxford University","edition":"1st edition","event-place":"Arlington, Virginia","ISBN":"978-1-942951-26-1","language":"English","number-of-pages":"322","publisher":"Mercatus Center at George Mason University","publisher-place":"Arlington, Virginia","source":"Amazon","title":"National Economic Planning: What Is Left?","title-short":"National Economic Planning","author":[{"family":"Lavoie","given":"Don"}],"issued":{"date-parts":[["2016",8,5]]}}}],"schema":"https://github.com/citation-style-language/schema/raw/master/csl-citation.json"} </w:instrText>
       </w:r>
       <w:r>
         <w:rPr>
@@ -3884,21 +3870,7 @@
         <w:rPr>
           <w:rFonts w:ascii="Times New Roman" w:hAnsi="Times New Roman" w:cs="Times New Roman"/>
         </w:rPr>
-        <w:t xml:space="preserve"> This does assume that tax </w:t>
-      </w:r>
-      <w:proofErr w:type="gramStart"/>
-      <w:r>
-        <w:rPr>
-          <w:rFonts w:ascii="Times New Roman" w:hAnsi="Times New Roman" w:cs="Times New Roman"/>
-        </w:rPr>
-        <w:t>filers</w:t>
-      </w:r>
-      <w:proofErr w:type="gramEnd"/>
-      <w:r>
-        <w:rPr>
-          <w:rFonts w:ascii="Times New Roman" w:hAnsi="Times New Roman" w:cs="Times New Roman"/>
-        </w:rPr>
-        <w:t xml:space="preserve"> are representative of the refugee population generally.</w:t>
+        <w:t xml:space="preserve"> This does assume that tax filers are representative of the refugee population generally.</w:t>
       </w:r>
       <w:commentRangeEnd w:id="3"/>
       <w:r>
@@ -4247,7 +4219,7 @@
         <w:rPr>
           <w:rFonts w:ascii="Times New Roman" w:hAnsi="Times New Roman" w:cs="Times New Roman"/>
         </w:rPr>
-        <w:instrText xml:space="preserve"> ADDIN ZOTERO_ITEM CSL_CITATION {"citationID":"pwdyo2wW","properties":{"formattedCitation":"(Bureau of Population, Refugees, and Migration 2016)","plainCitation":"(Bureau of Population, Refugees, and Migration 2016)","noteIndex":0},"citationItems":[{"id":1362,"uris":["http://zotero.org/users/6152647/items/FCRE8H3Z"],"itemData":{"id":1362,"type":"document","title":"Congressional Presentation Document","URL":"https://2009-2017.state.gov/j/prm/releases/docsforcongress/index.htm","author":[{"literal":"Bureau of Population, Refugees, and Migration"}],"issued":{"date-parts":[["2016"]]}}}],"schema":"https://github.com/citation-style-language/schema/raw/master/csl-citation.json"} </w:instrText>
+        <w:instrText xml:space="preserve"> ADDIN ZOTERO_ITEM CSL_CITATION {"citationID":"pwdyo2wW","properties":{"formattedCitation":"(Bureau of Population, Refugees, and Migration 2016)","plainCitation":"(Bureau of Population, Refugees, and Migration 2016)","dontUpdate":true,"noteIndex":0},"citationItems":[{"id":1362,"uris":["http://zotero.org/users/6152647/items/FCRE8H3Z"],"itemData":{"id":1362,"type":"document","title":"Congressional Presentation Document","URL":"https://2009-2017.state.gov/j/prm/releases/docsforcongress/index.htm","author":[{"literal":"Bureau of Population, Refugees, and Migration"}],"issued":{"date-parts":[["2016"]]}}}],"schema":"https://github.com/citation-style-language/schema/raw/master/csl-citation.json"} </w:instrText>
       </w:r>
       <w:r>
         <w:rPr>
@@ -4310,7 +4282,7 @@
         <w:rPr>
           <w:rFonts w:ascii="Times New Roman" w:hAnsi="Times New Roman" w:cs="Times New Roman"/>
         </w:rPr>
-        <w:instrText xml:space="preserve"> ADDIN ZOTERO_ITEM CSL_CITATION {"citationID":"Fl12Fvht","properties":{"formattedCitation":"(United States Office of Refugee Resettlement 2021)","plainCitation":"(United States Office of Refugee Resettlement 2021)","noteIndex":0},"citationItems":[{"id":68,"uris":["http://zotero.org/users/6152647/items/ZUVFDP8T"],"itemData":{"id":68,"type":"report","abstract":"The Annual Report to Congress for fiscal year (FY) 2018 was prepared in accordance with the Refugee Act of 1980. The report presents the activities, expenditures, and policies of the Office of Refugee Resettlement (ORR) and information about the individuals receiving ORR benefits and services. A summary of the information contained in this report is outlined below.","language":"en","publisher":"Office of Refugee Resettlement","title":"Annual Report to Congress 2018","URL":"https://www.acf.hhs.gov/report/annual-orr-reports-congress","author":[{"literal":"United States Office of Refugee Resettlement"}],"accessed":{"date-parts":[["2021",9,14]]},"issued":{"date-parts":[["2021"]]}}}],"schema":"https://github.com/citation-style-language/schema/raw/master/csl-citation.json"} </w:instrText>
+        <w:instrText xml:space="preserve"> ADDIN ZOTERO_ITEM CSL_CITATION {"citationID":"Fl12Fvht","properties":{"formattedCitation":"(United States Office of Refugee Resettlement 2021)","plainCitation":"(United States Office of Refugee Resettlement 2021)","dontUpdate":true,"noteIndex":0},"citationItems":[{"id":68,"uris":["http://zotero.org/users/6152647/items/ZUVFDP8T"],"itemData":{"id":68,"type":"report","abstract":"The Annual Report to Congress for fiscal year (FY) 2018 was prepared in accordance with the Refugee Act of 1980. The report presents the activities, expenditures, and policies of the Office of Refugee Resettlement (ORR) and information about the individuals receiving ORR benefits and services. A summary of the information contained in this report is outlined below.","language":"en","publisher":"Office of Refugee Resettlement","title":"Annual Report to Congress 2018","URL":"https://www.acf.hhs.gov/report/annual-orr-reports-congress","author":[{"literal":"United States Office of Refugee Resettlement"}],"accessed":{"date-parts":[["2021",9,14]]},"issued":{"date-parts":[["2021"]]}}}],"schema":"https://github.com/citation-style-language/schema/raw/master/csl-citation.json"} </w:instrText>
       </w:r>
       <w:r>
         <w:rPr>
@@ -4480,14 +4452,12 @@
         </w:rPr>
         <w:t xml:space="preserve">For both countries, I simply </w:t>
       </w:r>
-      <w:proofErr w:type="gramStart"/>
       <w:r>
         <w:rPr>
           <w:rFonts w:ascii="Times New Roman" w:hAnsi="Times New Roman" w:cs="Times New Roman"/>
         </w:rPr>
         <w:t>sum</w:t>
       </w:r>
-      <w:proofErr w:type="gramEnd"/>
       <w:r>
         <w:rPr>
           <w:rFonts w:ascii="Times New Roman" w:hAnsi="Times New Roman" w:cs="Times New Roman"/>
@@ -4505,6 +4475,105 @@
           <w:rFonts w:ascii="Times New Roman" w:hAnsi="Times New Roman" w:cs="Times New Roman"/>
         </w:rPr>
         <w:t xml:space="preserve">contributes to a refugee assistance program. </w:t>
+      </w:r>
+    </w:p>
+    <w:p>
+      <w:pPr>
+        <w:spacing w:line="480" w:lineRule="auto"/>
+        <w:ind w:firstLine="720"/>
+        <w:rPr>
+          <w:rFonts w:ascii="Times New Roman" w:hAnsi="Times New Roman" w:cs="Times New Roman"/>
+        </w:rPr>
+      </w:pPr>
+      <w:r>
+        <w:rPr>
+          <w:rFonts w:ascii="Times New Roman" w:hAnsi="Times New Roman" w:cs="Times New Roman"/>
+        </w:rPr>
+        <w:t>I convert the Canadian and United States dollars to a 2016 U.S. dollar for presentation. I use the Bureau of Labor Statistic</w:t>
+      </w:r>
+      <w:r>
+        <w:rPr>
+          <w:rFonts w:ascii="Times New Roman" w:hAnsi="Times New Roman" w:cs="Times New Roman"/>
+        </w:rPr>
+        <w:t xml:space="preserve">s </w:t>
+      </w:r>
+      <w:r>
+        <w:rPr>
+          <w:rFonts w:ascii="Times New Roman" w:hAnsi="Times New Roman" w:cs="Times New Roman"/>
+        </w:rPr>
+        <w:fldChar w:fldCharType="begin"/>
+      </w:r>
+      <w:r>
+        <w:rPr>
+          <w:rFonts w:ascii="Times New Roman" w:hAnsi="Times New Roman" w:cs="Times New Roman"/>
+        </w:rPr>
+        <w:instrText xml:space="preserve"> ADDIN ZOTERO_ITEM CSL_CITATION {"citationID":"5Lag33VT","properties":{"formattedCitation":"(Bureau of Labor Statistics 2024)","plainCitation":"(Bureau of Labor Statistics 2024)","noteIndex":0},"citationItems":[{"id":1373,"uris":["http://zotero.org/users/6152647/items/NX7M2GXE"],"itemData":{"id":1373,"type":"dataset","title":"Consumer Price Index for All Urban Consumers","URL":"https://data.bls.gov/timeseries/CUUR0000SA0","author":[{"literal":"Bureau of Labor Statistics"}],"issued":{"date-parts":[["2024"]]}}}],"schema":"https://github.com/citation-style-language/schema/raw/master/csl-citation.json"} </w:instrText>
+      </w:r>
+      <w:r>
+        <w:rPr>
+          <w:rFonts w:ascii="Times New Roman" w:hAnsi="Times New Roman" w:cs="Times New Roman"/>
+        </w:rPr>
+        <w:fldChar w:fldCharType="separate"/>
+      </w:r>
+      <w:r>
+        <w:rPr>
+          <w:rFonts w:ascii="Times New Roman" w:hAnsi="Times New Roman" w:cs="Times New Roman"/>
+        </w:rPr>
+        <w:t>(2024)</w:t>
+      </w:r>
+      <w:r>
+        <w:rPr>
+          <w:rFonts w:ascii="Times New Roman" w:hAnsi="Times New Roman" w:cs="Times New Roman"/>
+        </w:rPr>
+        <w:fldChar w:fldCharType="end"/>
+      </w:r>
+      <w:r>
+        <w:rPr>
+          <w:rFonts w:ascii="Times New Roman" w:hAnsi="Times New Roman" w:cs="Times New Roman"/>
+        </w:rPr>
+        <w:t xml:space="preserve"> consumer price index to adjust for inflation between different years of the U.S. dollar. I use the U.S. Department of the Treasury’s Reporting Rates of Exchange tables</w:t>
+      </w:r>
+      <w:r>
+        <w:rPr>
+          <w:rFonts w:ascii="Times New Roman" w:hAnsi="Times New Roman" w:cs="Times New Roman"/>
+        </w:rPr>
+        <w:t xml:space="preserve"> </w:t>
+      </w:r>
+      <w:r>
+        <w:rPr>
+          <w:rFonts w:ascii="Times New Roman" w:hAnsi="Times New Roman" w:cs="Times New Roman"/>
+        </w:rPr>
+        <w:fldChar w:fldCharType="begin"/>
+      </w:r>
+      <w:r>
+        <w:rPr>
+          <w:rFonts w:ascii="Times New Roman" w:hAnsi="Times New Roman" w:cs="Times New Roman"/>
+        </w:rPr>
+        <w:instrText xml:space="preserve"> ADDIN ZOTERO_ITEM CSL_CITATION {"citationID":"5wJfDYGm","properties":{"formattedCitation":"(U.S. Department of the Treasury 2024)","plainCitation":"(U.S. Department of the Treasury 2024)","noteIndex":0},"citationItems":[{"id":1372,"uris":["http://zotero.org/users/6152647/items/D7FDZUQD"],"itemData":{"id":1372,"type":"dataset","title":"Treasury Reporting Rates of Exchange","URL":"https://fiscaldata.treasury.gov/datasets/treasury-reporting-rates-exchange/treasury-reporting-rates-of-exchange","author":[{"literal":"U.S. Department of the Treasury"}],"issued":{"date-parts":[["2024"]]}}}],"schema":"https://github.com/citation-style-language/schema/raw/master/csl-citation.json"} </w:instrText>
+      </w:r>
+      <w:r>
+        <w:rPr>
+          <w:rFonts w:ascii="Times New Roman" w:hAnsi="Times New Roman" w:cs="Times New Roman"/>
+        </w:rPr>
+        <w:fldChar w:fldCharType="separate"/>
+      </w:r>
+      <w:r>
+        <w:rPr>
+          <w:rFonts w:ascii="Times New Roman" w:hAnsi="Times New Roman" w:cs="Times New Roman"/>
+        </w:rPr>
+        <w:t>(2024)</w:t>
+      </w:r>
+      <w:r>
+        <w:rPr>
+          <w:rFonts w:ascii="Times New Roman" w:hAnsi="Times New Roman" w:cs="Times New Roman"/>
+        </w:rPr>
+        <w:fldChar w:fldCharType="end"/>
+      </w:r>
+      <w:r>
+        <w:rPr>
+          <w:rFonts w:ascii="Times New Roman" w:hAnsi="Times New Roman" w:cs="Times New Roman"/>
+        </w:rPr>
+        <w:t xml:space="preserve"> to obtain the average exchange rate between Canadian and U.S. dollars at the Start of the fiscal year.  </w:t>
       </w:r>
     </w:p>
     <w:p>
@@ -4538,6 +4607,7 @@
             </w:rPr>
           </w:rPrChange>
         </w:rPr>
+        <w:lastRenderedPageBreak/>
         <w:t>Analytic Approach</w:t>
       </w:r>
     </w:p>
@@ -4705,14 +4775,7 @@
         <w:rPr>
           <w:rFonts w:ascii="Times New Roman" w:hAnsi="Times New Roman" w:cs="Times New Roman"/>
         </w:rPr>
-        <w:t xml:space="preserve">This </w:t>
-      </w:r>
-      <w:r>
-        <w:rPr>
-          <w:rFonts w:ascii="Times New Roman" w:hAnsi="Times New Roman" w:cs="Times New Roman"/>
-        </w:rPr>
-        <w:lastRenderedPageBreak/>
-        <w:t xml:space="preserve">is mathematically </w:t>
+        <w:t xml:space="preserve">This is mathematically </w:t>
       </w:r>
       <w:r>
         <w:rPr>
@@ -5864,7 +5927,14 @@
         <w:rPr>
           <w:rFonts w:ascii="Times New Roman" w:hAnsi="Times New Roman" w:cs="Times New Roman"/>
         </w:rPr>
-        <w:t xml:space="preserve"> (combined, male, or female)</w:t>
+        <w:t xml:space="preserve"> (combined, </w:t>
+      </w:r>
+      <w:r>
+        <w:rPr>
+          <w:rFonts w:ascii="Times New Roman" w:hAnsi="Times New Roman" w:cs="Times New Roman"/>
+        </w:rPr>
+        <w:lastRenderedPageBreak/>
+        <w:t>male, or female)</w:t>
       </w:r>
       <w:r>
         <w:rPr>
@@ -5953,7 +6023,6 @@
         <w:rPr>
           <w:rFonts w:ascii="Times New Roman" w:hAnsi="Times New Roman" w:cs="Times New Roman"/>
         </w:rPr>
-        <w:lastRenderedPageBreak/>
         <w:t xml:space="preserve">Figure 1 </w:t>
       </w:r>
       <w:r>
@@ -6160,21 +6229,21 @@
     </w:p>
     <w:tbl>
       <w:tblPr>
-        <w:tblW w:w="10396" w:type="dxa"/>
+        <w:tblW w:w="10816" w:type="dxa"/>
         <w:tblLayout w:type="fixed"/>
         <w:tblLook w:val="04A0" w:firstRow="1" w:lastRow="0" w:firstColumn="1" w:lastColumn="0" w:noHBand="0" w:noVBand="1"/>
       </w:tblPr>
       <w:tblGrid>
-        <w:gridCol w:w="5198"/>
-        <w:gridCol w:w="5198"/>
+        <w:gridCol w:w="5408"/>
+        <w:gridCol w:w="5408"/>
       </w:tblGrid>
       <w:tr>
         <w:trPr>
-          <w:trHeight w:val="640"/>
+          <w:trHeight w:val="655"/>
         </w:trPr>
         <w:tc>
           <w:tcPr>
-            <w:tcW w:w="10396" w:type="dxa"/>
+            <w:tcW w:w="10816" w:type="dxa"/>
             <w:gridSpan w:val="2"/>
             <w:tcBorders>
               <w:left w:val="nil"/>
@@ -6200,11 +6269,11 @@
       </w:tr>
       <w:tr>
         <w:trPr>
-          <w:trHeight w:val="3170"/>
+          <w:trHeight w:val="3248"/>
         </w:trPr>
         <w:tc>
           <w:tcPr>
-            <w:tcW w:w="5198" w:type="dxa"/>
+            <w:tcW w:w="5408" w:type="dxa"/>
             <w:tcBorders>
               <w:top w:val="single" w:sz="4" w:space="0" w:color="auto"/>
               <w:left w:val="nil"/>
@@ -6225,8 +6294,8 @@
                 <w:noProof/>
               </w:rPr>
               <w:drawing>
-                <wp:inline distT="0" distB="0" distL="0" distR="0" wp14:anchorId="77D8170C" wp14:editId="447E58C2">
-                  <wp:extent cx="3182112" cy="1965960"/>
+                <wp:inline distT="0" distB="0" distL="0" distR="0" wp14:anchorId="77D8170C" wp14:editId="7061268D">
+                  <wp:extent cx="3291840" cy="2033752"/>
                   <wp:effectExtent l="0" t="0" r="0" b="0"/>
                   <wp:docPr id="1" name="Picture 2"/>
                   <wp:cNvGraphicFramePr>
@@ -6250,7 +6319,7 @@
                         <pic:spPr bwMode="auto">
                           <a:xfrm>
                             <a:off x="0" y="0"/>
-                            <a:ext cx="3182112" cy="1965960"/>
+                            <a:ext cx="3291840" cy="2033752"/>
                           </a:xfrm>
                           <a:prstGeom prst="rect">
                             <a:avLst/>
@@ -6266,7 +6335,7 @@
         </w:tc>
         <w:tc>
           <w:tcPr>
-            <w:tcW w:w="5198" w:type="dxa"/>
+            <w:tcW w:w="5408" w:type="dxa"/>
             <w:tcBorders>
               <w:top w:val="single" w:sz="4" w:space="0" w:color="auto"/>
               <w:left w:val="nil"/>
@@ -6287,8 +6356,8 @@
                 <w:noProof/>
               </w:rPr>
               <w:drawing>
-                <wp:inline distT="0" distB="0" distL="0" distR="0" wp14:anchorId="77D8170E" wp14:editId="5E149022">
-                  <wp:extent cx="3200400" cy="1975104"/>
+                <wp:inline distT="0" distB="0" distL="0" distR="0" wp14:anchorId="77D8170E" wp14:editId="4431B4B7">
+                  <wp:extent cx="3291840" cy="2031536"/>
                   <wp:effectExtent l="0" t="0" r="0" b="0"/>
                   <wp:docPr id="2" name="Picture 3"/>
                   <wp:cNvGraphicFramePr>
@@ -6312,7 +6381,7 @@
                         <pic:spPr bwMode="auto">
                           <a:xfrm>
                             <a:off x="0" y="0"/>
-                            <a:ext cx="3200400" cy="1975104"/>
+                            <a:ext cx="3291840" cy="2031536"/>
                           </a:xfrm>
                           <a:prstGeom prst="rect">
                             <a:avLst/>
@@ -6329,11 +6398,11 @@
       </w:tr>
       <w:tr>
         <w:trPr>
-          <w:trHeight w:val="3170"/>
+          <w:trHeight w:val="3248"/>
         </w:trPr>
         <w:tc>
           <w:tcPr>
-            <w:tcW w:w="5198" w:type="dxa"/>
+            <w:tcW w:w="5408" w:type="dxa"/>
             <w:tcBorders>
               <w:top w:val="nil"/>
               <w:left w:val="nil"/>
@@ -6358,8 +6427,8 @@
               </w:rPr>
               <w:lastRenderedPageBreak/>
               <w:drawing>
-                <wp:inline distT="0" distB="0" distL="0" distR="0" wp14:anchorId="77D81710" wp14:editId="66508293">
-                  <wp:extent cx="3182112" cy="1965960"/>
+                <wp:inline distT="0" distB="0" distL="0" distR="0" wp14:anchorId="77D81710" wp14:editId="4B05167C">
+                  <wp:extent cx="3291840" cy="2033752"/>
                   <wp:effectExtent l="0" t="0" r="0" b="0"/>
                   <wp:docPr id="3" name="Picture 6"/>
                   <wp:cNvGraphicFramePr>
@@ -6383,7 +6452,7 @@
                         <pic:spPr bwMode="auto">
                           <a:xfrm>
                             <a:off x="0" y="0"/>
-                            <a:ext cx="3182112" cy="1965960"/>
+                            <a:ext cx="3291840" cy="2033752"/>
                           </a:xfrm>
                           <a:prstGeom prst="rect">
                             <a:avLst/>
@@ -6399,7 +6468,7 @@
         </w:tc>
         <w:tc>
           <w:tcPr>
-            <w:tcW w:w="5198" w:type="dxa"/>
+            <w:tcW w:w="5408" w:type="dxa"/>
             <w:tcBorders>
               <w:top w:val="nil"/>
               <w:left w:val="nil"/>
@@ -6420,8 +6489,8 @@
                 <w:noProof/>
               </w:rPr>
               <w:drawing>
-                <wp:inline distT="0" distB="0" distL="0" distR="0" wp14:anchorId="77D81712" wp14:editId="6835413C">
-                  <wp:extent cx="3200400" cy="1975104"/>
+                <wp:inline distT="0" distB="0" distL="0" distR="0" wp14:anchorId="77D81712" wp14:editId="33C51FA5">
+                  <wp:extent cx="3291840" cy="2031536"/>
                   <wp:effectExtent l="0" t="0" r="0" b="0"/>
                   <wp:docPr id="4" name="Picture 7"/>
                   <wp:cNvGraphicFramePr>
@@ -6445,7 +6514,7 @@
                         <pic:spPr bwMode="auto">
                           <a:xfrm>
                             <a:off x="0" y="0"/>
-                            <a:ext cx="3200400" cy="1975104"/>
+                            <a:ext cx="3291840" cy="2031536"/>
                           </a:xfrm>
                           <a:prstGeom prst="rect">
                             <a:avLst/>
@@ -6462,11 +6531,11 @@
       </w:tr>
       <w:tr>
         <w:trPr>
-          <w:trHeight w:val="969"/>
+          <w:trHeight w:val="992"/>
         </w:trPr>
         <w:tc>
           <w:tcPr>
-            <w:tcW w:w="10396" w:type="dxa"/>
+            <w:tcW w:w="10816" w:type="dxa"/>
             <w:gridSpan w:val="2"/>
             <w:tcBorders>
               <w:top w:val="single" w:sz="4" w:space="0" w:color="auto"/>
@@ -6506,16 +6575,8 @@
               <w:rPr>
                 <w:rFonts w:eastAsia="Aptos"/>
               </w:rPr>
-              <w:t xml:space="preserve">a complete accounting of </w:t>
+              <w:t>a complete accounting of tax payers</w:t>
             </w:r>
-            <w:proofErr w:type="gramStart"/>
-            <w:r>
-              <w:rPr>
-                <w:rFonts w:eastAsia="Aptos"/>
-              </w:rPr>
-              <w:t>tax payers</w:t>
-            </w:r>
-            <w:proofErr w:type="gramEnd"/>
             <w:r>
               <w:rPr>
                 <w:rFonts w:eastAsia="Aptos"/>
@@ -6532,15 +6593,62 @@
         <w:spacing w:line="480" w:lineRule="auto"/>
         <w:ind w:firstLine="720"/>
       </w:pPr>
+      <w:r>
+        <w:t>There is a</w:t>
+      </w:r>
+      <w:r>
+        <w:t>n</w:t>
+      </w:r>
+      <w:r>
+        <w:t xml:space="preserve"> initial </w:t>
+      </w:r>
+      <w:proofErr w:type="gramStart"/>
+      <w:r>
+        <w:t>drop in</w:t>
+      </w:r>
+      <w:proofErr w:type="gramEnd"/>
+      <w:r>
+        <w:t xml:space="preserve"> public assistance program use over time and then a leveling out </w:t>
+      </w:r>
+      <w:r>
+        <w:t xml:space="preserve">for the Canadian resettlement types, while the American resettlement </w:t>
+      </w:r>
+      <w:r>
+        <w:t>route</w:t>
+      </w:r>
+      <w:r>
+        <w:t xml:space="preserve"> usually</w:t>
+      </w:r>
+      <w:r>
+        <w:t xml:space="preserve"> starts lower and declines </w:t>
+      </w:r>
+      <w:r>
+        <w:t>moderately</w:t>
+      </w:r>
+      <w:r>
+        <w:t>.</w:t>
+      </w:r>
+      <w:r>
+        <w:t xml:space="preserve"> At the end of five years, the proportion of households using public assistance programs is close.</w:t>
+      </w:r>
+    </w:p>
+    <w:p>
+      <w:pPr>
+        <w:spacing w:line="480" w:lineRule="auto"/>
+        <w:ind w:firstLine="720"/>
+      </w:pPr>
+      <w:r>
+        <w:t xml:space="preserve">Figure 2 describes the demographic results by sex for the </w:t>
+      </w:r>
+      <w:r>
+        <w:t>2016-2019 data.</w:t>
+      </w:r>
+      <w:r>
+        <w:t xml:space="preserve"> </w:t>
+      </w:r>
       <w:commentRangeStart w:id="10"/>
       <w:r>
-        <w:t xml:space="preserve">The general </w:t>
-      </w:r>
-      <w:r>
-        <w:t>trend</w:t>
-      </w:r>
-      <w:r>
-        <w:t xml:space="preserve"> in the life tables is that the male life tables tend to reflect the combined sex life</w:t>
+        <w:t>The male life tables tend to reflect the combined sex life</w:t>
       </w:r>
       <w:ins w:id="11" w:author="Lariscy, Joseph" w:date="2024-12-17T17:03:00Z" w16du:dateUtc="2024-12-17T23:03:00Z">
         <w:r>
@@ -6548,13 +6656,7 @@
         </w:r>
       </w:ins>
       <w:r>
-        <w:t xml:space="preserve">tables </w:t>
-      </w:r>
-      <w:r>
-        <w:t xml:space="preserve">very closely. The majority of households resettled are headed by men, which is why the combined sex </w:t>
-      </w:r>
-      <w:r>
-        <w:t>life tables look so much like the male life tables.</w:t>
+        <w:t>tables very closely. The majority of households resettled in both countries are headed by men, which is why the combined sex life tables look so much like the male life tables.</w:t>
       </w:r>
       <w:commentRangeEnd w:id="10"/>
       <w:r>
@@ -6564,68 +6666,225 @@
         <w:commentReference w:id="10"/>
       </w:r>
       <w:r>
-        <w:t xml:space="preserve"> </w:t>
-      </w:r>
-      <w:r>
-        <w:t>There is a</w:t>
-      </w:r>
-      <w:r>
-        <w:t>n</w:t>
-      </w:r>
-      <w:r>
-        <w:t xml:space="preserve"> initial drop in public assistance program use over time and then a leveling out </w:t>
-      </w:r>
-      <w:r>
-        <w:t xml:space="preserve">for the Canadian resettlement types, while the American resettlement </w:t>
-      </w:r>
-      <w:r>
-        <w:t>route starts lower and declines at about the same rate as the Canadian government-led route.</w:t>
-      </w:r>
-      <w:del w:id="12" w:author="Lariscy, Joseph" w:date="2024-12-18T16:01:00Z" w16du:dateUtc="2024-12-18T22:01:00Z">
-        <w:r>
-          <w:delText xml:space="preserve"> The best place to summarize the sex effects are in the multilevel model. </w:delText>
-        </w:r>
-      </w:del>
-    </w:p>
-    <w:p>
-      <w:pPr>
-        <w:spacing w:line="480" w:lineRule="auto"/>
-      </w:pPr>
-      <w:r>
-        <w:tab/>
-        <w:t xml:space="preserve">Because funding is only available at the country level, I cannot disentangle the funding per program, nor the distribution of funds across household characteristics like sex. However, </w:t>
-      </w:r>
-      <w:r>
-        <w:t xml:space="preserve">when we look at the funding per capita available in each country </w:t>
+        <w:t xml:space="preserve"> Women-headed households, especially the women-headed households sampled in the United States, had more variance. It is hard to tell which sex had higher assistance program use rates at the end of five years. the </w:t>
       </w:r>
       <w:proofErr w:type="gramStart"/>
       <w:r>
-        <w:t xml:space="preserve">it is clear that </w:t>
-      </w:r>
-      <w:r>
-        <w:t>Canada</w:t>
+        <w:t>model based</w:t>
       </w:r>
       <w:proofErr w:type="gramEnd"/>
       <w:r>
-        <w:t xml:space="preserve"> spends much more per refugee than the United States does</w:t>
-      </w:r>
-      <w:r>
-        <w:t xml:space="preserve">, often </w:t>
-      </w:r>
-      <w:r>
-        <w:t xml:space="preserve">several times over. </w:t>
-      </w:r>
-      <w:r>
-        <w:t>The total spending of the countries is similar, and the United States simply resettles more refugees than Canada</w:t>
-      </w:r>
-      <w:r>
-        <w:t xml:space="preserve">. </w:t>
+        <w:t xml:space="preserve"> approach will obtain estimates for sex and observe the effects of sex across each resettlement system. </w:t>
       </w:r>
     </w:p>
     <w:tbl>
       <w:tblPr>
         <w:tblStyle w:val="TableGrid"/>
-        <w:tblW w:w="9468" w:type="dxa"/>
+        <w:tblW w:w="10925" w:type="dxa"/>
+        <w:tblLook w:val="04A0" w:firstRow="1" w:lastRow="0" w:firstColumn="1" w:lastColumn="0" w:noHBand="0" w:noVBand="1"/>
+      </w:tblPr>
+      <w:tblGrid>
+        <w:gridCol w:w="5462"/>
+        <w:gridCol w:w="5463"/>
+      </w:tblGrid>
+      <w:tr>
+        <w:trPr>
+          <w:trHeight w:val="1047"/>
+        </w:trPr>
+        <w:tc>
+          <w:tcPr>
+            <w:tcW w:w="10925" w:type="dxa"/>
+            <w:gridSpan w:val="2"/>
+          </w:tcPr>
+          <w:p>
+            <w:pPr>
+              <w:spacing w:line="240" w:lineRule="auto"/>
+              <w:rPr>
+                <w:rFonts w:ascii="Times New Roman" w:hAnsi="Times New Roman" w:cs="Times New Roman"/>
+              </w:rPr>
+            </w:pPr>
+            <w:r>
+              <w:rPr>
+                <w:rFonts w:ascii="Times New Roman" w:hAnsi="Times New Roman" w:cs="Times New Roman"/>
+              </w:rPr>
+              <w:lastRenderedPageBreak/>
+              <w:t>FIGURE 2. Public Assistance Use Rates by Sex, 2016-2019 Combined.</w:t>
+            </w:r>
+          </w:p>
+        </w:tc>
+      </w:tr>
+      <w:tr>
+        <w:trPr>
+          <w:trHeight w:val="5075"/>
+        </w:trPr>
+        <w:tc>
+          <w:tcPr>
+            <w:tcW w:w="5462" w:type="dxa"/>
+          </w:tcPr>
+          <w:p>
+            <w:pPr>
+              <w:spacing w:line="480" w:lineRule="auto"/>
+              <w:rPr>
+                <w:b/>
+                <w:bCs/>
+              </w:rPr>
+            </w:pPr>
+            <w:r>
+              <w:rPr>
+                <w:b/>
+                <w:bCs/>
+                <w:noProof/>
+              </w:rPr>
+              <w:drawing>
+                <wp:inline distT="0" distB="0" distL="0" distR="0" wp14:anchorId="30790350" wp14:editId="7EF431EA">
+                  <wp:extent cx="3291840" cy="2463543"/>
+                  <wp:effectExtent l="0" t="0" r="0" b="0"/>
+                  <wp:docPr id="2049083966" name="Picture 1"/>
+                  <wp:cNvGraphicFramePr>
+                    <a:graphicFrameLocks xmlns:a="http://schemas.openxmlformats.org/drawingml/2006/main" noChangeAspect="1"/>
+                  </wp:cNvGraphicFramePr>
+                  <a:graphic xmlns:a="http://schemas.openxmlformats.org/drawingml/2006/main">
+                    <a:graphicData uri="http://schemas.openxmlformats.org/drawingml/2006/picture">
+                      <pic:pic xmlns:pic="http://schemas.openxmlformats.org/drawingml/2006/picture">
+                        <pic:nvPicPr>
+                          <pic:cNvPr id="0" name="Picture 2"/>
+                          <pic:cNvPicPr>
+                            <a:picLocks noChangeAspect="1" noChangeArrowheads="1"/>
+                          </pic:cNvPicPr>
+                        </pic:nvPicPr>
+                        <pic:blipFill>
+                          <a:blip r:embed="rId16">
+                            <a:extLst>
+                              <a:ext uri="{28A0092B-C50C-407E-A947-70E740481C1C}">
+                                <a14:useLocalDpi xmlns:a14="http://schemas.microsoft.com/office/drawing/2010/main" val="0"/>
+                              </a:ext>
+                            </a:extLst>
+                          </a:blip>
+                          <a:srcRect/>
+                          <a:stretch>
+                            <a:fillRect/>
+                          </a:stretch>
+                        </pic:blipFill>
+                        <pic:spPr bwMode="auto">
+                          <a:xfrm>
+                            <a:off x="0" y="0"/>
+                            <a:ext cx="3291840" cy="2463543"/>
+                          </a:xfrm>
+                          <a:prstGeom prst="rect">
+                            <a:avLst/>
+                          </a:prstGeom>
+                          <a:noFill/>
+                        </pic:spPr>
+                      </pic:pic>
+                    </a:graphicData>
+                  </a:graphic>
+                </wp:inline>
+              </w:drawing>
+            </w:r>
+          </w:p>
+        </w:tc>
+        <w:tc>
+          <w:tcPr>
+            <w:tcW w:w="5463" w:type="dxa"/>
+          </w:tcPr>
+          <w:p>
+            <w:pPr>
+              <w:spacing w:line="480" w:lineRule="auto"/>
+            </w:pPr>
+            <w:r>
+              <w:rPr>
+                <w:noProof/>
+              </w:rPr>
+              <w:drawing>
+                <wp:inline distT="0" distB="0" distL="0" distR="0" wp14:anchorId="41524224" wp14:editId="3B7C8480">
+                  <wp:extent cx="3291840" cy="2463543"/>
+                  <wp:effectExtent l="0" t="0" r="0" b="0"/>
+                  <wp:docPr id="1672644058" name="Picture 2"/>
+                  <wp:cNvGraphicFramePr>
+                    <a:graphicFrameLocks xmlns:a="http://schemas.openxmlformats.org/drawingml/2006/main" noChangeAspect="1"/>
+                  </wp:cNvGraphicFramePr>
+                  <a:graphic xmlns:a="http://schemas.openxmlformats.org/drawingml/2006/main">
+                    <a:graphicData uri="http://schemas.openxmlformats.org/drawingml/2006/picture">
+                      <pic:pic xmlns:pic="http://schemas.openxmlformats.org/drawingml/2006/picture">
+                        <pic:nvPicPr>
+                          <pic:cNvPr id="0" name="Picture 3"/>
+                          <pic:cNvPicPr>
+                            <a:picLocks noChangeAspect="1" noChangeArrowheads="1"/>
+                          </pic:cNvPicPr>
+                        </pic:nvPicPr>
+                        <pic:blipFill>
+                          <a:blip r:embed="rId17">
+                            <a:extLst>
+                              <a:ext uri="{28A0092B-C50C-407E-A947-70E740481C1C}">
+                                <a14:useLocalDpi xmlns:a14="http://schemas.microsoft.com/office/drawing/2010/main" val="0"/>
+                              </a:ext>
+                            </a:extLst>
+                          </a:blip>
+                          <a:srcRect/>
+                          <a:stretch>
+                            <a:fillRect/>
+                          </a:stretch>
+                        </pic:blipFill>
+                        <pic:spPr bwMode="auto">
+                          <a:xfrm>
+                            <a:off x="0" y="0"/>
+                            <a:ext cx="3291840" cy="2463543"/>
+                          </a:xfrm>
+                          <a:prstGeom prst="rect">
+                            <a:avLst/>
+                          </a:prstGeom>
+                          <a:noFill/>
+                        </pic:spPr>
+                      </pic:pic>
+                    </a:graphicData>
+                  </a:graphic>
+                </wp:inline>
+              </w:drawing>
+            </w:r>
+          </w:p>
+        </w:tc>
+      </w:tr>
+    </w:tbl>
+    <w:p>
+      <w:pPr>
+        <w:spacing w:line="480" w:lineRule="auto"/>
+        <w:ind w:firstLine="720"/>
+      </w:pPr>
+      <w:r>
+        <w:t xml:space="preserve"> </w:t>
+      </w:r>
+    </w:p>
+    <w:p>
+      <w:pPr>
+        <w:spacing w:line="480" w:lineRule="auto"/>
+      </w:pPr>
+      <w:r>
+        <w:tab/>
+        <w:t xml:space="preserve">Because funding is only available at the country level, I cannot disentangle the funding per program, nor the distribution of funds across household characteristics like sex. However, </w:t>
+      </w:r>
+      <w:r>
+        <w:t xml:space="preserve">when we look at the funding per capita available in each country it is clear that </w:t>
+      </w:r>
+      <w:r>
+        <w:t>Canada spends much more per refugee than the United States does</w:t>
+      </w:r>
+      <w:r>
+        <w:t xml:space="preserve">, often </w:t>
+      </w:r>
+      <w:r>
+        <w:t xml:space="preserve">several times over. </w:t>
+      </w:r>
+      <w:r>
+        <w:t>The total spending of the countries is similar, and the United States simply resettles more refugees than Canada</w:t>
+      </w:r>
+      <w:r>
+        <w:t xml:space="preserve">. </w:t>
+      </w:r>
+    </w:p>
+    <w:tbl>
+      <w:tblPr>
+        <w:tblStyle w:val="TableGrid"/>
+        <w:tblW w:w="9576" w:type="dxa"/>
         <w:tblBorders>
           <w:top w:val="none" w:sz="0" w:space="0" w:color="auto"/>
           <w:left w:val="none" w:sz="0" w:space="0" w:color="auto"/>
@@ -6637,23 +6896,48 @@
         <w:tblLook w:val="04A0" w:firstRow="1" w:lastRow="0" w:firstColumn="1" w:lastColumn="0" w:noHBand="0" w:noVBand="1"/>
       </w:tblPr>
       <w:tblGrid>
-        <w:gridCol w:w="1915"/>
-        <w:gridCol w:w="3233"/>
-        <w:gridCol w:w="4320"/>
-        <w:tblGridChange w:id="13">
-          <w:tblGrid>
-            <w:gridCol w:w="1915"/>
-            <w:gridCol w:w="3233"/>
-            <w:gridCol w:w="4320"/>
-          </w:tblGrid>
-        </w:tblGridChange>
+        <w:gridCol w:w="1805"/>
+        <w:gridCol w:w="2176"/>
+        <w:gridCol w:w="5577"/>
+        <w:gridCol w:w="18"/>
       </w:tblGrid>
       <w:tr>
         <w:tc>
           <w:tcPr>
-            <w:tcW w:w="9468" w:type="dxa"/>
-            <w:gridSpan w:val="3"/>
+            <w:tcW w:w="9576" w:type="dxa"/>
+            <w:gridSpan w:val="4"/>
             <w:tcBorders>
+              <w:bottom w:val="single" w:sz="4" w:space="0" w:color="auto"/>
+            </w:tcBorders>
+          </w:tcPr>
+          <w:p>
+            <w:pPr>
+              <w:spacing w:line="240" w:lineRule="auto"/>
+              <w:rPr>
+                <w:rFonts w:ascii="Times New Roman" w:hAnsi="Times New Roman" w:cs="Times New Roman"/>
+                <w:color w:val="000000"/>
+              </w:rPr>
+            </w:pPr>
+            <w:r>
+              <w:rPr>
+                <w:rFonts w:ascii="Times New Roman" w:hAnsi="Times New Roman" w:cs="Times New Roman"/>
+                <w:color w:val="000000"/>
+              </w:rPr>
+              <w:t>TABLE 1. Grouped Funding Per Capita</w:t>
+            </w:r>
+          </w:p>
+        </w:tc>
+      </w:tr>
+      <w:tr>
+        <w:trPr>
+          <w:gridAfter w:val="1"/>
+          <w:wAfter w:w="18" w:type="dxa"/>
+        </w:trPr>
+        <w:tc>
+          <w:tcPr>
+            <w:tcW w:w="1805" w:type="dxa"/>
+            <w:tcBorders>
+              <w:top w:val="single" w:sz="4" w:space="0" w:color="auto"/>
               <w:bottom w:val="single" w:sz="4" w:space="0" w:color="auto"/>
             </w:tcBorders>
             <w:vAlign w:val="center"/>
@@ -6671,44 +6955,13 @@
                 <w:rFonts w:ascii="Times New Roman" w:hAnsi="Times New Roman" w:cs="Times New Roman"/>
                 <w:color w:val="000000"/>
               </w:rPr>
-              <w:lastRenderedPageBreak/>
-              <w:t xml:space="preserve">TABLE 1. </w:t>
-            </w:r>
-            <w:r>
-              <w:rPr>
-                <w:rFonts w:ascii="Times New Roman" w:hAnsi="Times New Roman" w:cs="Times New Roman"/>
-                <w:color w:val="000000"/>
-              </w:rPr>
-              <w:t xml:space="preserve">Grouped </w:t>
-            </w:r>
-            <w:r>
-              <w:rPr>
-                <w:rFonts w:ascii="Times New Roman" w:hAnsi="Times New Roman" w:cs="Times New Roman"/>
-                <w:color w:val="000000"/>
-              </w:rPr>
-              <w:t>Means</w:t>
-            </w:r>
-            <w:r>
-              <w:rPr>
-                <w:rFonts w:ascii="Times New Roman" w:hAnsi="Times New Roman" w:cs="Times New Roman"/>
-                <w:color w:val="000000"/>
-              </w:rPr>
-              <w:t xml:space="preserve"> for </w:t>
-            </w:r>
-            <w:r>
-              <w:rPr>
-                <w:rFonts w:ascii="Times New Roman" w:hAnsi="Times New Roman" w:cs="Times New Roman"/>
-                <w:color w:val="000000"/>
-              </w:rPr>
-              <w:t>Public Assistance Use Percentages and Funding Per Capita</w:t>
+              <w:t>Country</w:t>
             </w:r>
           </w:p>
         </w:tc>
-      </w:tr>
-      <w:tr>
         <w:tc>
           <w:tcPr>
-            <w:tcW w:w="1915" w:type="dxa"/>
+            <w:tcW w:w="2176" w:type="dxa"/>
             <w:tcBorders>
               <w:top w:val="single" w:sz="4" w:space="0" w:color="auto"/>
               <w:bottom w:val="single" w:sz="4" w:space="0" w:color="auto"/>
@@ -6729,13 +6982,13 @@
                 <w:rFonts w:ascii="Times New Roman" w:hAnsi="Times New Roman" w:cs="Times New Roman"/>
                 <w:color w:val="000000"/>
               </w:rPr>
-              <w:t>Country</w:t>
+              <w:t>Years of Residence</w:t>
             </w:r>
           </w:p>
         </w:tc>
         <w:tc>
           <w:tcPr>
-            <w:tcW w:w="3233" w:type="dxa"/>
+            <w:tcW w:w="5577" w:type="dxa"/>
             <w:tcBorders>
               <w:top w:val="single" w:sz="4" w:space="0" w:color="auto"/>
               <w:bottom w:val="single" w:sz="4" w:space="0" w:color="auto"/>
@@ -6751,55 +7004,39 @@
                 <w:color w:val="000000"/>
               </w:rPr>
             </w:pPr>
+            <w:commentRangeStart w:id="12"/>
             <w:r>
               <w:rPr>
                 <w:rFonts w:ascii="Times New Roman" w:hAnsi="Times New Roman" w:cs="Times New Roman"/>
                 <w:color w:val="000000"/>
               </w:rPr>
-              <w:t>Years of Residence</w:t>
+              <w:t>Mean Funding per Capita</w:t>
             </w:r>
-          </w:p>
-        </w:tc>
-        <w:tc>
-          <w:tcPr>
-            <w:tcW w:w="4320" w:type="dxa"/>
-            <w:tcBorders>
-              <w:top w:val="single" w:sz="4" w:space="0" w:color="auto"/>
-              <w:bottom w:val="single" w:sz="4" w:space="0" w:color="auto"/>
-            </w:tcBorders>
-            <w:vAlign w:val="center"/>
-          </w:tcPr>
-          <w:p>
-            <w:pPr>
-              <w:spacing w:line="240" w:lineRule="auto"/>
-              <w:jc w:val="center"/>
+            <w:commentRangeEnd w:id="12"/>
+            <w:r>
+              <w:rPr>
+                <w:rStyle w:val="CommentReference"/>
+              </w:rPr>
+              <w:commentReference w:id="12"/>
+            </w:r>
+            <w:r>
               <w:rPr>
                 <w:rFonts w:ascii="Times New Roman" w:hAnsi="Times New Roman" w:cs="Times New Roman"/>
                 <w:color w:val="000000"/>
               </w:rPr>
-            </w:pPr>
-            <w:commentRangeStart w:id="14"/>
-            <w:r>
-              <w:rPr>
-                <w:rFonts w:ascii="Times New Roman" w:hAnsi="Times New Roman" w:cs="Times New Roman"/>
-                <w:color w:val="000000"/>
-              </w:rPr>
-              <w:t>Mean Funding per Capita</w:t>
-            </w:r>
-            <w:commentRangeEnd w:id="14"/>
-            <w:r>
-              <w:rPr>
-                <w:rStyle w:val="CommentReference"/>
-              </w:rPr>
-              <w:commentReference w:id="14"/>
+              <w:t xml:space="preserve"> in 2016 U.S. Dollars</w:t>
             </w:r>
           </w:p>
         </w:tc>
       </w:tr>
       <w:tr>
+        <w:trPr>
+          <w:gridAfter w:val="1"/>
+          <w:wAfter w:w="18" w:type="dxa"/>
+        </w:trPr>
         <w:tc>
           <w:tcPr>
-            <w:tcW w:w="1915" w:type="dxa"/>
+            <w:tcW w:w="1805" w:type="dxa"/>
             <w:tcBorders>
               <w:top w:val="single" w:sz="4" w:space="0" w:color="auto"/>
             </w:tcBorders>
@@ -6816,13 +7053,13 @@
               <w:rPr>
                 <w:rFonts w:ascii="Times New Roman" w:hAnsi="Times New Roman" w:cs="Times New Roman"/>
               </w:rPr>
-              <w:t>United States</w:t>
+              <w:t>Canada</w:t>
             </w:r>
           </w:p>
         </w:tc>
         <w:tc>
           <w:tcPr>
-            <w:tcW w:w="3233" w:type="dxa"/>
+            <w:tcW w:w="2176" w:type="dxa"/>
             <w:tcBorders>
               <w:top w:val="single" w:sz="4" w:space="0" w:color="auto"/>
             </w:tcBorders>
@@ -6838,47 +7075,658 @@
             <w:r>
               <w:rPr>
                 <w:rFonts w:ascii="Times New Roman" w:hAnsi="Times New Roman" w:cs="Times New Roman"/>
-                <w:color w:val="000000"/>
-              </w:rPr>
-              <w:t>1</w:t>
+              </w:rPr>
+              <w:t>2016</w:t>
             </w:r>
           </w:p>
         </w:tc>
         <w:tc>
           <w:tcPr>
-            <w:tcW w:w="4320" w:type="dxa"/>
+            <w:tcW w:w="5577" w:type="dxa"/>
             <w:tcBorders>
               <w:top w:val="single" w:sz="4" w:space="0" w:color="auto"/>
+            </w:tcBorders>
+            <w:vAlign w:val="bottom"/>
+          </w:tcPr>
+          <w:p>
+            <w:pPr>
+              <w:spacing w:line="240" w:lineRule="auto"/>
+              <w:jc w:val="right"/>
+              <w:rPr>
+                <w:rFonts w:ascii="Times New Roman" w:hAnsi="Times New Roman" w:cs="Times New Roman"/>
+              </w:rPr>
+            </w:pPr>
+            <w:r>
+              <w:rPr>
+                <w:rFonts w:ascii="Calibri" w:hAnsi="Calibri" w:cs="Calibri"/>
+                <w:color w:val="000000"/>
+                <w:sz w:val="22"/>
+                <w:szCs w:val="22"/>
+              </w:rPr>
+              <w:t>9986</w:t>
+            </w:r>
+          </w:p>
+        </w:tc>
+      </w:tr>
+      <w:tr>
+        <w:trPr>
+          <w:gridAfter w:val="1"/>
+          <w:wAfter w:w="18" w:type="dxa"/>
+        </w:trPr>
+        <w:tc>
+          <w:tcPr>
+            <w:tcW w:w="1805" w:type="dxa"/>
+            <w:vAlign w:val="center"/>
+          </w:tcPr>
+          <w:p>
+            <w:pPr>
+              <w:spacing w:line="240" w:lineRule="auto"/>
+              <w:rPr>
+                <w:rFonts w:ascii="Times New Roman" w:hAnsi="Times New Roman" w:cs="Times New Roman"/>
+              </w:rPr>
+            </w:pPr>
+            <w:r>
+              <w:rPr>
+                <w:rFonts w:ascii="Times New Roman" w:hAnsi="Times New Roman" w:cs="Times New Roman"/>
+              </w:rPr>
+              <w:t>United States</w:t>
+            </w:r>
+          </w:p>
+        </w:tc>
+        <w:tc>
+          <w:tcPr>
+            <w:tcW w:w="2176" w:type="dxa"/>
+            <w:vAlign w:val="center"/>
+          </w:tcPr>
+          <w:p>
+            <w:pPr>
+              <w:spacing w:line="240" w:lineRule="auto"/>
+              <w:rPr>
+                <w:rFonts w:ascii="Times New Roman" w:hAnsi="Times New Roman" w:cs="Times New Roman"/>
+              </w:rPr>
+            </w:pPr>
+            <w:r>
+              <w:rPr>
+                <w:rFonts w:ascii="Times New Roman" w:hAnsi="Times New Roman" w:cs="Times New Roman"/>
+              </w:rPr>
+              <w:t>2016</w:t>
+            </w:r>
+          </w:p>
+        </w:tc>
+        <w:tc>
+          <w:tcPr>
+            <w:tcW w:w="5577" w:type="dxa"/>
+            <w:vAlign w:val="bottom"/>
+          </w:tcPr>
+          <w:p>
+            <w:pPr>
+              <w:spacing w:line="240" w:lineRule="auto"/>
+              <w:jc w:val="right"/>
+              <w:rPr>
+                <w:rFonts w:ascii="Times New Roman" w:hAnsi="Times New Roman" w:cs="Times New Roman"/>
+              </w:rPr>
+            </w:pPr>
+            <w:r>
+              <w:rPr>
+                <w:rFonts w:ascii="Calibri" w:hAnsi="Calibri" w:cs="Calibri"/>
+                <w:color w:val="000000"/>
+                <w:sz w:val="22"/>
+                <w:szCs w:val="22"/>
+              </w:rPr>
+              <w:t>1615</w:t>
+            </w:r>
+          </w:p>
+        </w:tc>
+      </w:tr>
+      <w:tr>
+        <w:trPr>
+          <w:gridAfter w:val="1"/>
+          <w:wAfter w:w="18" w:type="dxa"/>
+        </w:trPr>
+        <w:tc>
+          <w:tcPr>
+            <w:tcW w:w="1805" w:type="dxa"/>
+            <w:vAlign w:val="center"/>
+          </w:tcPr>
+          <w:p>
+            <w:pPr>
+              <w:spacing w:line="240" w:lineRule="auto"/>
+              <w:rPr>
+                <w:rFonts w:ascii="Times New Roman" w:hAnsi="Times New Roman" w:cs="Times New Roman"/>
+              </w:rPr>
+            </w:pPr>
+            <w:r>
+              <w:rPr>
+                <w:rFonts w:ascii="Times New Roman" w:hAnsi="Times New Roman" w:cs="Times New Roman"/>
+              </w:rPr>
+              <w:t>Canada</w:t>
+            </w:r>
+          </w:p>
+        </w:tc>
+        <w:tc>
+          <w:tcPr>
+            <w:tcW w:w="2176" w:type="dxa"/>
+            <w:vAlign w:val="center"/>
+          </w:tcPr>
+          <w:p>
+            <w:pPr>
+              <w:spacing w:line="240" w:lineRule="auto"/>
+              <w:rPr>
+                <w:rFonts w:ascii="Times New Roman" w:hAnsi="Times New Roman" w:cs="Times New Roman"/>
+              </w:rPr>
+            </w:pPr>
+            <w:r>
+              <w:rPr>
+                <w:rFonts w:ascii="Times New Roman" w:hAnsi="Times New Roman" w:cs="Times New Roman"/>
+              </w:rPr>
+              <w:t>201</w:t>
+            </w:r>
+            <w:r>
+              <w:rPr>
+                <w:rFonts w:ascii="Times New Roman" w:hAnsi="Times New Roman" w:cs="Times New Roman"/>
+              </w:rPr>
+              <w:t>7</w:t>
+            </w:r>
+          </w:p>
+        </w:tc>
+        <w:tc>
+          <w:tcPr>
+            <w:tcW w:w="5577" w:type="dxa"/>
+            <w:vAlign w:val="bottom"/>
+          </w:tcPr>
+          <w:p>
+            <w:pPr>
+              <w:spacing w:line="240" w:lineRule="auto"/>
+              <w:jc w:val="right"/>
+              <w:rPr>
+                <w:rFonts w:ascii="Times New Roman" w:hAnsi="Times New Roman" w:cs="Times New Roman"/>
+              </w:rPr>
+            </w:pPr>
+            <w:r>
+              <w:rPr>
+                <w:rFonts w:ascii="Calibri" w:hAnsi="Calibri" w:cs="Calibri"/>
+                <w:color w:val="000000"/>
+                <w:sz w:val="22"/>
+                <w:szCs w:val="22"/>
+              </w:rPr>
+              <w:t>7584</w:t>
+            </w:r>
+          </w:p>
+        </w:tc>
+      </w:tr>
+      <w:tr>
+        <w:trPr>
+          <w:gridAfter w:val="1"/>
+          <w:wAfter w:w="18" w:type="dxa"/>
+        </w:trPr>
+        <w:tc>
+          <w:tcPr>
+            <w:tcW w:w="1805" w:type="dxa"/>
+            <w:vAlign w:val="center"/>
+          </w:tcPr>
+          <w:p>
+            <w:pPr>
+              <w:spacing w:line="240" w:lineRule="auto"/>
+              <w:rPr>
+                <w:rFonts w:ascii="Times New Roman" w:hAnsi="Times New Roman" w:cs="Times New Roman"/>
+              </w:rPr>
+            </w:pPr>
+            <w:r>
+              <w:rPr>
+                <w:rFonts w:ascii="Times New Roman" w:hAnsi="Times New Roman" w:cs="Times New Roman"/>
+              </w:rPr>
+              <w:lastRenderedPageBreak/>
+              <w:t>United States</w:t>
+            </w:r>
+          </w:p>
+        </w:tc>
+        <w:tc>
+          <w:tcPr>
+            <w:tcW w:w="2176" w:type="dxa"/>
+            <w:vAlign w:val="center"/>
+          </w:tcPr>
+          <w:p>
+            <w:pPr>
+              <w:spacing w:line="240" w:lineRule="auto"/>
+              <w:rPr>
+                <w:rFonts w:ascii="Times New Roman" w:hAnsi="Times New Roman" w:cs="Times New Roman"/>
+              </w:rPr>
+            </w:pPr>
+            <w:r>
+              <w:rPr>
+                <w:rFonts w:ascii="Times New Roman" w:hAnsi="Times New Roman" w:cs="Times New Roman"/>
+              </w:rPr>
+              <w:t>201</w:t>
+            </w:r>
+            <w:r>
+              <w:rPr>
+                <w:rFonts w:ascii="Times New Roman" w:hAnsi="Times New Roman" w:cs="Times New Roman"/>
+              </w:rPr>
+              <w:t>7</w:t>
+            </w:r>
+          </w:p>
+        </w:tc>
+        <w:tc>
+          <w:tcPr>
+            <w:tcW w:w="5577" w:type="dxa"/>
+            <w:vAlign w:val="bottom"/>
+          </w:tcPr>
+          <w:p>
+            <w:pPr>
+              <w:spacing w:line="240" w:lineRule="auto"/>
+              <w:jc w:val="right"/>
+              <w:rPr>
+                <w:rFonts w:ascii="Times New Roman" w:hAnsi="Times New Roman" w:cs="Times New Roman"/>
+              </w:rPr>
+            </w:pPr>
+            <w:r>
+              <w:rPr>
+                <w:rFonts w:ascii="Calibri" w:hAnsi="Calibri" w:cs="Calibri"/>
+                <w:color w:val="000000"/>
+                <w:sz w:val="22"/>
+                <w:szCs w:val="22"/>
+              </w:rPr>
+              <w:t>1236</w:t>
+            </w:r>
+          </w:p>
+        </w:tc>
+      </w:tr>
+      <w:tr>
+        <w:trPr>
+          <w:gridAfter w:val="1"/>
+          <w:wAfter w:w="18" w:type="dxa"/>
+        </w:trPr>
+        <w:tc>
+          <w:tcPr>
+            <w:tcW w:w="1805" w:type="dxa"/>
+            <w:vAlign w:val="center"/>
+          </w:tcPr>
+          <w:p>
+            <w:pPr>
+              <w:spacing w:line="240" w:lineRule="auto"/>
+              <w:rPr>
+                <w:rFonts w:ascii="Times New Roman" w:hAnsi="Times New Roman" w:cs="Times New Roman"/>
+              </w:rPr>
+            </w:pPr>
+            <w:r>
+              <w:rPr>
+                <w:rFonts w:ascii="Times New Roman" w:hAnsi="Times New Roman" w:cs="Times New Roman"/>
+              </w:rPr>
+              <w:t>Canada</w:t>
+            </w:r>
+          </w:p>
+        </w:tc>
+        <w:tc>
+          <w:tcPr>
+            <w:tcW w:w="2176" w:type="dxa"/>
+            <w:vAlign w:val="center"/>
+          </w:tcPr>
+          <w:p>
+            <w:pPr>
+              <w:spacing w:line="240" w:lineRule="auto"/>
+              <w:rPr>
+                <w:rFonts w:ascii="Times New Roman" w:hAnsi="Times New Roman" w:cs="Times New Roman"/>
+              </w:rPr>
+            </w:pPr>
+            <w:r>
+              <w:rPr>
+                <w:rFonts w:ascii="Times New Roman" w:hAnsi="Times New Roman" w:cs="Times New Roman"/>
+              </w:rPr>
+              <w:t>201</w:t>
+            </w:r>
+            <w:r>
+              <w:rPr>
+                <w:rFonts w:ascii="Times New Roman" w:hAnsi="Times New Roman" w:cs="Times New Roman"/>
+              </w:rPr>
+              <w:t>8</w:t>
+            </w:r>
+          </w:p>
+        </w:tc>
+        <w:tc>
+          <w:tcPr>
+            <w:tcW w:w="5577" w:type="dxa"/>
+            <w:vAlign w:val="bottom"/>
+          </w:tcPr>
+          <w:p>
+            <w:pPr>
+              <w:spacing w:line="240" w:lineRule="auto"/>
+              <w:jc w:val="right"/>
+              <w:rPr>
+                <w:rFonts w:ascii="Times New Roman" w:hAnsi="Times New Roman" w:cs="Times New Roman"/>
+              </w:rPr>
+            </w:pPr>
+            <w:r>
+              <w:rPr>
+                <w:rFonts w:ascii="Calibri" w:hAnsi="Calibri" w:cs="Calibri"/>
+                <w:color w:val="000000"/>
+                <w:sz w:val="22"/>
+                <w:szCs w:val="22"/>
+              </w:rPr>
+              <w:t>7811</w:t>
+            </w:r>
+          </w:p>
+        </w:tc>
+      </w:tr>
+      <w:tr>
+        <w:trPr>
+          <w:gridAfter w:val="1"/>
+          <w:wAfter w:w="18" w:type="dxa"/>
+        </w:trPr>
+        <w:tc>
+          <w:tcPr>
+            <w:tcW w:w="1805" w:type="dxa"/>
+            <w:vAlign w:val="center"/>
+          </w:tcPr>
+          <w:p>
+            <w:pPr>
+              <w:spacing w:line="240" w:lineRule="auto"/>
+              <w:rPr>
+                <w:rFonts w:ascii="Times New Roman" w:hAnsi="Times New Roman" w:cs="Times New Roman"/>
+              </w:rPr>
+            </w:pPr>
+            <w:r>
+              <w:rPr>
+                <w:rFonts w:ascii="Times New Roman" w:hAnsi="Times New Roman" w:cs="Times New Roman"/>
+              </w:rPr>
+              <w:t>United States</w:t>
+            </w:r>
+          </w:p>
+        </w:tc>
+        <w:tc>
+          <w:tcPr>
+            <w:tcW w:w="2176" w:type="dxa"/>
+            <w:vAlign w:val="center"/>
+          </w:tcPr>
+          <w:p>
+            <w:pPr>
+              <w:spacing w:line="240" w:lineRule="auto"/>
+              <w:rPr>
+                <w:rFonts w:ascii="Times New Roman" w:hAnsi="Times New Roman" w:cs="Times New Roman"/>
+              </w:rPr>
+            </w:pPr>
+            <w:r>
+              <w:rPr>
+                <w:rFonts w:ascii="Times New Roman" w:hAnsi="Times New Roman" w:cs="Times New Roman"/>
+              </w:rPr>
+              <w:t>201</w:t>
+            </w:r>
+            <w:r>
+              <w:rPr>
+                <w:rFonts w:ascii="Times New Roman" w:hAnsi="Times New Roman" w:cs="Times New Roman"/>
+              </w:rPr>
+              <w:t>8</w:t>
+            </w:r>
+          </w:p>
+        </w:tc>
+        <w:tc>
+          <w:tcPr>
+            <w:tcW w:w="5577" w:type="dxa"/>
+            <w:vAlign w:val="bottom"/>
+          </w:tcPr>
+          <w:p>
+            <w:pPr>
+              <w:spacing w:line="240" w:lineRule="auto"/>
+              <w:jc w:val="right"/>
+              <w:rPr>
+                <w:rFonts w:ascii="Times New Roman" w:hAnsi="Times New Roman" w:cs="Times New Roman"/>
+              </w:rPr>
+            </w:pPr>
+            <w:r>
+              <w:rPr>
+                <w:rFonts w:ascii="Calibri" w:hAnsi="Calibri" w:cs="Calibri"/>
+                <w:color w:val="000000"/>
+                <w:sz w:val="22"/>
+                <w:szCs w:val="22"/>
+              </w:rPr>
+              <w:t>1622</w:t>
+            </w:r>
+          </w:p>
+        </w:tc>
+      </w:tr>
+      <w:tr>
+        <w:trPr>
+          <w:gridAfter w:val="1"/>
+          <w:wAfter w:w="18" w:type="dxa"/>
+        </w:trPr>
+        <w:tc>
+          <w:tcPr>
+            <w:tcW w:w="1805" w:type="dxa"/>
+            <w:vAlign w:val="center"/>
+          </w:tcPr>
+          <w:p>
+            <w:pPr>
+              <w:spacing w:line="240" w:lineRule="auto"/>
+              <w:rPr>
+                <w:rFonts w:ascii="Times New Roman" w:hAnsi="Times New Roman" w:cs="Times New Roman"/>
+              </w:rPr>
+            </w:pPr>
+            <w:r>
+              <w:rPr>
+                <w:rFonts w:ascii="Times New Roman" w:hAnsi="Times New Roman" w:cs="Times New Roman"/>
+              </w:rPr>
+              <w:t>Canada</w:t>
+            </w:r>
+          </w:p>
+        </w:tc>
+        <w:tc>
+          <w:tcPr>
+            <w:tcW w:w="2176" w:type="dxa"/>
+            <w:vAlign w:val="center"/>
+          </w:tcPr>
+          <w:p>
+            <w:pPr>
+              <w:spacing w:line="240" w:lineRule="auto"/>
+              <w:rPr>
+                <w:rFonts w:ascii="Times New Roman" w:hAnsi="Times New Roman" w:cs="Times New Roman"/>
+              </w:rPr>
+            </w:pPr>
+            <w:r>
+              <w:rPr>
+                <w:rFonts w:ascii="Times New Roman" w:hAnsi="Times New Roman" w:cs="Times New Roman"/>
+              </w:rPr>
+              <w:t>201</w:t>
+            </w:r>
+            <w:r>
+              <w:rPr>
+                <w:rFonts w:ascii="Times New Roman" w:hAnsi="Times New Roman" w:cs="Times New Roman"/>
+              </w:rPr>
+              <w:t>9</w:t>
+            </w:r>
+          </w:p>
+        </w:tc>
+        <w:tc>
+          <w:tcPr>
+            <w:tcW w:w="5577" w:type="dxa"/>
+            <w:vAlign w:val="bottom"/>
+          </w:tcPr>
+          <w:p>
+            <w:pPr>
+              <w:spacing w:line="240" w:lineRule="auto"/>
+              <w:jc w:val="right"/>
+              <w:rPr>
+                <w:rFonts w:ascii="Times New Roman" w:hAnsi="Times New Roman" w:cs="Times New Roman"/>
+              </w:rPr>
+            </w:pPr>
+            <w:r>
+              <w:rPr>
+                <w:rFonts w:ascii="Calibri" w:hAnsi="Calibri" w:cs="Calibri"/>
+                <w:color w:val="000000"/>
+                <w:sz w:val="22"/>
+                <w:szCs w:val="22"/>
+              </w:rPr>
+              <w:t>8512</w:t>
+            </w:r>
+          </w:p>
+        </w:tc>
+      </w:tr>
+      <w:tr>
+        <w:trPr>
+          <w:gridAfter w:val="1"/>
+          <w:wAfter w:w="18" w:type="dxa"/>
+        </w:trPr>
+        <w:tc>
+          <w:tcPr>
+            <w:tcW w:w="1805" w:type="dxa"/>
+            <w:vAlign w:val="center"/>
+          </w:tcPr>
+          <w:p>
+            <w:pPr>
+              <w:spacing w:line="240" w:lineRule="auto"/>
+              <w:rPr>
+                <w:rFonts w:ascii="Times New Roman" w:hAnsi="Times New Roman" w:cs="Times New Roman"/>
+              </w:rPr>
+            </w:pPr>
+            <w:r>
+              <w:rPr>
+                <w:rFonts w:ascii="Times New Roman" w:hAnsi="Times New Roman" w:cs="Times New Roman"/>
+              </w:rPr>
+              <w:t>United States</w:t>
+            </w:r>
+          </w:p>
+        </w:tc>
+        <w:tc>
+          <w:tcPr>
+            <w:tcW w:w="2176" w:type="dxa"/>
+            <w:vAlign w:val="center"/>
+          </w:tcPr>
+          <w:p>
+            <w:pPr>
+              <w:spacing w:line="240" w:lineRule="auto"/>
+              <w:rPr>
+                <w:rFonts w:ascii="Times New Roman" w:hAnsi="Times New Roman" w:cs="Times New Roman"/>
+              </w:rPr>
+            </w:pPr>
+            <w:r>
+              <w:rPr>
+                <w:rFonts w:ascii="Times New Roman" w:hAnsi="Times New Roman" w:cs="Times New Roman"/>
+              </w:rPr>
+              <w:t>201</w:t>
+            </w:r>
+            <w:r>
+              <w:rPr>
+                <w:rFonts w:ascii="Times New Roman" w:hAnsi="Times New Roman" w:cs="Times New Roman"/>
+              </w:rPr>
+              <w:t>9</w:t>
+            </w:r>
+          </w:p>
+        </w:tc>
+        <w:tc>
+          <w:tcPr>
+            <w:tcW w:w="5577" w:type="dxa"/>
+            <w:vAlign w:val="bottom"/>
+          </w:tcPr>
+          <w:p>
+            <w:pPr>
+              <w:spacing w:line="240" w:lineRule="auto"/>
+              <w:jc w:val="right"/>
+              <w:rPr>
+                <w:rFonts w:ascii="Times New Roman" w:hAnsi="Times New Roman" w:cs="Times New Roman"/>
+              </w:rPr>
+            </w:pPr>
+            <w:r>
+              <w:rPr>
+                <w:rFonts w:ascii="Calibri" w:hAnsi="Calibri" w:cs="Calibri"/>
+                <w:color w:val="000000"/>
+                <w:sz w:val="22"/>
+                <w:szCs w:val="22"/>
+              </w:rPr>
+              <w:t>3545</w:t>
+            </w:r>
+          </w:p>
+        </w:tc>
+      </w:tr>
+      <w:tr>
+        <w:trPr>
+          <w:gridAfter w:val="1"/>
+          <w:wAfter w:w="18" w:type="dxa"/>
+        </w:trPr>
+        <w:tc>
+          <w:tcPr>
+            <w:tcW w:w="1805" w:type="dxa"/>
+            <w:vAlign w:val="center"/>
+          </w:tcPr>
+          <w:p>
+            <w:pPr>
+              <w:spacing w:line="240" w:lineRule="auto"/>
+              <w:rPr>
+                <w:rFonts w:ascii="Times New Roman" w:hAnsi="Times New Roman" w:cs="Times New Roman"/>
+              </w:rPr>
+            </w:pPr>
+            <w:r>
+              <w:rPr>
+                <w:rFonts w:ascii="Times New Roman" w:hAnsi="Times New Roman" w:cs="Times New Roman"/>
+              </w:rPr>
+              <w:t>Canada</w:t>
+            </w:r>
+          </w:p>
+        </w:tc>
+        <w:tc>
+          <w:tcPr>
+            <w:tcW w:w="2176" w:type="dxa"/>
+            <w:vAlign w:val="center"/>
+          </w:tcPr>
+          <w:p>
+            <w:pPr>
+              <w:spacing w:line="240" w:lineRule="auto"/>
+              <w:rPr>
+                <w:rFonts w:ascii="Times New Roman" w:hAnsi="Times New Roman" w:cs="Times New Roman"/>
+              </w:rPr>
+            </w:pPr>
+            <w:r>
+              <w:rPr>
+                <w:rFonts w:ascii="Times New Roman" w:hAnsi="Times New Roman" w:cs="Times New Roman"/>
+              </w:rPr>
+              <w:t>20</w:t>
+            </w:r>
+            <w:r>
+              <w:rPr>
+                <w:rFonts w:ascii="Times New Roman" w:hAnsi="Times New Roman" w:cs="Times New Roman"/>
+              </w:rPr>
+              <w:t>20</w:t>
+            </w:r>
+          </w:p>
+        </w:tc>
+        <w:tc>
+          <w:tcPr>
+            <w:tcW w:w="5577" w:type="dxa"/>
+            <w:vAlign w:val="bottom"/>
+          </w:tcPr>
+          <w:p>
+            <w:pPr>
+              <w:spacing w:line="240" w:lineRule="auto"/>
+              <w:jc w:val="right"/>
+              <w:rPr>
+                <w:rFonts w:ascii="Times New Roman" w:hAnsi="Times New Roman" w:cs="Times New Roman"/>
+              </w:rPr>
+            </w:pPr>
+            <w:r>
+              <w:rPr>
+                <w:rFonts w:ascii="Calibri" w:hAnsi="Calibri" w:cs="Calibri"/>
+                <w:color w:val="000000"/>
+                <w:sz w:val="22"/>
+                <w:szCs w:val="22"/>
+              </w:rPr>
+              <w:t>11416</w:t>
+            </w:r>
+          </w:p>
+        </w:tc>
+      </w:tr>
+      <w:tr>
+        <w:trPr>
+          <w:gridAfter w:val="1"/>
+          <w:wAfter w:w="18" w:type="dxa"/>
+        </w:trPr>
+        <w:tc>
+          <w:tcPr>
+            <w:tcW w:w="1805" w:type="dxa"/>
+            <w:tcBorders>
+              <w:bottom w:val="single" w:sz="4" w:space="0" w:color="auto"/>
             </w:tcBorders>
             <w:vAlign w:val="center"/>
           </w:tcPr>
           <w:p>
             <w:pPr>
               <w:spacing w:line="240" w:lineRule="auto"/>
-              <w:jc w:val="right"/>
-              <w:rPr>
-                <w:rFonts w:ascii="Times New Roman" w:hAnsi="Times New Roman" w:cs="Times New Roman"/>
-              </w:rPr>
-            </w:pPr>
-            <w:r>
-              <w:rPr>
-                <w:rFonts w:ascii="Times New Roman" w:hAnsi="Times New Roman" w:cs="Times New Roman"/>
-                <w:color w:val="000000"/>
-              </w:rPr>
-              <w:t>8050.585</w:t>
-            </w:r>
-          </w:p>
-        </w:tc>
-      </w:tr>
-      <w:tr>
-        <w:tc>
-          <w:tcPr>
-            <w:tcW w:w="1915" w:type="dxa"/>
-            <w:vAlign w:val="center"/>
-          </w:tcPr>
-          <w:p>
-            <w:pPr>
-              <w:spacing w:line="240" w:lineRule="auto"/>
               <w:rPr>
                 <w:rFonts w:ascii="Times New Roman" w:hAnsi="Times New Roman" w:cs="Times New Roman"/>
               </w:rPr>
@@ -6893,7 +7741,10 @@
         </w:tc>
         <w:tc>
           <w:tcPr>
-            <w:tcW w:w="3233" w:type="dxa"/>
+            <w:tcW w:w="2176" w:type="dxa"/>
+            <w:tcBorders>
+              <w:bottom w:val="single" w:sz="4" w:space="0" w:color="auto"/>
+            </w:tcBorders>
             <w:vAlign w:val="center"/>
           </w:tcPr>
           <w:p>
@@ -6906,16 +7757,24 @@
             <w:r>
               <w:rPr>
                 <w:rFonts w:ascii="Times New Roman" w:hAnsi="Times New Roman" w:cs="Times New Roman"/>
-                <w:color w:val="000000"/>
-              </w:rPr>
-              <w:t>2</w:t>
+              </w:rPr>
+              <w:t>20</w:t>
+            </w:r>
+            <w:r>
+              <w:rPr>
+                <w:rFonts w:ascii="Times New Roman" w:hAnsi="Times New Roman" w:cs="Times New Roman"/>
+              </w:rPr>
+              <w:t>20</w:t>
             </w:r>
           </w:p>
         </w:tc>
         <w:tc>
           <w:tcPr>
-            <w:tcW w:w="4320" w:type="dxa"/>
-            <w:vAlign w:val="center"/>
+            <w:tcW w:w="5577" w:type="dxa"/>
+            <w:tcBorders>
+              <w:bottom w:val="single" w:sz="4" w:space="0" w:color="auto"/>
+            </w:tcBorders>
+            <w:vAlign w:val="bottom"/>
           </w:tcPr>
           <w:p>
             <w:pPr>
@@ -6927,628 +7786,12 @@
             </w:pPr>
             <w:r>
               <w:rPr>
-                <w:rFonts w:ascii="Times New Roman" w:hAnsi="Times New Roman" w:cs="Times New Roman"/>
+                <w:rFonts w:ascii="Calibri" w:hAnsi="Calibri" w:cs="Calibri"/>
                 <w:color w:val="000000"/>
-              </w:rPr>
-              <w:t>4663.340</w:t>
-            </w:r>
-          </w:p>
-        </w:tc>
-      </w:tr>
-      <w:tr>
-        <w:tc>
-          <w:tcPr>
-            <w:tcW w:w="1915" w:type="dxa"/>
-            <w:vAlign w:val="center"/>
-          </w:tcPr>
-          <w:p>
-            <w:pPr>
-              <w:spacing w:line="240" w:lineRule="auto"/>
-              <w:rPr>
-                <w:rFonts w:ascii="Times New Roman" w:hAnsi="Times New Roman" w:cs="Times New Roman"/>
-              </w:rPr>
-            </w:pPr>
-            <w:r>
-              <w:rPr>
-                <w:rFonts w:ascii="Times New Roman" w:hAnsi="Times New Roman" w:cs="Times New Roman"/>
-              </w:rPr>
-              <w:t>United States</w:t>
-            </w:r>
-          </w:p>
-        </w:tc>
-        <w:tc>
-          <w:tcPr>
-            <w:tcW w:w="3233" w:type="dxa"/>
-            <w:vAlign w:val="center"/>
-          </w:tcPr>
-          <w:p>
-            <w:pPr>
-              <w:spacing w:line="240" w:lineRule="auto"/>
-              <w:rPr>
-                <w:rFonts w:ascii="Times New Roman" w:hAnsi="Times New Roman" w:cs="Times New Roman"/>
-              </w:rPr>
-            </w:pPr>
-            <w:r>
-              <w:rPr>
-                <w:rFonts w:ascii="Times New Roman" w:hAnsi="Times New Roman" w:cs="Times New Roman"/>
-                <w:color w:val="000000"/>
-              </w:rPr>
-              <w:t>3</w:t>
-            </w:r>
-          </w:p>
-        </w:tc>
-        <w:tc>
-          <w:tcPr>
-            <w:tcW w:w="4320" w:type="dxa"/>
-            <w:vAlign w:val="center"/>
-          </w:tcPr>
-          <w:p>
-            <w:pPr>
-              <w:spacing w:line="240" w:lineRule="auto"/>
-              <w:jc w:val="right"/>
-              <w:rPr>
-                <w:rFonts w:ascii="Times New Roman" w:hAnsi="Times New Roman" w:cs="Times New Roman"/>
-              </w:rPr>
-            </w:pPr>
-            <w:r>
-              <w:rPr>
-                <w:rFonts w:ascii="Times New Roman" w:hAnsi="Times New Roman" w:cs="Times New Roman"/>
-                <w:color w:val="000000"/>
-              </w:rPr>
-              <w:t>2161.920</w:t>
-            </w:r>
-          </w:p>
-        </w:tc>
-      </w:tr>
-      <w:tr>
-        <w:tc>
-          <w:tcPr>
-            <w:tcW w:w="1915" w:type="dxa"/>
-            <w:vAlign w:val="center"/>
-          </w:tcPr>
-          <w:p>
-            <w:pPr>
-              <w:spacing w:line="240" w:lineRule="auto"/>
-              <w:rPr>
-                <w:rFonts w:ascii="Times New Roman" w:hAnsi="Times New Roman" w:cs="Times New Roman"/>
-              </w:rPr>
-            </w:pPr>
-            <w:r>
-              <w:rPr>
-                <w:rFonts w:ascii="Times New Roman" w:hAnsi="Times New Roman" w:cs="Times New Roman"/>
-              </w:rPr>
-              <w:t>United States</w:t>
-            </w:r>
-          </w:p>
-        </w:tc>
-        <w:tc>
-          <w:tcPr>
-            <w:tcW w:w="3233" w:type="dxa"/>
-            <w:vAlign w:val="center"/>
-          </w:tcPr>
-          <w:p>
-            <w:pPr>
-              <w:spacing w:line="240" w:lineRule="auto"/>
-              <w:rPr>
-                <w:rFonts w:ascii="Times New Roman" w:hAnsi="Times New Roman" w:cs="Times New Roman"/>
-              </w:rPr>
-            </w:pPr>
-            <w:r>
-              <w:rPr>
-                <w:rFonts w:ascii="Times New Roman" w:hAnsi="Times New Roman" w:cs="Times New Roman"/>
-                <w:color w:val="000000"/>
-              </w:rPr>
-              <w:t>4</w:t>
-            </w:r>
-          </w:p>
-        </w:tc>
-        <w:tc>
-          <w:tcPr>
-            <w:tcW w:w="4320" w:type="dxa"/>
-            <w:vAlign w:val="center"/>
-          </w:tcPr>
-          <w:p>
-            <w:pPr>
-              <w:spacing w:line="240" w:lineRule="auto"/>
-              <w:jc w:val="right"/>
-              <w:rPr>
-                <w:rFonts w:ascii="Times New Roman" w:hAnsi="Times New Roman" w:cs="Times New Roman"/>
-              </w:rPr>
-            </w:pPr>
-            <w:r>
-              <w:rPr>
-                <w:rFonts w:ascii="Times New Roman" w:hAnsi="Times New Roman" w:cs="Times New Roman"/>
-                <w:color w:val="000000"/>
-              </w:rPr>
-              <w:t>1641.808</w:t>
-            </w:r>
-          </w:p>
-        </w:tc>
-      </w:tr>
-      <w:tr>
-        <w:tc>
-          <w:tcPr>
-            <w:tcW w:w="1915" w:type="dxa"/>
-            <w:vAlign w:val="center"/>
-          </w:tcPr>
-          <w:p>
-            <w:pPr>
-              <w:spacing w:line="240" w:lineRule="auto"/>
-              <w:rPr>
-                <w:rFonts w:ascii="Times New Roman" w:hAnsi="Times New Roman" w:cs="Times New Roman"/>
-              </w:rPr>
-            </w:pPr>
-            <w:r>
-              <w:rPr>
-                <w:rFonts w:ascii="Times New Roman" w:hAnsi="Times New Roman" w:cs="Times New Roman"/>
-              </w:rPr>
-              <w:t>United States</w:t>
-            </w:r>
-          </w:p>
-        </w:tc>
-        <w:tc>
-          <w:tcPr>
-            <w:tcW w:w="3233" w:type="dxa"/>
-            <w:vAlign w:val="center"/>
-          </w:tcPr>
-          <w:p>
-            <w:pPr>
-              <w:spacing w:line="240" w:lineRule="auto"/>
-              <w:rPr>
-                <w:rFonts w:ascii="Times New Roman" w:hAnsi="Times New Roman" w:cs="Times New Roman"/>
-              </w:rPr>
-            </w:pPr>
-            <w:r>
-              <w:rPr>
-                <w:rFonts w:ascii="Times New Roman" w:hAnsi="Times New Roman" w:cs="Times New Roman"/>
-                <w:color w:val="000000"/>
-              </w:rPr>
-              <w:t>5</w:t>
-            </w:r>
-          </w:p>
-        </w:tc>
-        <w:tc>
-          <w:tcPr>
-            <w:tcW w:w="4320" w:type="dxa"/>
-            <w:vAlign w:val="center"/>
-          </w:tcPr>
-          <w:p>
-            <w:pPr>
-              <w:spacing w:line="240" w:lineRule="auto"/>
-              <w:jc w:val="right"/>
-              <w:rPr>
-                <w:rFonts w:ascii="Times New Roman" w:hAnsi="Times New Roman" w:cs="Times New Roman"/>
-              </w:rPr>
-            </w:pPr>
-            <w:r>
-              <w:rPr>
-                <w:rFonts w:ascii="Times New Roman" w:hAnsi="Times New Roman" w:cs="Times New Roman"/>
-                <w:color w:val="000000"/>
-              </w:rPr>
-              <w:t>2220.597</w:t>
-            </w:r>
-          </w:p>
-        </w:tc>
-      </w:tr>
-      <w:tr>
-        <w:tc>
-          <w:tcPr>
-            <w:tcW w:w="1915" w:type="dxa"/>
-            <w:vAlign w:val="center"/>
-          </w:tcPr>
-          <w:p>
-            <w:pPr>
-              <w:spacing w:line="240" w:lineRule="auto"/>
-              <w:rPr>
-                <w:rFonts w:ascii="Times New Roman" w:hAnsi="Times New Roman" w:cs="Times New Roman"/>
-              </w:rPr>
-            </w:pPr>
-            <w:r>
-              <w:rPr>
-                <w:rFonts w:ascii="Times New Roman" w:hAnsi="Times New Roman" w:cs="Times New Roman"/>
-                <w:color w:val="000000"/>
-              </w:rPr>
-              <w:t>Canada</w:t>
-            </w:r>
-          </w:p>
-        </w:tc>
-        <w:tc>
-          <w:tcPr>
-            <w:tcW w:w="3233" w:type="dxa"/>
-            <w:vAlign w:val="center"/>
-          </w:tcPr>
-          <w:p>
-            <w:pPr>
-              <w:spacing w:line="240" w:lineRule="auto"/>
-              <w:rPr>
-                <w:rFonts w:ascii="Times New Roman" w:hAnsi="Times New Roman" w:cs="Times New Roman"/>
-              </w:rPr>
-            </w:pPr>
-            <w:r>
-              <w:rPr>
-                <w:rFonts w:ascii="Times New Roman" w:hAnsi="Times New Roman" w:cs="Times New Roman"/>
-                <w:color w:val="000000"/>
-              </w:rPr>
-              <w:t>1</w:t>
-            </w:r>
-          </w:p>
-        </w:tc>
-        <w:tc>
-          <w:tcPr>
-            <w:tcW w:w="4320" w:type="dxa"/>
-            <w:vAlign w:val="center"/>
-          </w:tcPr>
-          <w:p>
-            <w:pPr>
-              <w:spacing w:line="240" w:lineRule="auto"/>
-              <w:jc w:val="right"/>
-              <w:rPr>
-                <w:rFonts w:ascii="Times New Roman" w:hAnsi="Times New Roman" w:cs="Times New Roman"/>
-              </w:rPr>
-            </w:pPr>
-            <w:r>
-              <w:rPr>
-                <w:rFonts w:ascii="Times New Roman" w:hAnsi="Times New Roman" w:cs="Times New Roman"/>
-                <w:color w:val="000000"/>
-              </w:rPr>
-              <w:t>64539.770</w:t>
-            </w:r>
-          </w:p>
-        </w:tc>
-      </w:tr>
-      <w:tr>
-        <w:tc>
-          <w:tcPr>
-            <w:tcW w:w="1915" w:type="dxa"/>
-            <w:vAlign w:val="center"/>
-          </w:tcPr>
-          <w:p>
-            <w:pPr>
-              <w:spacing w:line="240" w:lineRule="auto"/>
-              <w:rPr>
-                <w:rFonts w:ascii="Times New Roman" w:hAnsi="Times New Roman" w:cs="Times New Roman"/>
-              </w:rPr>
-            </w:pPr>
-            <w:r>
-              <w:rPr>
-                <w:rFonts w:ascii="Times New Roman" w:hAnsi="Times New Roman" w:cs="Times New Roman"/>
-                <w:color w:val="000000"/>
-              </w:rPr>
-              <w:t>Canada</w:t>
-            </w:r>
-          </w:p>
-        </w:tc>
-        <w:tc>
-          <w:tcPr>
-            <w:tcW w:w="3233" w:type="dxa"/>
-            <w:vAlign w:val="center"/>
-          </w:tcPr>
-          <w:p>
-            <w:pPr>
-              <w:spacing w:line="240" w:lineRule="auto"/>
-              <w:rPr>
-                <w:rFonts w:ascii="Times New Roman" w:hAnsi="Times New Roman" w:cs="Times New Roman"/>
-              </w:rPr>
-            </w:pPr>
-            <w:r>
-              <w:rPr>
-                <w:rFonts w:ascii="Times New Roman" w:hAnsi="Times New Roman" w:cs="Times New Roman"/>
-                <w:color w:val="000000"/>
-              </w:rPr>
-              <w:t>2</w:t>
-            </w:r>
-          </w:p>
-        </w:tc>
-        <w:tc>
-          <w:tcPr>
-            <w:tcW w:w="4320" w:type="dxa"/>
-            <w:vAlign w:val="center"/>
-          </w:tcPr>
-          <w:p>
-            <w:pPr>
-              <w:spacing w:line="240" w:lineRule="auto"/>
-              <w:jc w:val="right"/>
-              <w:rPr>
-                <w:rFonts w:ascii="Times New Roman" w:hAnsi="Times New Roman" w:cs="Times New Roman"/>
-              </w:rPr>
-            </w:pPr>
-            <w:r>
-              <w:rPr>
-                <w:rFonts w:ascii="Times New Roman" w:hAnsi="Times New Roman" w:cs="Times New Roman"/>
-                <w:color w:val="000000"/>
-              </w:rPr>
-              <w:t>17544.261</w:t>
-            </w:r>
-          </w:p>
-        </w:tc>
-      </w:tr>
-      <w:tr>
-        <w:tc>
-          <w:tcPr>
-            <w:tcW w:w="1915" w:type="dxa"/>
-            <w:vAlign w:val="center"/>
-          </w:tcPr>
-          <w:p>
-            <w:pPr>
-              <w:spacing w:line="240" w:lineRule="auto"/>
-              <w:rPr>
-                <w:rFonts w:ascii="Times New Roman" w:hAnsi="Times New Roman" w:cs="Times New Roman"/>
-              </w:rPr>
-            </w:pPr>
-            <w:r>
-              <w:rPr>
-                <w:rFonts w:ascii="Times New Roman" w:hAnsi="Times New Roman" w:cs="Times New Roman"/>
-                <w:color w:val="000000"/>
-              </w:rPr>
-              <w:t>Canada</w:t>
-            </w:r>
-          </w:p>
-        </w:tc>
-        <w:tc>
-          <w:tcPr>
-            <w:tcW w:w="3233" w:type="dxa"/>
-            <w:vAlign w:val="center"/>
-          </w:tcPr>
-          <w:p>
-            <w:pPr>
-              <w:spacing w:line="240" w:lineRule="auto"/>
-              <w:rPr>
-                <w:rFonts w:ascii="Times New Roman" w:hAnsi="Times New Roman" w:cs="Times New Roman"/>
-              </w:rPr>
-            </w:pPr>
-            <w:r>
-              <w:rPr>
-                <w:rFonts w:ascii="Times New Roman" w:hAnsi="Times New Roman" w:cs="Times New Roman"/>
-                <w:color w:val="000000"/>
-              </w:rPr>
-              <w:t>3</w:t>
-            </w:r>
-          </w:p>
-        </w:tc>
-        <w:tc>
-          <w:tcPr>
-            <w:tcW w:w="4320" w:type="dxa"/>
-            <w:vAlign w:val="center"/>
-          </w:tcPr>
-          <w:p>
-            <w:pPr>
-              <w:spacing w:line="240" w:lineRule="auto"/>
-              <w:jc w:val="right"/>
-              <w:rPr>
-                <w:rFonts w:ascii="Times New Roman" w:hAnsi="Times New Roman" w:cs="Times New Roman"/>
-              </w:rPr>
-            </w:pPr>
-            <w:r>
-              <w:rPr>
-                <w:rFonts w:ascii="Times New Roman" w:hAnsi="Times New Roman" w:cs="Times New Roman"/>
-                <w:color w:val="000000"/>
-              </w:rPr>
-              <w:t>12951.673</w:t>
-            </w:r>
-          </w:p>
-        </w:tc>
-      </w:tr>
-      <w:tr>
-        <w:tblPrEx>
-          <w:tblW w:w="9468" w:type="dxa"/>
-          <w:tblBorders>
-            <w:top w:val="none" w:sz="0" w:space="0" w:color="auto"/>
-            <w:left w:val="none" w:sz="0" w:space="0" w:color="auto"/>
-            <w:bottom w:val="none" w:sz="0" w:space="0" w:color="auto"/>
-            <w:right w:val="none" w:sz="0" w:space="0" w:color="auto"/>
-            <w:insideH w:val="none" w:sz="0" w:space="0" w:color="auto"/>
-            <w:insideV w:val="none" w:sz="0" w:space="0" w:color="auto"/>
-          </w:tblBorders>
-          <w:tblPrExChange w:id="15" w:author="Lariscy, Joseph" w:date="2024-12-18T15:59:00Z" w16du:dateUtc="2024-12-18T21:59:00Z">
-            <w:tblPrEx>
-              <w:tblW w:w="9468" w:type="dxa"/>
-              <w:tblBorders>
-                <w:top w:val="none" w:sz="0" w:space="0" w:color="auto"/>
-                <w:left w:val="none" w:sz="0" w:space="0" w:color="auto"/>
-                <w:bottom w:val="none" w:sz="0" w:space="0" w:color="auto"/>
-                <w:right w:val="none" w:sz="0" w:space="0" w:color="auto"/>
-                <w:insideH w:val="none" w:sz="0" w:space="0" w:color="auto"/>
-                <w:insideV w:val="none" w:sz="0" w:space="0" w:color="auto"/>
-              </w:tblBorders>
-            </w:tblPrEx>
-          </w:tblPrExChange>
-        </w:tblPrEx>
-        <w:tc>
-          <w:tcPr>
-            <w:tcW w:w="1915" w:type="dxa"/>
-            <w:vAlign w:val="center"/>
-            <w:tcPrChange w:id="16" w:author="Lariscy, Joseph" w:date="2024-12-18T15:59:00Z" w16du:dateUtc="2024-12-18T21:59:00Z">
-              <w:tcPr>
-                <w:tcW w:w="1915" w:type="dxa"/>
-                <w:vAlign w:val="center"/>
-              </w:tcPr>
-            </w:tcPrChange>
-          </w:tcPr>
-          <w:p>
-            <w:pPr>
-              <w:spacing w:line="240" w:lineRule="auto"/>
-              <w:rPr>
-                <w:rFonts w:ascii="Times New Roman" w:hAnsi="Times New Roman" w:cs="Times New Roman"/>
-              </w:rPr>
-            </w:pPr>
-            <w:r>
-              <w:rPr>
-                <w:rFonts w:ascii="Times New Roman" w:hAnsi="Times New Roman" w:cs="Times New Roman"/>
-                <w:color w:val="000000"/>
-              </w:rPr>
-              <w:t>Canada</w:t>
-            </w:r>
-          </w:p>
-        </w:tc>
-        <w:tc>
-          <w:tcPr>
-            <w:tcW w:w="3233" w:type="dxa"/>
-            <w:vAlign w:val="center"/>
-            <w:tcPrChange w:id="17" w:author="Lariscy, Joseph" w:date="2024-12-18T15:59:00Z" w16du:dateUtc="2024-12-18T21:59:00Z">
-              <w:tcPr>
-                <w:tcW w:w="3233" w:type="dxa"/>
-                <w:vAlign w:val="center"/>
-              </w:tcPr>
-            </w:tcPrChange>
-          </w:tcPr>
-          <w:p>
-            <w:pPr>
-              <w:spacing w:line="240" w:lineRule="auto"/>
-              <w:rPr>
-                <w:rFonts w:ascii="Times New Roman" w:hAnsi="Times New Roman" w:cs="Times New Roman"/>
-              </w:rPr>
-            </w:pPr>
-            <w:r>
-              <w:rPr>
-                <w:rFonts w:ascii="Times New Roman" w:hAnsi="Times New Roman" w:cs="Times New Roman"/>
-                <w:color w:val="000000"/>
-              </w:rPr>
-              <w:t>4</w:t>
-            </w:r>
-          </w:p>
-        </w:tc>
-        <w:tc>
-          <w:tcPr>
-            <w:tcW w:w="4320" w:type="dxa"/>
-            <w:vAlign w:val="center"/>
-            <w:tcPrChange w:id="18" w:author="Lariscy, Joseph" w:date="2024-12-18T15:59:00Z" w16du:dateUtc="2024-12-18T21:59:00Z">
-              <w:tcPr>
-                <w:tcW w:w="4320" w:type="dxa"/>
-                <w:vAlign w:val="center"/>
-              </w:tcPr>
-            </w:tcPrChange>
-          </w:tcPr>
-          <w:p>
-            <w:pPr>
-              <w:spacing w:line="240" w:lineRule="auto"/>
-              <w:jc w:val="right"/>
-              <w:rPr>
-                <w:rFonts w:ascii="Times New Roman" w:hAnsi="Times New Roman" w:cs="Times New Roman"/>
-              </w:rPr>
-            </w:pPr>
-            <w:r>
-              <w:rPr>
-                <w:rFonts w:ascii="Times New Roman" w:hAnsi="Times New Roman" w:cs="Times New Roman"/>
-                <w:color w:val="000000"/>
-              </w:rPr>
-              <w:t>11777.921</w:t>
-            </w:r>
-          </w:p>
-        </w:tc>
-      </w:tr>
-      <w:tr>
-        <w:tblPrEx>
-          <w:tblW w:w="9468" w:type="dxa"/>
-          <w:tblBorders>
-            <w:top w:val="none" w:sz="0" w:space="0" w:color="auto"/>
-            <w:left w:val="none" w:sz="0" w:space="0" w:color="auto"/>
-            <w:bottom w:val="none" w:sz="0" w:space="0" w:color="auto"/>
-            <w:right w:val="none" w:sz="0" w:space="0" w:color="auto"/>
-            <w:insideH w:val="none" w:sz="0" w:space="0" w:color="auto"/>
-            <w:insideV w:val="none" w:sz="0" w:space="0" w:color="auto"/>
-          </w:tblBorders>
-          <w:tblPrExChange w:id="19" w:author="Lariscy, Joseph" w:date="2024-12-18T15:59:00Z" w16du:dateUtc="2024-12-18T21:59:00Z">
-            <w:tblPrEx>
-              <w:tblW w:w="9468" w:type="dxa"/>
-              <w:tblBorders>
-                <w:top w:val="none" w:sz="0" w:space="0" w:color="auto"/>
-                <w:left w:val="none" w:sz="0" w:space="0" w:color="auto"/>
-                <w:bottom w:val="none" w:sz="0" w:space="0" w:color="auto"/>
-                <w:right w:val="none" w:sz="0" w:space="0" w:color="auto"/>
-                <w:insideH w:val="none" w:sz="0" w:space="0" w:color="auto"/>
-                <w:insideV w:val="none" w:sz="0" w:space="0" w:color="auto"/>
-              </w:tblBorders>
-            </w:tblPrEx>
-          </w:tblPrExChange>
-        </w:tblPrEx>
-        <w:tc>
-          <w:tcPr>
-            <w:tcW w:w="1915" w:type="dxa"/>
-            <w:tcBorders>
-              <w:bottom w:val="single" w:sz="4" w:space="0" w:color="auto"/>
-            </w:tcBorders>
-            <w:vAlign w:val="center"/>
-            <w:tcPrChange w:id="20" w:author="Lariscy, Joseph" w:date="2024-12-18T15:59:00Z" w16du:dateUtc="2024-12-18T21:59:00Z">
-              <w:tcPr>
-                <w:tcW w:w="1915" w:type="dxa"/>
-                <w:vAlign w:val="center"/>
-              </w:tcPr>
-            </w:tcPrChange>
-          </w:tcPr>
-          <w:p>
-            <w:pPr>
-              <w:spacing w:line="240" w:lineRule="auto"/>
-              <w:rPr>
-                <w:rFonts w:ascii="Times New Roman" w:hAnsi="Times New Roman" w:cs="Times New Roman"/>
-              </w:rPr>
-            </w:pPr>
-            <w:r>
-              <w:rPr>
-                <w:rFonts w:ascii="Times New Roman" w:hAnsi="Times New Roman" w:cs="Times New Roman"/>
-                <w:color w:val="000000"/>
-              </w:rPr>
-              <w:t>Canada</w:t>
-            </w:r>
-          </w:p>
-        </w:tc>
-        <w:tc>
-          <w:tcPr>
-            <w:tcW w:w="3233" w:type="dxa"/>
-            <w:tcBorders>
-              <w:bottom w:val="single" w:sz="4" w:space="0" w:color="auto"/>
-            </w:tcBorders>
-            <w:vAlign w:val="center"/>
-            <w:tcPrChange w:id="21" w:author="Lariscy, Joseph" w:date="2024-12-18T15:59:00Z" w16du:dateUtc="2024-12-18T21:59:00Z">
-              <w:tcPr>
-                <w:tcW w:w="3233" w:type="dxa"/>
-                <w:vAlign w:val="center"/>
-              </w:tcPr>
-            </w:tcPrChange>
-          </w:tcPr>
-          <w:p>
-            <w:pPr>
-              <w:spacing w:line="240" w:lineRule="auto"/>
-              <w:rPr>
-                <w:rFonts w:ascii="Times New Roman" w:hAnsi="Times New Roman" w:cs="Times New Roman"/>
-              </w:rPr>
-            </w:pPr>
-            <w:r>
-              <w:rPr>
-                <w:rFonts w:ascii="Times New Roman" w:hAnsi="Times New Roman" w:cs="Times New Roman"/>
-                <w:color w:val="000000"/>
-              </w:rPr>
-              <w:t>5</w:t>
-            </w:r>
-          </w:p>
-        </w:tc>
-        <w:tc>
-          <w:tcPr>
-            <w:tcW w:w="4320" w:type="dxa"/>
-            <w:tcBorders>
-              <w:bottom w:val="single" w:sz="4" w:space="0" w:color="auto"/>
-            </w:tcBorders>
-            <w:vAlign w:val="center"/>
-            <w:tcPrChange w:id="22" w:author="Lariscy, Joseph" w:date="2024-12-18T15:59:00Z" w16du:dateUtc="2024-12-18T21:59:00Z">
-              <w:tcPr>
-                <w:tcW w:w="4320" w:type="dxa"/>
-                <w:vAlign w:val="center"/>
-              </w:tcPr>
-            </w:tcPrChange>
-          </w:tcPr>
-          <w:p>
-            <w:pPr>
-              <w:spacing w:line="240" w:lineRule="auto"/>
-              <w:jc w:val="right"/>
-              <w:rPr>
-                <w:rFonts w:ascii="Times New Roman" w:hAnsi="Times New Roman" w:cs="Times New Roman"/>
-              </w:rPr>
-            </w:pPr>
-            <w:r>
-              <w:rPr>
-                <w:rFonts w:ascii="Times New Roman" w:hAnsi="Times New Roman" w:cs="Times New Roman"/>
-                <w:color w:val="000000"/>
-              </w:rPr>
-              <w:t>11633.994</w:t>
+                <w:sz w:val="22"/>
+                <w:szCs w:val="22"/>
+              </w:rPr>
+              <w:t>6114</w:t>
             </w:r>
           </w:p>
         </w:tc>
@@ -7557,7 +7800,6 @@
     <w:p>
       <w:pPr>
         <w:spacing w:line="480" w:lineRule="auto"/>
-        <w:ind w:firstLine="720"/>
       </w:pPr>
     </w:p>
     <w:p>
@@ -7565,6 +7807,27 @@
         <w:spacing w:line="480" w:lineRule="auto"/>
         <w:ind w:firstLine="720"/>
       </w:pPr>
+      <w:r>
+        <w:t>I also created a multilevel model</w:t>
+      </w:r>
+      <w:r>
+        <w:t xml:space="preserve"> to </w:t>
+      </w:r>
+      <w:r>
+        <w:t>analyze</w:t>
+      </w:r>
+      <w:r>
+        <w:t xml:space="preserve"> the public dependence ratio</w:t>
+      </w:r>
+      <w:r>
+        <w:t xml:space="preserve">. First, the decision to use a multilevel model is supported by a null model with just the grouping variable, resettlement type, the grouping variable with just random intercepts accounts for about 70% of the total variance in public assistance use. This indicates that there is a lot of </w:t>
+      </w:r>
+      <w:r>
+        <w:t>clustering</w:t>
+      </w:r>
+      <w:r>
+        <w:t xml:space="preserve"> at the grouping level and an ordinary least squares regression would not be able to account for this.</w:t>
+      </w:r>
     </w:p>
     <w:p>
       <w:pPr>
@@ -7572,25 +7835,54 @@
         <w:ind w:firstLine="720"/>
       </w:pPr>
       <w:r>
-        <w:t>I also created a multilevel model</w:t>
-      </w:r>
-      <w:r>
-        <w:t xml:space="preserve"> to </w:t>
-      </w:r>
-      <w:r>
-        <w:t>analyze</w:t>
-      </w:r>
-      <w:r>
-        <w:t xml:space="preserve"> the public dependence ratio</w:t>
-      </w:r>
-      <w:r>
-        <w:t xml:space="preserve">. First, the decision to use a multilevel model is supported by a null model with just the grouping variable, resettlement type, the grouping variable with just random intercepts accounts for about 70% of the total variance in public assistance use. This indicates that there is a lot of </w:t>
-      </w:r>
-      <w:r>
-        <w:t>clustering</w:t>
-      </w:r>
-      <w:r>
-        <w:t xml:space="preserve"> at the grouping level and an ordinary least squares regression would not be able to account for this.</w:t>
+        <w:t xml:space="preserve"> In the full model, I find a gender gap in households headed by women (the</w:t>
+      </w:r>
+      <w:r>
+        <w:t>y</w:t>
+      </w:r>
+      <w:r>
+        <w:t xml:space="preserve"> tend to use more public assistance programs). </w:t>
+      </w:r>
+      <w:r>
+        <w:t>The model estimates that</w:t>
+      </w:r>
+      <w:r>
+        <w:t>, on average,</w:t>
+      </w:r>
+      <w:r>
+        <w:t xml:space="preserve"> </w:t>
+      </w:r>
+      <w:r>
+        <w:t xml:space="preserve">about 6.3% more of the </w:t>
+      </w:r>
+      <w:commentRangeStart w:id="13"/>
+      <w:r>
+        <w:t>female cohort is using public assistance program than the male cohort</w:t>
+      </w:r>
+      <w:commentRangeEnd w:id="13"/>
+      <w:r>
+        <w:rPr>
+          <w:rStyle w:val="CommentReference"/>
+        </w:rPr>
+        <w:commentReference w:id="13"/>
+      </w:r>
+      <w:r>
+        <w:t xml:space="preserve">. This is a moderate effect, </w:t>
+      </w:r>
+      <w:r>
+        <w:t>like</w:t>
+      </w:r>
+      <w:r>
+        <w:t xml:space="preserve"> the effect of a cohort </w:t>
+      </w:r>
+      <w:r>
+        <w:t xml:space="preserve">living another additional year in the country. For every year lived in the county, we expect </w:t>
+      </w:r>
+      <w:r>
+        <w:t xml:space="preserve">an additional 5.5% of the cohort to be </w:t>
+      </w:r>
+      <w:r>
+        <w:t xml:space="preserve">off of public assistance programs. </w:t>
       </w:r>
     </w:p>
     <w:p>
@@ -7599,71 +7891,19 @@
         <w:ind w:firstLine="720"/>
       </w:pPr>
       <w:r>
-        <w:t xml:space="preserve"> In the full model, I find a gender gap in households headed by women (the</w:t>
-      </w:r>
-      <w:r>
-        <w:t>y</w:t>
-      </w:r>
-      <w:r>
-        <w:t xml:space="preserve"> tend to use more public assistance programs). </w:t>
-      </w:r>
-      <w:r>
-        <w:t>The model estimates that</w:t>
-      </w:r>
-      <w:r>
-        <w:t>, on average,</w:t>
+        <w:t xml:space="preserve">We will avoid interpreting the </w:t>
+      </w:r>
+      <w:r>
+        <w:t>effects of the public assistance programs alone. Because of the interaction effect, these represent the effect of a program when the funding is 0, which</w:t>
       </w:r>
       <w:r>
         <w:t xml:space="preserve"> </w:t>
       </w:r>
       <w:r>
-        <w:t xml:space="preserve">about 6.3% more of the </w:t>
-      </w:r>
-      <w:commentRangeStart w:id="23"/>
-      <w:r>
-        <w:t>female cohort is using public assistance program than the male cohort</w:t>
-      </w:r>
-      <w:commentRangeEnd w:id="23"/>
-      <w:r>
-        <w:rPr>
-          <w:rStyle w:val="CommentReference"/>
-        </w:rPr>
-        <w:commentReference w:id="23"/>
-      </w:r>
-      <w:r>
-        <w:t xml:space="preserve">. This is a moderate effect, </w:t>
-      </w:r>
-      <w:r>
-        <w:t>like</w:t>
-      </w:r>
-      <w:r>
-        <w:t xml:space="preserve"> the effect of a cohort </w:t>
-      </w:r>
-      <w:r>
-        <w:t xml:space="preserve">living another additional year in the country. </w:t>
-      </w:r>
-      <w:r>
-        <w:lastRenderedPageBreak/>
-        <w:t xml:space="preserve">For every year </w:t>
-      </w:r>
-      <w:proofErr w:type="gramStart"/>
-      <w:r>
-        <w:t>lived</w:t>
-      </w:r>
-      <w:proofErr w:type="gramEnd"/>
-      <w:r>
-        <w:t xml:space="preserve"> in the county, we expect </w:t>
-      </w:r>
-      <w:r>
-        <w:t xml:space="preserve">an additional 5.5% of the cohort to be </w:t>
-      </w:r>
-      <w:proofErr w:type="gramStart"/>
-      <w:r>
-        <w:t>off of</w:t>
-      </w:r>
-      <w:proofErr w:type="gramEnd"/>
-      <w:r>
-        <w:t xml:space="preserve"> public assistance programs. </w:t>
+        <w:t>is not possible</w:t>
+      </w:r>
+      <w:r>
+        <w:t xml:space="preserve">. </w:t>
       </w:r>
     </w:p>
     <w:p>
@@ -7672,38 +7912,18 @@
         <w:ind w:firstLine="720"/>
       </w:pPr>
       <w:r>
-        <w:t xml:space="preserve">We will avoid interpreting the </w:t>
-      </w:r>
-      <w:r>
-        <w:t>effects of the public assistance programs alone. Because of the interaction effect, these represent the effect of a program when the funding is 0, which</w:t>
-      </w:r>
-      <w:r>
-        <w:t xml:space="preserve"> </w:t>
-      </w:r>
-      <w:r>
-        <w:t>is not possible</w:t>
-      </w:r>
-      <w:r>
-        <w:t xml:space="preserve">. </w:t>
-      </w:r>
-    </w:p>
-    <w:p>
-      <w:pPr>
-        <w:spacing w:line="480" w:lineRule="auto"/>
-        <w:ind w:firstLine="720"/>
-      </w:pPr>
-      <w:r>
+        <w:lastRenderedPageBreak/>
         <w:t xml:space="preserve">When we consider the </w:t>
       </w:r>
       <w:r>
         <w:t xml:space="preserve">interaction of funding with the resettlement type, </w:t>
       </w:r>
-      <w:del w:id="24" w:author="Lariscy, Joseph" w:date="2024-12-18T16:04:00Z" w16du:dateUtc="2024-12-18T22:04:00Z">
+      <w:del w:id="14" w:author="Lariscy, Joseph" w:date="2024-12-18T16:04:00Z" w16du:dateUtc="2024-12-18T22:04:00Z">
         <w:r>
           <w:delText>T</w:delText>
         </w:r>
       </w:del>
-      <w:ins w:id="25" w:author="Lariscy, Joseph" w:date="2024-12-18T16:04:00Z" w16du:dateUtc="2024-12-18T22:04:00Z">
+      <w:ins w:id="15" w:author="Lariscy, Joseph" w:date="2024-12-18T16:04:00Z" w16du:dateUtc="2024-12-18T22:04:00Z">
         <w:r>
           <w:t>t</w:t>
         </w:r>
@@ -7771,12 +7991,12 @@
       <w:r>
         <w:t xml:space="preserve"> can expect 7.2 percentage points </w:t>
       </w:r>
-      <w:ins w:id="26" w:author="Lariscy, Joseph" w:date="2024-12-18T16:04:00Z" w16du:dateUtc="2024-12-18T22:04:00Z">
+      <w:ins w:id="16" w:author="Lariscy, Joseph" w:date="2024-12-18T16:04:00Z" w16du:dateUtc="2024-12-18T22:04:00Z">
         <w:r>
           <w:t>lower</w:t>
         </w:r>
       </w:ins>
-      <w:del w:id="27" w:author="Lariscy, Joseph" w:date="2024-12-18T16:04:00Z" w16du:dateUtc="2024-12-18T22:04:00Z">
+      <w:del w:id="17" w:author="Lariscy, Joseph" w:date="2024-12-18T16:04:00Z" w16du:dateUtc="2024-12-18T22:04:00Z">
         <w:r>
           <w:delText>fewer</w:delText>
         </w:r>
@@ -7808,7 +8028,7 @@
       <w:r>
         <w:t>. The full mode</w:t>
       </w:r>
-      <w:ins w:id="28" w:author="Lariscy, Joseph" w:date="2024-12-17T17:18:00Z" w16du:dateUtc="2024-12-17T23:18:00Z">
+      <w:ins w:id="18" w:author="Lariscy, Joseph" w:date="2024-12-17T17:18:00Z" w16du:dateUtc="2024-12-17T23:18:00Z">
         <w:r>
           <w:t>l</w:t>
         </w:r>
@@ -8100,7 +8320,6 @@
                 <w:rFonts w:ascii="Segoe UI" w:hAnsi="Segoe UI" w:cs="Segoe UI"/>
                 <w:color w:val="212529"/>
               </w:rPr>
-              <w:lastRenderedPageBreak/>
               <w:t xml:space="preserve">           Females (ref= Male-headed households)</w:t>
             </w:r>
           </w:p>
@@ -8381,6 +8600,7 @@
                 <w:rFonts w:ascii="Segoe UI" w:hAnsi="Segoe UI" w:cs="Segoe UI"/>
                 <w:color w:val="212529"/>
               </w:rPr>
+              <w:lastRenderedPageBreak/>
               <w:t>log(</w:t>
             </w:r>
             <w:proofErr w:type="gramEnd"/>
@@ -8981,11 +9201,7 @@
         <w:t xml:space="preserve">That refugee cohorts with greater funding per capita would do better than cohorts with less funding per capita. 2) </w:t>
       </w:r>
       <w:r>
-        <w:t xml:space="preserve">That the </w:t>
-      </w:r>
-      <w:r>
-        <w:lastRenderedPageBreak/>
-        <w:t xml:space="preserve">Canadian and U.S. government-led resettlement systems would have similar outcomes. </w:t>
+        <w:t xml:space="preserve">That the Canadian and U.S. government-led resettlement systems would have similar outcomes. </w:t>
       </w:r>
       <w:r>
         <w:t xml:space="preserve">And 3) </w:t>
@@ -9015,7 +9231,11 @@
         <w:t>has far lower funding allocated per capita</w:t>
       </w:r>
       <w:r>
-        <w:t>. Canada often has multiple times as much funding per capita than the United States</w:t>
+        <w:t xml:space="preserve">. Canada often has multiple times as much </w:t>
+      </w:r>
+      <w:r>
+        <w:lastRenderedPageBreak/>
+        <w:t>funding per capita than the United States</w:t>
       </w:r>
       <w:r>
         <w:t>,</w:t>
@@ -9098,12 +9318,12 @@
       <w:r>
         <w:t xml:space="preserve">3. </w:t>
       </w:r>
-      <w:del w:id="29" w:author="Lariscy, Joseph" w:date="2024-12-18T10:21:00Z" w16du:dateUtc="2024-12-18T16:21:00Z">
+      <w:del w:id="19" w:author="Lariscy, Joseph" w:date="2024-12-18T10:21:00Z" w16du:dateUtc="2024-12-18T16:21:00Z">
         <w:r>
           <w:delText>There were n</w:delText>
         </w:r>
       </w:del>
-      <w:ins w:id="30" w:author="Lariscy, Joseph" w:date="2024-12-18T10:21:00Z" w16du:dateUtc="2024-12-18T16:21:00Z">
+      <w:ins w:id="20" w:author="Lariscy, Joseph" w:date="2024-12-18T10:21:00Z" w16du:dateUtc="2024-12-18T16:21:00Z">
         <w:r>
           <w:t>N</w:t>
         </w:r>
@@ -9111,7 +9331,7 @@
       <w:r>
         <w:t xml:space="preserve">o </w:t>
       </w:r>
-      <w:del w:id="31" w:author="Lariscy, Joseph" w:date="2024-12-18T10:21:00Z" w16du:dateUtc="2024-12-18T16:21:00Z">
+      <w:del w:id="21" w:author="Lariscy, Joseph" w:date="2024-12-18T10:21:00Z" w16du:dateUtc="2024-12-18T16:21:00Z">
         <w:r>
           <w:delText xml:space="preserve">pieces of </w:delText>
         </w:r>
@@ -9119,7 +9339,7 @@
       <w:r>
         <w:t xml:space="preserve">evidence </w:t>
       </w:r>
-      <w:del w:id="32" w:author="Lariscy, Joseph" w:date="2024-12-18T10:21:00Z" w16du:dateUtc="2024-12-18T16:21:00Z">
+      <w:del w:id="22" w:author="Lariscy, Joseph" w:date="2024-12-18T10:21:00Z" w16du:dateUtc="2024-12-18T16:21:00Z">
         <w:r>
           <w:delText xml:space="preserve">that </w:delText>
         </w:r>
@@ -9178,7 +9398,6 @@
         <w:ind w:firstLine="720"/>
       </w:pPr>
       <w:r>
-        <w:lastRenderedPageBreak/>
         <w:t xml:space="preserve">It would be wrong to assume that </w:t>
       </w:r>
       <w:r>
@@ -9202,7 +9421,7 @@
       <w:r>
         <w:t xml:space="preserve"> funding than Canada, which has higher</w:t>
       </w:r>
-      <w:del w:id="33" w:author="Lariscy, Joseph" w:date="2024-12-18T10:26:00Z" w16du:dateUtc="2024-12-18T16:26:00Z">
+      <w:del w:id="23" w:author="Lariscy, Joseph" w:date="2024-12-18T10:26:00Z" w16du:dateUtc="2024-12-18T16:26:00Z">
         <w:r>
           <w:delText>.</w:delText>
         </w:r>
@@ -9211,15 +9430,7 @@
         <w:t>, in the short term. The arguments raised by researchers focus on the long term. This study simply identifies that</w:t>
       </w:r>
       <w:r>
-        <w:t xml:space="preserve"> in the short term, we don’t see much gain increasing the funding per capita </w:t>
-      </w:r>
-      <w:proofErr w:type="gramStart"/>
-      <w:r>
-        <w:t>nor in increasing</w:t>
-      </w:r>
-      <w:proofErr w:type="gramEnd"/>
-      <w:r>
-        <w:t xml:space="preserve"> the </w:t>
+        <w:t xml:space="preserve"> in the short term, we don’t see much gain increasing the funding per capita nor in increasing the </w:t>
       </w:r>
       <w:r>
         <w:t>duration</w:t>
@@ -9228,18 +9439,11 @@
         <w:t xml:space="preserve"> of </w:t>
       </w:r>
       <w:r>
+        <w:lastRenderedPageBreak/>
         <w:t xml:space="preserve">refugee specific support programs when other benefits like SNAP or TANF are available. It is probable that </w:t>
       </w:r>
       <w:r>
-        <w:t xml:space="preserve">initial support will matter more for </w:t>
-      </w:r>
-      <w:proofErr w:type="gramStart"/>
-      <w:r>
-        <w:t>long term</w:t>
-      </w:r>
-      <w:proofErr w:type="gramEnd"/>
-      <w:r>
-        <w:t xml:space="preserve"> outcomes. </w:t>
+        <w:t xml:space="preserve">initial support will matter more for long term outcomes. </w:t>
       </w:r>
     </w:p>
     <w:p>
@@ -9248,22 +9452,14 @@
         <w:ind w:firstLine="720"/>
       </w:pPr>
       <w:r>
-        <w:t xml:space="preserve">These results have </w:t>
-      </w:r>
-      <w:proofErr w:type="gramStart"/>
-      <w:r>
-        <w:t>policy implications</w:t>
-      </w:r>
-      <w:proofErr w:type="gramEnd"/>
-      <w:r>
-        <w:t>. Male-headed households are not using public assistance programs at the same rate as female ones. Perhaps this is an advantage or privileged male</w:t>
-      </w:r>
-      <w:ins w:id="34" w:author="Lariscy, Joseph" w:date="2024-12-18T10:37:00Z" w16du:dateUtc="2024-12-18T16:37:00Z">
+        <w:t>These results have policy implications. Male-headed households are not using public assistance programs at the same rate as female ones. Perhaps this is an advantage or privileged male</w:t>
+      </w:r>
+      <w:ins w:id="24" w:author="Lariscy, Joseph" w:date="2024-12-18T10:37:00Z" w16du:dateUtc="2024-12-18T16:37:00Z">
         <w:r>
           <w:t xml:space="preserve"> </w:t>
         </w:r>
       </w:ins>
-      <w:del w:id="35" w:author="Lariscy, Joseph" w:date="2024-12-18T10:37:00Z" w16du:dateUtc="2024-12-18T16:37:00Z">
+      <w:del w:id="25" w:author="Lariscy, Joseph" w:date="2024-12-18T10:37:00Z" w16du:dateUtc="2024-12-18T16:37:00Z">
         <w:r>
           <w:delText>-</w:delText>
         </w:r>
@@ -9283,16 +9479,16 @@
       <w:r>
         <w:t xml:space="preserve">: </w:t>
       </w:r>
-      <w:commentRangeStart w:id="36"/>
+      <w:commentRangeStart w:id="26"/>
       <w:r>
         <w:t>the Welcome Corps</w:t>
       </w:r>
-      <w:commentRangeEnd w:id="36"/>
+      <w:commentRangeEnd w:id="26"/>
       <w:r>
         <w:rPr>
           <w:rStyle w:val="CommentReference"/>
         </w:rPr>
-        <w:commentReference w:id="36"/>
+        <w:commentReference w:id="26"/>
       </w:r>
       <w:r>
         <w:t xml:space="preserve">. </w:t>
@@ -9327,7 +9523,6 @@
     <w:p>
       <w:pPr>
         <w:pStyle w:val="Bibliography"/>
-        <w:spacing w:line="480" w:lineRule="auto"/>
         <w:rPr>
           <w:rFonts w:ascii="Aptos" w:hAnsi="Aptos"/>
         </w:rPr>
@@ -9365,16 +9560,23 @@
     <w:p>
       <w:pPr>
         <w:pStyle w:val="Bibliography"/>
-        <w:spacing w:line="480" w:lineRule="auto"/>
-        <w:rPr>
-          <w:rFonts w:ascii="Aptos" w:hAnsi="Aptos"/>
-        </w:rPr>
-      </w:pPr>
-      <w:r>
-        <w:rPr>
-          <w:rFonts w:ascii="Aptos" w:hAnsi="Aptos"/>
-        </w:rPr>
-        <w:t xml:space="preserve">Bloemraad, Irene. 2011. “‘Two Peas in a Pod,’ ‘Apples and Oranges,’ and Other Food Metaphors: Comparing Canada and the United States.” </w:t>
+        <w:rPr>
+          <w:rFonts w:ascii="Aptos" w:hAnsi="Aptos"/>
+        </w:rPr>
+      </w:pPr>
+      <w:proofErr w:type="spellStart"/>
+      <w:r>
+        <w:rPr>
+          <w:rFonts w:ascii="Aptos" w:hAnsi="Aptos"/>
+        </w:rPr>
+        <w:t>Bloemraad</w:t>
+      </w:r>
+      <w:proofErr w:type="spellEnd"/>
+      <w:r>
+        <w:rPr>
+          <w:rFonts w:ascii="Aptos" w:hAnsi="Aptos"/>
+        </w:rPr>
+        <w:t xml:space="preserve">, Irene. 2011. “‘Two Peas in a Pod,’ ‘Apples and Oranges,’ and Other Food Metaphors: Comparing Canada and the United States.” </w:t>
       </w:r>
       <w:r>
         <w:rPr>
@@ -9388,22 +9590,43 @@
         <w:rPr>
           <w:rFonts w:ascii="Aptos" w:hAnsi="Aptos"/>
         </w:rPr>
-        <w:t xml:space="preserve"> 55(9):1131–59. doi: 10.1177/0002764211407844.</w:t>
+        <w:t xml:space="preserve"> 55(9):1131–59. </w:t>
+      </w:r>
+      <w:proofErr w:type="spellStart"/>
+      <w:r>
+        <w:rPr>
+          <w:rFonts w:ascii="Aptos" w:hAnsi="Aptos"/>
+        </w:rPr>
+        <w:t>doi</w:t>
+      </w:r>
+      <w:proofErr w:type="spellEnd"/>
+      <w:r>
+        <w:rPr>
+          <w:rFonts w:ascii="Aptos" w:hAnsi="Aptos"/>
+        </w:rPr>
+        <w:t>: 10.1177/0002764211407844.</w:t>
       </w:r>
     </w:p>
     <w:p>
       <w:pPr>
         <w:pStyle w:val="Bibliography"/>
-        <w:spacing w:line="480" w:lineRule="auto"/>
-        <w:rPr>
-          <w:rFonts w:ascii="Aptos" w:hAnsi="Aptos"/>
-        </w:rPr>
-      </w:pPr>
-      <w:r>
-        <w:rPr>
-          <w:rFonts w:ascii="Aptos" w:hAnsi="Aptos"/>
-        </w:rPr>
-        <w:t xml:space="preserve">Bloemraad, Irene. 2013. “The Promise and Pitfalls of Comparative Research Design in the Study of Migration.” </w:t>
+        <w:rPr>
+          <w:rFonts w:ascii="Aptos" w:hAnsi="Aptos"/>
+        </w:rPr>
+      </w:pPr>
+      <w:proofErr w:type="spellStart"/>
+      <w:r>
+        <w:rPr>
+          <w:rFonts w:ascii="Aptos" w:hAnsi="Aptos"/>
+        </w:rPr>
+        <w:t>Bloemraad</w:t>
+      </w:r>
+      <w:proofErr w:type="spellEnd"/>
+      <w:r>
+        <w:rPr>
+          <w:rFonts w:ascii="Aptos" w:hAnsi="Aptos"/>
+        </w:rPr>
+        <w:t xml:space="preserve">, Irene. 2013. “The Promise and Pitfalls of Comparative Research Design in the Study of Migration.” </w:t>
       </w:r>
       <w:r>
         <w:rPr>
@@ -9417,13 +9640,26 @@
         <w:rPr>
           <w:rFonts w:ascii="Aptos" w:hAnsi="Aptos"/>
         </w:rPr>
-        <w:t xml:space="preserve"> 1(1):27–46. doi: 10.1093/migration/mns035.</w:t>
+        <w:t xml:space="preserve"> 1(1):27–46. </w:t>
+      </w:r>
+      <w:proofErr w:type="spellStart"/>
+      <w:r>
+        <w:rPr>
+          <w:rFonts w:ascii="Aptos" w:hAnsi="Aptos"/>
+        </w:rPr>
+        <w:t>doi</w:t>
+      </w:r>
+      <w:proofErr w:type="spellEnd"/>
+      <w:r>
+        <w:rPr>
+          <w:rFonts w:ascii="Aptos" w:hAnsi="Aptos"/>
+        </w:rPr>
+        <w:t>: 10.1093/migration/mns035.</w:t>
       </w:r>
     </w:p>
     <w:p>
       <w:pPr>
         <w:pStyle w:val="Bibliography"/>
-        <w:spacing w:line="480" w:lineRule="auto"/>
         <w:rPr>
           <w:rFonts w:ascii="Aptos" w:hAnsi="Aptos"/>
         </w:rPr>
@@ -9446,13 +9682,40 @@
         <w:rPr>
           <w:rFonts w:ascii="Aptos" w:hAnsi="Aptos"/>
         </w:rPr>
-        <w:t>. doi: 10.1080/14650045.2020.1781820.</w:t>
+        <w:t xml:space="preserve">. </w:t>
+      </w:r>
+      <w:proofErr w:type="spellStart"/>
+      <w:r>
+        <w:rPr>
+          <w:rFonts w:ascii="Aptos" w:hAnsi="Aptos"/>
+        </w:rPr>
+        <w:t>doi</w:t>
+      </w:r>
+      <w:proofErr w:type="spellEnd"/>
+      <w:r>
+        <w:rPr>
+          <w:rFonts w:ascii="Aptos" w:hAnsi="Aptos"/>
+        </w:rPr>
+        <w:t>: 10.1080/14650045.2020.1781820.</w:t>
       </w:r>
     </w:p>
     <w:p>
       <w:pPr>
         <w:pStyle w:val="Bibliography"/>
-        <w:spacing w:line="480" w:lineRule="auto"/>
+        <w:rPr>
+          <w:rFonts w:ascii="Aptos" w:hAnsi="Aptos"/>
+        </w:rPr>
+      </w:pPr>
+      <w:r>
+        <w:rPr>
+          <w:rFonts w:ascii="Aptos" w:hAnsi="Aptos"/>
+        </w:rPr>
+        <w:t>Bureau of Labor Statistics. 2024. “Consumer Price Index for All Urban Consumers.”</w:t>
+      </w:r>
+    </w:p>
+    <w:p>
+      <w:pPr>
+        <w:pStyle w:val="Bibliography"/>
         <w:rPr>
           <w:rFonts w:ascii="Aptos" w:hAnsi="Aptos"/>
         </w:rPr>
@@ -9467,7 +9730,6 @@
     <w:p>
       <w:pPr>
         <w:pStyle w:val="Bibliography"/>
-        <w:spacing w:line="480" w:lineRule="auto"/>
         <w:rPr>
           <w:rFonts w:ascii="Aptos" w:hAnsi="Aptos"/>
         </w:rPr>
@@ -9496,7 +9758,6 @@
     <w:p>
       <w:pPr>
         <w:pStyle w:val="Bibliography"/>
-        <w:spacing w:line="480" w:lineRule="auto"/>
         <w:rPr>
           <w:rFonts w:ascii="Aptos" w:hAnsi="Aptos"/>
         </w:rPr>
@@ -9525,16 +9786,14 @@
     <w:p>
       <w:pPr>
         <w:pStyle w:val="Bibliography"/>
-        <w:spacing w:line="480" w:lineRule="auto"/>
-        <w:rPr>
-          <w:rFonts w:ascii="Aptos" w:hAnsi="Aptos"/>
-        </w:rPr>
-      </w:pPr>
-      <w:r>
-        <w:rPr>
-          <w:rFonts w:ascii="Aptos" w:hAnsi="Aptos"/>
-        </w:rPr>
-        <w:lastRenderedPageBreak/>
+        <w:rPr>
+          <w:rFonts w:ascii="Aptos" w:hAnsi="Aptos"/>
+        </w:rPr>
+      </w:pPr>
+      <w:r>
+        <w:rPr>
+          <w:rFonts w:ascii="Aptos" w:hAnsi="Aptos"/>
+        </w:rPr>
         <w:t xml:space="preserve">Capps, Randy, Kathleen Newland, Susan Fratzke, Susanna Groves, Michael Fix, Margie McHugh, and Gregory Auclair. 2015. </w:t>
       </w:r>
       <w:r>
@@ -9555,16 +9814,29 @@
     <w:p>
       <w:pPr>
         <w:pStyle w:val="Bibliography"/>
-        <w:spacing w:line="480" w:lineRule="auto"/>
-        <w:rPr>
-          <w:rFonts w:ascii="Aptos" w:hAnsi="Aptos"/>
-        </w:rPr>
-      </w:pPr>
-      <w:r>
-        <w:rPr>
-          <w:rFonts w:ascii="Aptos" w:hAnsi="Aptos"/>
-        </w:rPr>
-        <w:t xml:space="preserve">Connor, Jynnah Radford and Phillip. 2019. “Canada Now Leads the World in Refugee Resettlement, Surpassing the U.S.” </w:t>
+        <w:rPr>
+          <w:rFonts w:ascii="Aptos" w:hAnsi="Aptos"/>
+        </w:rPr>
+      </w:pPr>
+      <w:r>
+        <w:rPr>
+          <w:rFonts w:ascii="Aptos" w:hAnsi="Aptos"/>
+        </w:rPr>
+        <w:t xml:space="preserve">Connor, </w:t>
+      </w:r>
+      <w:proofErr w:type="spellStart"/>
+      <w:r>
+        <w:rPr>
+          <w:rFonts w:ascii="Aptos" w:hAnsi="Aptos"/>
+        </w:rPr>
+        <w:t>Jynnah</w:t>
+      </w:r>
+      <w:proofErr w:type="spellEnd"/>
+      <w:r>
+        <w:rPr>
+          <w:rFonts w:ascii="Aptos" w:hAnsi="Aptos"/>
+        </w:rPr>
+        <w:t xml:space="preserve"> Radford and Phillip. 2019. “Canada Now Leads the World in Refugee Resettlement, Surpassing the U.S.” </w:t>
       </w:r>
       <w:r>
         <w:rPr>
@@ -9584,7 +9856,6 @@
     <w:p>
       <w:pPr>
         <w:pStyle w:val="Bibliography"/>
-        <w:spacing w:line="480" w:lineRule="auto"/>
         <w:rPr>
           <w:rFonts w:ascii="Aptos" w:hAnsi="Aptos"/>
         </w:rPr>
@@ -9613,7 +9884,6 @@
     <w:p>
       <w:pPr>
         <w:pStyle w:val="Bibliography"/>
-        <w:spacing w:line="480" w:lineRule="auto"/>
         <w:rPr>
           <w:rFonts w:ascii="Aptos" w:hAnsi="Aptos"/>
         </w:rPr>
@@ -9642,15 +9912,15 @@
     <w:p>
       <w:pPr>
         <w:pStyle w:val="Bibliography"/>
-        <w:spacing w:line="480" w:lineRule="auto"/>
-        <w:rPr>
-          <w:rFonts w:ascii="Aptos" w:hAnsi="Aptos"/>
-        </w:rPr>
-      </w:pPr>
-      <w:r>
-        <w:rPr>
-          <w:rFonts w:ascii="Aptos" w:hAnsi="Aptos"/>
-        </w:rPr>
+        <w:rPr>
+          <w:rFonts w:ascii="Aptos" w:hAnsi="Aptos"/>
+        </w:rPr>
+      </w:pPr>
+      <w:r>
+        <w:rPr>
+          <w:rFonts w:ascii="Aptos" w:hAnsi="Aptos"/>
+        </w:rPr>
+        <w:lastRenderedPageBreak/>
         <w:t xml:space="preserve">Donato, Katharine M., and Elizabeth Ferris. 2020. “Refugee Integration in Canada, Europe, and the United States: Perspectives from Research.” </w:t>
       </w:r>
       <w:r>
@@ -9665,13 +9935,26 @@
         <w:rPr>
           <w:rFonts w:ascii="Aptos" w:hAnsi="Aptos"/>
         </w:rPr>
-        <w:t xml:space="preserve"> 690(1):7–35. doi: 10.1177/0002716220943169.</w:t>
+        <w:t xml:space="preserve"> 690(1):7–35. </w:t>
+      </w:r>
+      <w:proofErr w:type="spellStart"/>
+      <w:r>
+        <w:rPr>
+          <w:rFonts w:ascii="Aptos" w:hAnsi="Aptos"/>
+        </w:rPr>
+        <w:t>doi</w:t>
+      </w:r>
+      <w:proofErr w:type="spellEnd"/>
+      <w:r>
+        <w:rPr>
+          <w:rFonts w:ascii="Aptos" w:hAnsi="Aptos"/>
+        </w:rPr>
+        <w:t>: 10.1177/0002716220943169.</w:t>
       </w:r>
     </w:p>
     <w:p>
       <w:pPr>
         <w:pStyle w:val="Bibliography"/>
-        <w:spacing w:line="480" w:lineRule="auto"/>
         <w:rPr>
           <w:rFonts w:ascii="Aptos" w:hAnsi="Aptos"/>
         </w:rPr>
@@ -9694,29 +9977,40 @@
         <w:rPr>
           <w:rFonts w:ascii="Aptos" w:hAnsi="Aptos"/>
         </w:rPr>
-        <w:t>. w23498. National Bureau of Economic Research. doi: 10.3386/w23498.</w:t>
+        <w:t xml:space="preserve">. w23498. National Bureau of Economic Research. </w:t>
+      </w:r>
+      <w:proofErr w:type="spellStart"/>
+      <w:r>
+        <w:rPr>
+          <w:rFonts w:ascii="Aptos" w:hAnsi="Aptos"/>
+        </w:rPr>
+        <w:t>doi</w:t>
+      </w:r>
+      <w:proofErr w:type="spellEnd"/>
+      <w:r>
+        <w:rPr>
+          <w:rFonts w:ascii="Aptos" w:hAnsi="Aptos"/>
+        </w:rPr>
+        <w:t>: 10.3386/w23498.</w:t>
       </w:r>
     </w:p>
     <w:p>
       <w:pPr>
         <w:pStyle w:val="Bibliography"/>
-        <w:spacing w:line="480" w:lineRule="auto"/>
-        <w:rPr>
-          <w:rFonts w:ascii="Aptos" w:hAnsi="Aptos"/>
-        </w:rPr>
-      </w:pPr>
-      <w:r>
-        <w:rPr>
-          <w:rFonts w:ascii="Aptos" w:hAnsi="Aptos"/>
-        </w:rPr>
-        <w:lastRenderedPageBreak/>
+        <w:rPr>
+          <w:rFonts w:ascii="Aptos" w:hAnsi="Aptos"/>
+        </w:rPr>
+      </w:pPr>
+      <w:r>
+        <w:rPr>
+          <w:rFonts w:ascii="Aptos" w:hAnsi="Aptos"/>
+        </w:rPr>
         <w:t>Fix, Michael, Kate Hooper, and Jie Zong. 2017. “How Are Refugees Faring? Integration at U.S. and State Levels.”</w:t>
       </w:r>
     </w:p>
     <w:p>
       <w:pPr>
         <w:pStyle w:val="Bibliography"/>
-        <w:spacing w:line="480" w:lineRule="auto"/>
         <w:rPr>
           <w:rFonts w:ascii="Aptos" w:hAnsi="Aptos"/>
         </w:rPr>
@@ -9731,7 +10025,6 @@
     <w:p>
       <w:pPr>
         <w:pStyle w:val="Bibliography"/>
-        <w:spacing w:line="480" w:lineRule="auto"/>
         <w:rPr>
           <w:rFonts w:ascii="Aptos" w:hAnsi="Aptos"/>
         </w:rPr>
@@ -9760,7 +10053,6 @@
     <w:p>
       <w:pPr>
         <w:pStyle w:val="Bibliography"/>
-        <w:spacing w:line="480" w:lineRule="auto"/>
         <w:rPr>
           <w:rFonts w:ascii="Aptos" w:hAnsi="Aptos"/>
         </w:rPr>
@@ -9775,7 +10067,6 @@
     <w:p>
       <w:pPr>
         <w:pStyle w:val="Bibliography"/>
-        <w:spacing w:line="480" w:lineRule="auto"/>
         <w:rPr>
           <w:rFonts w:ascii="Aptos" w:hAnsi="Aptos"/>
         </w:rPr>
@@ -9790,16 +10081,29 @@
     <w:p>
       <w:pPr>
         <w:pStyle w:val="Bibliography"/>
-        <w:spacing w:line="480" w:lineRule="auto"/>
-        <w:rPr>
-          <w:rFonts w:ascii="Aptos" w:hAnsi="Aptos"/>
-        </w:rPr>
-      </w:pPr>
-      <w:r>
-        <w:rPr>
-          <w:rFonts w:ascii="Aptos" w:hAnsi="Aptos"/>
-        </w:rPr>
-        <w:t xml:space="preserve">International Organization For Migration. 2023. “Refugees and Asylum-Seekers.” </w:t>
+        <w:rPr>
+          <w:rFonts w:ascii="Aptos" w:hAnsi="Aptos"/>
+        </w:rPr>
+      </w:pPr>
+      <w:r>
+        <w:rPr>
+          <w:rFonts w:ascii="Aptos" w:hAnsi="Aptos"/>
+        </w:rPr>
+        <w:t xml:space="preserve">International Organization </w:t>
+      </w:r>
+      <w:proofErr w:type="gramStart"/>
+      <w:r>
+        <w:rPr>
+          <w:rFonts w:ascii="Aptos" w:hAnsi="Aptos"/>
+        </w:rPr>
+        <w:t>For</w:t>
+      </w:r>
+      <w:proofErr w:type="gramEnd"/>
+      <w:r>
+        <w:rPr>
+          <w:rFonts w:ascii="Aptos" w:hAnsi="Aptos"/>
+        </w:rPr>
+        <w:t xml:space="preserve"> Migration. 2023. “Refugees and Asylum-Seekers.” </w:t>
       </w:r>
       <w:r>
         <w:rPr>
@@ -9819,17 +10123,29 @@
     <w:p>
       <w:pPr>
         <w:pStyle w:val="Bibliography"/>
-        <w:spacing w:line="480" w:lineRule="auto"/>
-        <w:rPr>
-          <w:rFonts w:ascii="Aptos" w:hAnsi="Aptos"/>
-        </w:rPr>
-      </w:pPr>
-      <w:r>
-        <w:rPr>
-          <w:rFonts w:ascii="Aptos" w:hAnsi="Aptos"/>
-        </w:rPr>
-        <w:lastRenderedPageBreak/>
-        <w:t xml:space="preserve">Kneebone, Susan, and Felicity Rawlings-Sanaei, eds. 2007. </w:t>
+        <w:rPr>
+          <w:rFonts w:ascii="Aptos" w:hAnsi="Aptos"/>
+        </w:rPr>
+      </w:pPr>
+      <w:r>
+        <w:rPr>
+          <w:rFonts w:ascii="Aptos" w:hAnsi="Aptos"/>
+        </w:rPr>
+        <w:t>Kneebone, Susan, and Felicity Rawlings-</w:t>
+      </w:r>
+      <w:proofErr w:type="spellStart"/>
+      <w:r>
+        <w:rPr>
+          <w:rFonts w:ascii="Aptos" w:hAnsi="Aptos"/>
+        </w:rPr>
+        <w:t>Sanaei</w:t>
+      </w:r>
+      <w:proofErr w:type="spellEnd"/>
+      <w:r>
+        <w:rPr>
+          <w:rFonts w:ascii="Aptos" w:hAnsi="Aptos"/>
+        </w:rPr>
+        <w:t xml:space="preserve">, eds. 2007. </w:t>
       </w:r>
       <w:r>
         <w:rPr>
@@ -9843,13 +10159,26 @@
         <w:rPr>
           <w:rFonts w:ascii="Aptos" w:hAnsi="Aptos"/>
         </w:rPr>
-        <w:t>. 1st edition. New York: Berghahn Books.</w:t>
+        <w:t xml:space="preserve">. 1st edition. New York: </w:t>
+      </w:r>
+      <w:proofErr w:type="spellStart"/>
+      <w:r>
+        <w:rPr>
+          <w:rFonts w:ascii="Aptos" w:hAnsi="Aptos"/>
+        </w:rPr>
+        <w:t>Berghahn</w:t>
+      </w:r>
+      <w:proofErr w:type="spellEnd"/>
+      <w:r>
+        <w:rPr>
+          <w:rFonts w:ascii="Aptos" w:hAnsi="Aptos"/>
+        </w:rPr>
+        <w:t xml:space="preserve"> Books.</w:t>
       </w:r>
     </w:p>
     <w:p>
       <w:pPr>
         <w:pStyle w:val="Bibliography"/>
-        <w:spacing w:line="480" w:lineRule="auto"/>
         <w:rPr>
           <w:rFonts w:ascii="Aptos" w:hAnsi="Aptos"/>
         </w:rPr>
@@ -9872,22 +10201,77 @@
         <w:rPr>
           <w:rFonts w:ascii="Aptos" w:hAnsi="Aptos"/>
         </w:rPr>
-        <w:t xml:space="preserve"> 1st edition. Arlington, Virginia: Mercatus Center at George Mason University.</w:t>
+        <w:t xml:space="preserve"> 1st edition. Arlington, Virginia: </w:t>
+      </w:r>
+      <w:proofErr w:type="spellStart"/>
+      <w:r>
+        <w:rPr>
+          <w:rFonts w:ascii="Aptos" w:hAnsi="Aptos"/>
+        </w:rPr>
+        <w:t>Mercatus</w:t>
+      </w:r>
+      <w:proofErr w:type="spellEnd"/>
+      <w:r>
+        <w:rPr>
+          <w:rFonts w:ascii="Aptos" w:hAnsi="Aptos"/>
+        </w:rPr>
+        <w:t xml:space="preserve"> Center at George Mason University.</w:t>
       </w:r>
     </w:p>
     <w:p>
       <w:pPr>
         <w:pStyle w:val="Bibliography"/>
-        <w:spacing w:line="480" w:lineRule="auto"/>
-        <w:rPr>
-          <w:rFonts w:ascii="Aptos" w:hAnsi="Aptos"/>
-        </w:rPr>
-      </w:pPr>
-      <w:r>
-        <w:rPr>
-          <w:rFonts w:ascii="Aptos" w:hAnsi="Aptos"/>
-        </w:rPr>
-        <w:t xml:space="preserve">Nam, Yunju, Amanda Hausmann, Wooksoo Kim, and Sarah Richards-Desai. 2021. “Welfare-Dependent Refugees?: Evidence from County Welfare Management System Data in Western New York.” </w:t>
+        <w:rPr>
+          <w:rFonts w:ascii="Aptos" w:hAnsi="Aptos"/>
+        </w:rPr>
+      </w:pPr>
+      <w:r>
+        <w:rPr>
+          <w:rFonts w:ascii="Aptos" w:hAnsi="Aptos"/>
+        </w:rPr>
+        <w:t xml:space="preserve">Nam, </w:t>
+      </w:r>
+      <w:proofErr w:type="spellStart"/>
+      <w:r>
+        <w:rPr>
+          <w:rFonts w:ascii="Aptos" w:hAnsi="Aptos"/>
+        </w:rPr>
+        <w:t>Yunju</w:t>
+      </w:r>
+      <w:proofErr w:type="spellEnd"/>
+      <w:r>
+        <w:rPr>
+          <w:rFonts w:ascii="Aptos" w:hAnsi="Aptos"/>
+        </w:rPr>
+        <w:t xml:space="preserve">, Amanda Hausmann, </w:t>
+      </w:r>
+      <w:proofErr w:type="spellStart"/>
+      <w:r>
+        <w:rPr>
+          <w:rFonts w:ascii="Aptos" w:hAnsi="Aptos"/>
+        </w:rPr>
+        <w:t>Wooksoo</w:t>
+      </w:r>
+      <w:proofErr w:type="spellEnd"/>
+      <w:r>
+        <w:rPr>
+          <w:rFonts w:ascii="Aptos" w:hAnsi="Aptos"/>
+        </w:rPr>
+        <w:t xml:space="preserve"> Kim, and Sarah Richards-Desai. 2021. “Welfare-Dependent </w:t>
+      </w:r>
+      <w:proofErr w:type="gramStart"/>
+      <w:r>
+        <w:rPr>
+          <w:rFonts w:ascii="Aptos" w:hAnsi="Aptos"/>
+        </w:rPr>
+        <w:t>Refugees?:</w:t>
+      </w:r>
+      <w:proofErr w:type="gramEnd"/>
+      <w:r>
+        <w:rPr>
+          <w:rFonts w:ascii="Aptos" w:hAnsi="Aptos"/>
+        </w:rPr>
+        <w:t xml:space="preserve"> Evidence from County Welfare Management System Data in Western New York.” </w:t>
       </w:r>
       <w:r>
         <w:rPr>
@@ -9901,21 +10285,35 @@
         <w:rPr>
           <w:rFonts w:ascii="Aptos" w:hAnsi="Aptos"/>
         </w:rPr>
-        <w:t xml:space="preserve"> 0(0):1–14. doi: 10.1080/15562948.2021.1923880.</w:t>
+        <w:t xml:space="preserve"> 0(0):1–14. </w:t>
+      </w:r>
+      <w:proofErr w:type="spellStart"/>
+      <w:r>
+        <w:rPr>
+          <w:rFonts w:ascii="Aptos" w:hAnsi="Aptos"/>
+        </w:rPr>
+        <w:t>doi</w:t>
+      </w:r>
+      <w:proofErr w:type="spellEnd"/>
+      <w:r>
+        <w:rPr>
+          <w:rFonts w:ascii="Aptos" w:hAnsi="Aptos"/>
+        </w:rPr>
+        <w:t>: 10.1080/15562948.2021.1923880.</w:t>
       </w:r>
     </w:p>
     <w:p>
       <w:pPr>
         <w:pStyle w:val="Bibliography"/>
-        <w:spacing w:line="480" w:lineRule="auto"/>
-        <w:rPr>
-          <w:rFonts w:ascii="Aptos" w:hAnsi="Aptos"/>
-        </w:rPr>
-      </w:pPr>
-      <w:r>
-        <w:rPr>
-          <w:rFonts w:ascii="Aptos" w:hAnsi="Aptos"/>
-        </w:rPr>
+        <w:rPr>
+          <w:rFonts w:ascii="Aptos" w:hAnsi="Aptos"/>
+        </w:rPr>
+      </w:pPr>
+      <w:r>
+        <w:rPr>
+          <w:rFonts w:ascii="Aptos" w:hAnsi="Aptos"/>
+        </w:rPr>
+        <w:lastRenderedPageBreak/>
         <w:t xml:space="preserve">Phillimore, Jenny. 2020. “Refugee-Integration-Opportunity Structures: Shifting the Focus from Refugees to Context.” </w:t>
       </w:r>
       <w:r>
@@ -9930,13 +10328,40 @@
         <w:rPr>
           <w:rFonts w:ascii="Aptos" w:hAnsi="Aptos"/>
         </w:rPr>
-        <w:t xml:space="preserve"> (12). doi: 10.1093/jrs/feaa012.</w:t>
+        <w:t xml:space="preserve"> (12). </w:t>
+      </w:r>
+      <w:proofErr w:type="spellStart"/>
+      <w:r>
+        <w:rPr>
+          <w:rFonts w:ascii="Aptos" w:hAnsi="Aptos"/>
+        </w:rPr>
+        <w:t>doi</w:t>
+      </w:r>
+      <w:proofErr w:type="spellEnd"/>
+      <w:r>
+        <w:rPr>
+          <w:rFonts w:ascii="Aptos" w:hAnsi="Aptos"/>
+        </w:rPr>
+        <w:t>: 10.1093/</w:t>
+      </w:r>
+      <w:proofErr w:type="spellStart"/>
+      <w:r>
+        <w:rPr>
+          <w:rFonts w:ascii="Aptos" w:hAnsi="Aptos"/>
+        </w:rPr>
+        <w:t>jrs</w:t>
+      </w:r>
+      <w:proofErr w:type="spellEnd"/>
+      <w:r>
+        <w:rPr>
+          <w:rFonts w:ascii="Aptos" w:hAnsi="Aptos"/>
+        </w:rPr>
+        <w:t>/feaa012.</w:t>
       </w:r>
     </w:p>
     <w:p>
       <w:pPr>
         <w:pStyle w:val="Bibliography"/>
-        <w:spacing w:line="480" w:lineRule="auto"/>
         <w:rPr>
           <w:rFonts w:ascii="Aptos" w:hAnsi="Aptos"/>
         </w:rPr>
@@ -9951,7 +10376,6 @@
     <w:p>
       <w:pPr>
         <w:pStyle w:val="Bibliography"/>
-        <w:spacing w:line="480" w:lineRule="auto"/>
         <w:rPr>
           <w:rFonts w:ascii="Aptos" w:hAnsi="Aptos"/>
         </w:rPr>
@@ -9974,13 +10398,40 @@
         <w:rPr>
           <w:rFonts w:ascii="Aptos" w:hAnsi="Aptos"/>
         </w:rPr>
-        <w:t xml:space="preserve"> 23(4):589–607. doi: 10.1093/jrs/feq046.</w:t>
+        <w:t xml:space="preserve"> 23(4):589–607. </w:t>
+      </w:r>
+      <w:proofErr w:type="spellStart"/>
+      <w:r>
+        <w:rPr>
+          <w:rFonts w:ascii="Aptos" w:hAnsi="Aptos"/>
+        </w:rPr>
+        <w:t>doi</w:t>
+      </w:r>
+      <w:proofErr w:type="spellEnd"/>
+      <w:r>
+        <w:rPr>
+          <w:rFonts w:ascii="Aptos" w:hAnsi="Aptos"/>
+        </w:rPr>
+        <w:t>: 10.1093/</w:t>
+      </w:r>
+      <w:proofErr w:type="spellStart"/>
+      <w:r>
+        <w:rPr>
+          <w:rFonts w:ascii="Aptos" w:hAnsi="Aptos"/>
+        </w:rPr>
+        <w:t>jrs</w:t>
+      </w:r>
+      <w:proofErr w:type="spellEnd"/>
+      <w:r>
+        <w:rPr>
+          <w:rFonts w:ascii="Aptos" w:hAnsi="Aptos"/>
+        </w:rPr>
+        <w:t>/feq046.</w:t>
       </w:r>
     </w:p>
     <w:p>
       <w:pPr>
         <w:pStyle w:val="Bibliography"/>
-        <w:spacing w:line="480" w:lineRule="auto"/>
         <w:rPr>
           <w:rFonts w:ascii="Aptos" w:hAnsi="Aptos"/>
         </w:rPr>
@@ -9995,16 +10446,14 @@
     <w:p>
       <w:pPr>
         <w:pStyle w:val="Bibliography"/>
-        <w:spacing w:line="480" w:lineRule="auto"/>
-        <w:rPr>
-          <w:rFonts w:ascii="Aptos" w:hAnsi="Aptos"/>
-        </w:rPr>
-      </w:pPr>
-      <w:r>
-        <w:rPr>
-          <w:rFonts w:ascii="Aptos" w:hAnsi="Aptos"/>
-        </w:rPr>
-        <w:lastRenderedPageBreak/>
+        <w:rPr>
+          <w:rFonts w:ascii="Aptos" w:hAnsi="Aptos"/>
+        </w:rPr>
+      </w:pPr>
+      <w:r>
+        <w:rPr>
+          <w:rFonts w:ascii="Aptos" w:hAnsi="Aptos"/>
+        </w:rPr>
         <w:t xml:space="preserve">Teixeira, Carlos, and Wei Li. 2009. “Immigrant and Refugee Experiences in North American Cities.” </w:t>
       </w:r>
       <w:r>
@@ -10019,13 +10468,26 @@
         <w:rPr>
           <w:rFonts w:ascii="Aptos" w:hAnsi="Aptos"/>
         </w:rPr>
-        <w:t xml:space="preserve"> 7(3):221–27. doi: 10.1080/15562940903150030.</w:t>
+        <w:t xml:space="preserve"> 7(3):221–27. </w:t>
+      </w:r>
+      <w:proofErr w:type="spellStart"/>
+      <w:r>
+        <w:rPr>
+          <w:rFonts w:ascii="Aptos" w:hAnsi="Aptos"/>
+        </w:rPr>
+        <w:t>doi</w:t>
+      </w:r>
+      <w:proofErr w:type="spellEnd"/>
+      <w:r>
+        <w:rPr>
+          <w:rFonts w:ascii="Aptos" w:hAnsi="Aptos"/>
+        </w:rPr>
+        <w:t>: 10.1080/15562940903150030.</w:t>
       </w:r>
     </w:p>
     <w:p>
       <w:pPr>
         <w:pStyle w:val="Bibliography"/>
-        <w:spacing w:line="480" w:lineRule="auto"/>
         <w:rPr>
           <w:rFonts w:ascii="Aptos" w:hAnsi="Aptos"/>
         </w:rPr>
@@ -10048,13 +10510,26 @@
         <w:rPr>
           <w:rFonts w:ascii="Aptos" w:hAnsi="Aptos"/>
         </w:rPr>
-        <w:t xml:space="preserve"> 6(3):117–49. doi: 10.7758/RSF.2020.6.3.06.</w:t>
+        <w:t xml:space="preserve"> 6(3):117–49. </w:t>
+      </w:r>
+      <w:proofErr w:type="spellStart"/>
+      <w:r>
+        <w:rPr>
+          <w:rFonts w:ascii="Aptos" w:hAnsi="Aptos"/>
+        </w:rPr>
+        <w:t>doi</w:t>
+      </w:r>
+      <w:proofErr w:type="spellEnd"/>
+      <w:r>
+        <w:rPr>
+          <w:rFonts w:ascii="Aptos" w:hAnsi="Aptos"/>
+        </w:rPr>
+        <w:t>: 10.7758/RSF.2020.6.3.06.</w:t>
       </w:r>
     </w:p>
     <w:p>
       <w:pPr>
         <w:pStyle w:val="Bibliography"/>
-        <w:spacing w:line="480" w:lineRule="auto"/>
         <w:rPr>
           <w:rFonts w:ascii="Aptos" w:hAnsi="Aptos"/>
         </w:rPr>
@@ -10083,7 +10558,6 @@
     <w:p>
       <w:pPr>
         <w:pStyle w:val="Bibliography"/>
-        <w:spacing w:line="480" w:lineRule="auto"/>
         <w:rPr>
           <w:rFonts w:ascii="Aptos" w:hAnsi="Aptos"/>
         </w:rPr>
@@ -10112,7 +10586,6 @@
     <w:p>
       <w:pPr>
         <w:pStyle w:val="Bibliography"/>
-        <w:spacing w:line="480" w:lineRule="auto"/>
         <w:rPr>
           <w:rFonts w:ascii="Aptos" w:hAnsi="Aptos"/>
         </w:rPr>
@@ -10141,7 +10614,6 @@
     <w:p>
       <w:pPr>
         <w:pStyle w:val="Bibliography"/>
-        <w:spacing w:line="480" w:lineRule="auto"/>
         <w:rPr>
           <w:rFonts w:ascii="Aptos" w:hAnsi="Aptos"/>
         </w:rPr>
@@ -10165,6 +10637,20 @@
           <w:rFonts w:ascii="Aptos" w:hAnsi="Aptos"/>
         </w:rPr>
         <w:t>. Retrieved December 11, 2024 (https://www.federalregister.gov/documents/2022/09/09/2022-18867/public-charge-ground-of-inadmissibility).</w:t>
+      </w:r>
+    </w:p>
+    <w:p>
+      <w:pPr>
+        <w:pStyle w:val="Bibliography"/>
+        <w:rPr>
+          <w:rFonts w:ascii="Aptos" w:hAnsi="Aptos"/>
+        </w:rPr>
+      </w:pPr>
+      <w:r>
+        <w:rPr>
+          <w:rFonts w:ascii="Aptos" w:hAnsi="Aptos"/>
+        </w:rPr>
+        <w:t>U.S. Department of the Treasury. 2024. “Treasury Reporting Rates of Exchange.”</w:t>
       </w:r>
     </w:p>
     <w:p>
@@ -10273,7 +10759,7 @@
       </w:r>
     </w:p>
   </w:comment>
-  <w:comment w:id="14" w:author="Lariscy, Joseph" w:date="2024-12-17T17:00:00Z" w:initials="JL">
+  <w:comment w:id="12" w:author="Lariscy, Joseph" w:date="2024-12-17T17:00:00Z" w:initials="JL">
     <w:p>
       <w:pPr>
         <w:pStyle w:val="CommentText"/>
@@ -10289,7 +10775,7 @@
       </w:r>
     </w:p>
   </w:comment>
-  <w:comment w:id="23" w:author="Lariscy, Joseph" w:date="2024-12-18T16:03:00Z" w:initials="JL">
+  <w:comment w:id="13" w:author="Lariscy, Joseph" w:date="2024-12-18T16:03:00Z" w:initials="JL">
     <w:p>
       <w:pPr>
         <w:pStyle w:val="CommentText"/>
@@ -10305,7 +10791,7 @@
       </w:r>
     </w:p>
   </w:comment>
-  <w:comment w:id="36" w:author="Lariscy, Joseph" w:date="2024-12-18T10:38:00Z" w:initials="JL">
+  <w:comment w:id="26" w:author="Lariscy, Joseph" w:date="2024-12-18T10:38:00Z" w:initials="JL">
     <w:p>
       <w:pPr>
         <w:pStyle w:val="CommentText"/>
@@ -10317,7 +10803,15 @@
         <w:annotationRef/>
       </w:r>
       <w:r>
-        <w:t>I recommend adding a short blurb about the Welcome Corps here. You could note that it’s a American private resettlement system based on the Canadian model, as you mention in the Abstract.</w:t>
+        <w:t xml:space="preserve">I recommend adding a short blurb about the Welcome Corps here. You could note that it’s </w:t>
+      </w:r>
+      <w:proofErr w:type="gramStart"/>
+      <w:r>
+        <w:t>a</w:t>
+      </w:r>
+      <w:proofErr w:type="gramEnd"/>
+      <w:r>
+        <w:t xml:space="preserve"> American private resettlement system based on the Canadian model, as you mention in the Abstract.</w:t>
       </w:r>
     </w:p>
   </w:comment>
@@ -10330,7 +10824,7 @@
   <w15:commentEx w15:paraId="7EB81C76" w15:done="0"/>
   <w15:commentEx w15:paraId="733D24F7" w15:done="0"/>
   <w15:commentEx w15:paraId="737F6809" w15:done="0"/>
-  <w15:commentEx w15:paraId="4E029DDE" w15:done="0"/>
+  <w15:commentEx w15:paraId="52622085" w15:done="0"/>
   <w15:commentEx w15:paraId="55EF1885" w15:done="0"/>
   <w15:commentEx w15:paraId="5B1AC4D5" w15:done="0"/>
   <w15:commentEx w15:paraId="15D365AE" w15:done="0"/>
@@ -10356,7 +10850,7 @@
   <w16cid:commentId w16cid:paraId="7EB81C76" w16cid:durableId="74D244AB"/>
   <w16cid:commentId w16cid:paraId="733D24F7" w16cid:durableId="74F10203"/>
   <w16cid:commentId w16cid:paraId="737F6809" w16cid:durableId="2635DF0F"/>
-  <w16cid:commentId w16cid:paraId="4E029DDE" w16cid:durableId="5ADDDAD2"/>
+  <w16cid:commentId w16cid:paraId="52622085" w16cid:durableId="5ADDDAD2"/>
   <w16cid:commentId w16cid:paraId="55EF1885" w16cid:durableId="6F80411F"/>
   <w16cid:commentId w16cid:paraId="5B1AC4D5" w16cid:durableId="28E778B3"/>
   <w16cid:commentId w16cid:paraId="15D365AE" w16cid:durableId="045E96B1"/>
@@ -11128,7 +11622,6 @@
   <w:style w:type="character" w:default="1" w:styleId="DefaultParagraphFont">
     <w:name w:val="Default Paragraph Font"/>
     <w:uiPriority w:val="1"/>
-    <w:semiHidden/>
     <w:unhideWhenUsed/>
   </w:style>
   <w:style w:type="table" w:default="1" w:styleId="TableNormal">
@@ -11404,6 +11897,11 @@
       <w:szCs w:val="20"/>
     </w:rPr>
   </w:style>
+  <w:style w:type="character" w:customStyle="1" w:styleId="gntyacmba4b">
+    <w:name w:val="gntyacmba4b"/>
+    <w:basedOn w:val="DefaultParagraphFont"/>
+    <w:rsid w:val="0062528B"/>
+  </w:style>
 </w:styles>
 </file>
 

</xml_diff>

<commit_message>
Updated dollars, added USRAP suspension policy relavance
</commit_message>
<xml_diff>
--- a/writings/North_American_Refugee/North American Refuge - jl.docx
+++ b/writings/North_American_Refugee/North American Refuge - jl.docx
@@ -62,35 +62,88 @@
           <w:i/>
           <w:iCs/>
         </w:rPr>
-        <w:t xml:space="preserve">This paper compares refugee resettlement outcomes in the United States and Canada, focusing on public assistance usage. Using data from the U.S. Annual Survey of Refugees and Canada’s Longitudinal Immigration DataBase, I compare the effectiveness of </w:t>
-      </w:r>
+        <w:t xml:space="preserve">This paper compares refugee resettlement outcomes in the United States and Canada, focusing on public assistance usage. Using data from the U.S. Annual Survey of Refugees and Canada’s Longitudinal Immigration </w:t>
+      </w:r>
+      <w:proofErr w:type="spellStart"/>
       <w:r>
         <w:rPr>
           <w:i/>
           <w:iCs/>
         </w:rPr>
-        <w:t>private groups</w:t>
-      </w:r>
+        <w:t>DataBase</w:t>
+      </w:r>
+      <w:proofErr w:type="spellEnd"/>
       <w:r>
         <w:rPr>
           <w:i/>
           <w:iCs/>
         </w:rPr>
-        <w:t>, government-directed-nonprofit-implemented, and a blend of government and private resettlement systems. The findings indicate that government-assisted refugees in both countries have similar public assistance usage rates, with an average 2.24 percentage point difference at the end of five years. Government-led programs in both countries had the highest rates of public assistance use. Canada’s private sponsorship resettlement program shows the lowest public assistance rates. A gender gap exists, with female-headed households more likely to use public assistance. The U.S. achieves comparable outcomes to Canada despite typically investing less in resettlement per household. These results suggest that the structure of resettlement programs, especially the private sponsorship program in Canada, plays a crucial role in refugee integration and short-term public assistance reliance. This is an encouraging</w:t>
+        <w:t xml:space="preserve">, I compare the effectiveness of </w:t>
       </w:r>
       <w:r>
         <w:rPr>
           <w:i/>
           <w:iCs/>
         </w:rPr>
-        <w:t xml:space="preserve"> and timely</w:t>
+        <w:t>private groups</w:t>
       </w:r>
       <w:r>
         <w:rPr>
           <w:i/>
           <w:iCs/>
         </w:rPr>
-        <w:t xml:space="preserve"> finding for the recent launch of the American private resettlement system based on the Canadian model: the Welcome Corps.</w:t>
+        <w:t xml:space="preserve">, government-directed-nonprofit-implemented, and a blend of government and private resettlement systems. The findings indicate that government-assisted refugees in both countries have similar public assistance usage rates, with an average 2.24 percentage point difference at the end of five years. Government-led programs in both countries had the highest rates of public assistance use. Canada’s private sponsorship resettlement program shows the lowest public assistance rates. A gender gap exists, with female-headed households more likely to use public assistance. The U.S. achieves comparable outcomes to Canada despite typically investing less in resettlement per household. These results suggest that the structure of resettlement programs, especially the private sponsorship program in Canada, plays a crucial role in refugee integration and short-term public assistance reliance. This is </w:t>
+      </w:r>
+      <w:proofErr w:type="gramStart"/>
+      <w:r>
+        <w:rPr>
+          <w:i/>
+          <w:iCs/>
+        </w:rPr>
+        <w:t>an</w:t>
+      </w:r>
+      <w:proofErr w:type="gramEnd"/>
+      <w:r>
+        <w:rPr>
+          <w:i/>
+          <w:iCs/>
+        </w:rPr>
+        <w:t xml:space="preserve"> </w:t>
+      </w:r>
+      <w:r>
+        <w:rPr>
+          <w:i/>
+          <w:iCs/>
+        </w:rPr>
+        <w:t>timely</w:t>
+      </w:r>
+      <w:r>
+        <w:rPr>
+          <w:i/>
+          <w:iCs/>
+        </w:rPr>
+        <w:t xml:space="preserve"> and pertinent</w:t>
+      </w:r>
+      <w:r>
+        <w:rPr>
+          <w:i/>
+          <w:iCs/>
+        </w:rPr>
+        <w:t xml:space="preserve"> finding for the recent </w:t>
+      </w:r>
+      <w:r>
+        <w:rPr>
+          <w:i/>
+          <w:iCs/>
+        </w:rPr>
+        <w:t>suspension and review</w:t>
+      </w:r>
+      <w:r>
+        <w:rPr>
+          <w:i/>
+          <w:iCs/>
+        </w:rPr>
+        <w:t xml:space="preserve"> of the American private resettlement system based on the Canadian model: the Welcome Corps.</w:t>
       </w:r>
     </w:p>
     <w:p>
@@ -701,7 +754,33 @@
         <w:rPr>
           <w:rFonts w:ascii="Times New Roman" w:hAnsi="Times New Roman" w:cs="Times New Roman"/>
         </w:rPr>
-        <w:t>I use the Annual Survey of Refugees to obtain estimates for refugees resettled to the United States. This survey samples refugees who arrived in the past five years and has publicly available data for years 2016-2020. I obtain the complementary Canadian refugee cohorts from the Longitudinal Immigration DataBase along with information on program funding available from U.S. and Canadian government expenditure reports.</w:t>
+        <w:t xml:space="preserve">I use the Annual Survey of Refugees to obtain estimates for refugees resettled to the United States. This survey samples refugees who arrived in the past five years and has publicly available data for years 2016-2020. I obtain the complementary Canadian refugee cohorts from the </w:t>
+      </w:r>
+      <w:r>
+        <w:rPr>
+          <w:rFonts w:ascii="Times New Roman" w:hAnsi="Times New Roman" w:cs="Times New Roman"/>
+        </w:rPr>
+        <w:t>l</w:t>
+      </w:r>
+      <w:r>
+        <w:rPr>
+          <w:rFonts w:ascii="Times New Roman" w:hAnsi="Times New Roman" w:cs="Times New Roman"/>
+        </w:rPr>
+        <w:t xml:space="preserve">ongitudinal Immigration </w:t>
+      </w:r>
+      <w:proofErr w:type="spellStart"/>
+      <w:r>
+        <w:rPr>
+          <w:rFonts w:ascii="Times New Roman" w:hAnsi="Times New Roman" w:cs="Times New Roman"/>
+        </w:rPr>
+        <w:t>DataBase</w:t>
+      </w:r>
+      <w:proofErr w:type="spellEnd"/>
+      <w:r>
+        <w:rPr>
+          <w:rFonts w:ascii="Times New Roman" w:hAnsi="Times New Roman" w:cs="Times New Roman"/>
+        </w:rPr>
+        <w:t xml:space="preserve"> along with information on program funding available from U.S. and Canadian government expenditure reports.</w:t>
       </w:r>
       <w:commentRangeStart w:id="1"/>
       <w:commentRangeEnd w:id="1"/>
@@ -1012,15 +1091,88 @@
     <w:p>
       <w:pPr>
         <w:spacing w:line="480" w:lineRule="auto"/>
-        <w:rPr>
-          <w:rFonts w:ascii="Times New Roman" w:hAnsi="Times New Roman" w:cs="Times New Roman"/>
-        </w:rPr>
-      </w:pPr>
-      <w:r>
-        <w:rPr>
-          <w:rFonts w:ascii="Times New Roman" w:hAnsi="Times New Roman" w:cs="Times New Roman"/>
-        </w:rPr>
-        <w:t>BACKGROUND</w:t>
+        <w:ind w:firstLine="720"/>
+        <w:rPr>
+          <w:rFonts w:ascii="Times New Roman" w:hAnsi="Times New Roman" w:cs="Times New Roman"/>
+        </w:rPr>
+      </w:pPr>
+      <w:r>
+        <w:rPr>
+          <w:rFonts w:ascii="Times New Roman" w:hAnsi="Times New Roman" w:cs="Times New Roman"/>
+        </w:rPr>
+        <w:t>The Trump administration recently suspended the U.S. Refugee Admissions Program to review whether its existence is aligned with U.S. interests</w:t>
+      </w:r>
+      <w:r>
+        <w:rPr>
+          <w:rFonts w:ascii="Times New Roman" w:hAnsi="Times New Roman" w:cs="Times New Roman"/>
+        </w:rPr>
+        <w:t xml:space="preserve"> </w:t>
+      </w:r>
+      <w:r>
+        <w:rPr>
+          <w:rFonts w:ascii="Times New Roman" w:hAnsi="Times New Roman" w:cs="Times New Roman"/>
+        </w:rPr>
+        <w:fldChar w:fldCharType="begin"/>
+      </w:r>
+      <w:r>
+        <w:rPr>
+          <w:rFonts w:ascii="Times New Roman" w:hAnsi="Times New Roman" w:cs="Times New Roman"/>
+        </w:rPr>
+        <w:instrText xml:space="preserve"> ADDIN ZOTERO_ITEM CSL_CITATION {"citationID":"4FWuY6K7","properties":{"formattedCitation":"(The White House 2025)","plainCitation":"(The White House 2025)","noteIndex":0},"citationItems":[{"id":1374,"uris":["http://zotero.org/users/6152647/items/7VEVPZLJ"],"itemData":{"id":1374,"type":"webpage","abstract":"REALIGNING THE United States REFUGEE ADMISSIONS PROGRAM By the authority vested in me as President by the Constitution and the laws of the United States","container-title":"The White House","language":"en-US","title":"Realigning the United States Refugee Admissions Program","URL":"https://www.whitehouse.gov/presidential-actions/2025/01/realigning-the-united-states-refugee-admissions-program/","author":[{"literal":"The White House"}],"accessed":{"date-parts":[["2025",1,24]]},"issued":{"date-parts":[["2025",1,21]]}}}],"schema":"https://github.com/citation-style-language/schema/raw/master/csl-citation.json"} </w:instrText>
+      </w:r>
+      <w:r>
+        <w:rPr>
+          <w:rFonts w:ascii="Times New Roman" w:hAnsi="Times New Roman" w:cs="Times New Roman"/>
+        </w:rPr>
+        <w:fldChar w:fldCharType="separate"/>
+      </w:r>
+      <w:r>
+        <w:rPr>
+          <w:rFonts w:ascii="Times New Roman" w:hAnsi="Times New Roman" w:cs="Times New Roman"/>
+        </w:rPr>
+        <w:t>(The White House 2025)</w:t>
+      </w:r>
+      <w:r>
+        <w:rPr>
+          <w:rFonts w:ascii="Times New Roman" w:hAnsi="Times New Roman" w:cs="Times New Roman"/>
+        </w:rPr>
+        <w:fldChar w:fldCharType="end"/>
+      </w:r>
+      <w:r>
+        <w:rPr>
+          <w:rFonts w:ascii="Times New Roman" w:hAnsi="Times New Roman" w:cs="Times New Roman"/>
+        </w:rPr>
+        <w:t xml:space="preserve">. The U.S. </w:t>
+      </w:r>
+      <w:r>
+        <w:rPr>
+          <w:rFonts w:ascii="Times New Roman" w:hAnsi="Times New Roman" w:cs="Times New Roman"/>
+        </w:rPr>
+        <w:t xml:space="preserve">government-led </w:t>
+      </w:r>
+      <w:r>
+        <w:rPr>
+          <w:rFonts w:ascii="Times New Roman" w:hAnsi="Times New Roman" w:cs="Times New Roman"/>
+        </w:rPr>
+        <w:t>resettlement system is</w:t>
+      </w:r>
+      <w:r>
+        <w:rPr>
+          <w:rFonts w:ascii="Times New Roman" w:hAnsi="Times New Roman" w:cs="Times New Roman"/>
+        </w:rPr>
+        <w:t xml:space="preserve"> often the</w:t>
+      </w:r>
+      <w:r>
+        <w:rPr>
+          <w:rFonts w:ascii="Times New Roman" w:hAnsi="Times New Roman" w:cs="Times New Roman"/>
+        </w:rPr>
+        <w:t xml:space="preserve"> largest and most efficient resettlement program in the world. The U.S. Welcome Corps, based on the Canadian private-led program, is likely even more efficient in conserving tax dollars and</w:t>
+      </w:r>
+      <w:r>
+        <w:rPr>
+          <w:rFonts w:ascii="Times New Roman" w:hAnsi="Times New Roman" w:cs="Times New Roman"/>
+        </w:rPr>
+        <w:t xml:space="preserve"> helping refugees become independent contributors to the tax base and their communities. </w:t>
       </w:r>
     </w:p>
     <w:p>
@@ -1028,6 +1180,21 @@
         <w:spacing w:line="480" w:lineRule="auto"/>
         <w:rPr>
           <w:rFonts w:ascii="Times New Roman" w:hAnsi="Times New Roman" w:cs="Times New Roman"/>
+        </w:rPr>
+      </w:pPr>
+      <w:r>
+        <w:rPr>
+          <w:rFonts w:ascii="Times New Roman" w:hAnsi="Times New Roman" w:cs="Times New Roman"/>
+        </w:rPr>
+        <w:lastRenderedPageBreak/>
+        <w:t>BACKGROUND</w:t>
+      </w:r>
+    </w:p>
+    <w:p>
+      <w:pPr>
+        <w:spacing w:line="480" w:lineRule="auto"/>
+        <w:rPr>
+          <w:rFonts w:ascii="Times New Roman" w:hAnsi="Times New Roman" w:cs="Times New Roman"/>
           <w:i/>
           <w:iCs/>
         </w:rPr>
@@ -1097,14 +1264,7 @@
         <w:rPr>
           <w:rFonts w:ascii="Times New Roman" w:hAnsi="Times New Roman" w:cs="Times New Roman"/>
         </w:rPr>
-        <w:t xml:space="preserve">resettlement agencies focus on assisting refugees to achieve </w:t>
-      </w:r>
-      <w:r>
-        <w:rPr>
-          <w:rFonts w:ascii="Times New Roman" w:hAnsi="Times New Roman" w:cs="Times New Roman"/>
-        </w:rPr>
-        <w:lastRenderedPageBreak/>
-        <w:t>economic self-sufficiency</w:t>
+        <w:t>resettlement agencies focus on assisting refugees to achieve economic self-sufficiency</w:t>
       </w:r>
       <w:r>
         <w:rPr>
@@ -1590,7 +1750,14 @@
         <w:rPr>
           <w:rFonts w:ascii="Times New Roman" w:hAnsi="Times New Roman" w:cs="Times New Roman"/>
         </w:rPr>
-        <w:t xml:space="preserve"> unable or unwilling to support </w:t>
+        <w:t xml:space="preserve"> unable or </w:t>
+      </w:r>
+      <w:r>
+        <w:rPr>
+          <w:rFonts w:ascii="Times New Roman" w:hAnsi="Times New Roman" w:cs="Times New Roman"/>
+        </w:rPr>
+        <w:lastRenderedPageBreak/>
+        <w:t xml:space="preserve">unwilling to support </w:t>
       </w:r>
       <w:r>
         <w:rPr>
@@ -1839,14 +2006,7 @@
         <w:rPr>
           <w:rFonts w:ascii="Times New Roman" w:hAnsi="Times New Roman" w:cs="Times New Roman"/>
         </w:rPr>
-        <w:t xml:space="preserve">, </w:t>
-      </w:r>
-      <w:r>
-        <w:rPr>
-          <w:rFonts w:ascii="Times New Roman" w:hAnsi="Times New Roman" w:cs="Times New Roman"/>
-        </w:rPr>
-        <w:lastRenderedPageBreak/>
-        <w:t xml:space="preserve">thereby improving the match </w:t>
+        <w:t xml:space="preserve">, thereby improving the match </w:t>
       </w:r>
       <w:r>
         <w:rPr>
@@ -2396,7 +2556,14 @@
         <w:rPr>
           <w:rFonts w:ascii="Times New Roman" w:hAnsi="Times New Roman" w:cs="Times New Roman"/>
         </w:rPr>
-        <w:t>outcomes to natives, like employment</w:t>
+        <w:t xml:space="preserve">outcomes </w:t>
+      </w:r>
+      <w:r>
+        <w:rPr>
+          <w:rFonts w:ascii="Times New Roman" w:hAnsi="Times New Roman" w:cs="Times New Roman"/>
+        </w:rPr>
+        <w:lastRenderedPageBreak/>
+        <w:t>to natives, like employment</w:t>
       </w:r>
       <w:r>
         <w:rPr>
@@ -2477,14 +2644,7 @@
         <w:rPr>
           <w:rFonts w:ascii="Times New Roman" w:hAnsi="Times New Roman" w:cs="Times New Roman"/>
         </w:rPr>
-        <w:t xml:space="preserve"> different results. These comparisons then </w:t>
-      </w:r>
-      <w:r>
-        <w:rPr>
-          <w:rFonts w:ascii="Times New Roman" w:hAnsi="Times New Roman" w:cs="Times New Roman"/>
-        </w:rPr>
-        <w:lastRenderedPageBreak/>
-        <w:t xml:space="preserve">allow us to explore why certain </w:t>
+        <w:t xml:space="preserve"> different results. These comparisons then allow us to explore why certain </w:t>
       </w:r>
       <w:r>
         <w:rPr>
@@ -2802,7 +2962,14 @@
         <w:rPr>
           <w:rFonts w:ascii="Times New Roman" w:hAnsi="Times New Roman" w:cs="Times New Roman"/>
         </w:rPr>
-        <w:t xml:space="preserve">World Council of Churches, </w:t>
+        <w:t xml:space="preserve">World Council of </w:t>
+      </w:r>
+      <w:r>
+        <w:rPr>
+          <w:rFonts w:ascii="Times New Roman" w:hAnsi="Times New Roman" w:cs="Times New Roman"/>
+        </w:rPr>
+        <w:lastRenderedPageBreak/>
+        <w:t xml:space="preserve">Churches, </w:t>
       </w:r>
       <w:r>
         <w:rPr>
@@ -2913,6 +3080,12 @@
         <w:rPr>
           <w:rFonts w:ascii="Times New Roman" w:hAnsi="Times New Roman" w:cs="Times New Roman"/>
         </w:rPr>
+        <w:t xml:space="preserve"> broad</w:t>
+      </w:r>
+      <w:r>
+        <w:rPr>
+          <w:rFonts w:ascii="Times New Roman" w:hAnsi="Times New Roman" w:cs="Times New Roman"/>
+        </w:rPr>
         <w:t xml:space="preserve"> overlap, especially in</w:t>
       </w:r>
       <w:r>
@@ -2925,14 +3098,7 @@
         <w:rPr>
           <w:rFonts w:ascii="Times New Roman" w:hAnsi="Times New Roman" w:cs="Times New Roman"/>
         </w:rPr>
-        <w:t xml:space="preserve"> </w:t>
-      </w:r>
-      <w:r>
-        <w:rPr>
-          <w:rFonts w:ascii="Times New Roman" w:hAnsi="Times New Roman" w:cs="Times New Roman"/>
-        </w:rPr>
-        <w:lastRenderedPageBreak/>
-        <w:t xml:space="preserve">resettlement partners, </w:t>
+        <w:t xml:space="preserve"> resettlement partners, </w:t>
       </w:r>
       <w:r>
         <w:rPr>
@@ -3287,6 +3453,7 @@
         <w:rPr>
           <w:rFonts w:ascii="Times New Roman" w:hAnsi="Times New Roman" w:cs="Times New Roman"/>
         </w:rPr>
+        <w:lastRenderedPageBreak/>
         <w:tab/>
         <w:t xml:space="preserve">There are a few </w:t>
       </w:r>
@@ -3432,14 +3599,7 @@
         <w:rPr>
           <w:rFonts w:ascii="Times New Roman" w:hAnsi="Times New Roman" w:cs="Times New Roman"/>
         </w:rPr>
-        <w:t xml:space="preserve">, </w:t>
-      </w:r>
-      <w:r>
-        <w:rPr>
-          <w:rFonts w:ascii="Times New Roman" w:hAnsi="Times New Roman" w:cs="Times New Roman"/>
-        </w:rPr>
-        <w:lastRenderedPageBreak/>
-        <w:t xml:space="preserve">which may result in unintended consequences </w:t>
+        <w:t xml:space="preserve">, which may result in unintended consequences </w:t>
       </w:r>
       <w:r>
         <w:rPr>
@@ -3469,7 +3629,7 @@
         <w:rPr>
           <w:rFonts w:ascii="Times New Roman" w:hAnsi="Times New Roman" w:cs="Times New Roman"/>
         </w:rPr>
-        <w:instrText xml:space="preserve"> ADDIN ZOTERO_ITEM CSL_CITATION {"citationID":"eVZipgEk","properties":{"formattedCitation":"(Coyne 2013; Lavoie 2016)","plainCitation":"(Coyne 2013; Lavoie 2016)","noteIndex":0},"citationItems":[{"id":"gPO8l3UR/4YhStm8K","uris":["http://zotero.org/users/6152647/items/ZRS3JPWR"],"itemData":{"id":1354,"type":"book","abstract":"In 2010, Haiti was ravaged by a brutal earthquake that affected the lives of millions. The call to assist those in need was heard around the globe. Yet two years later humanitarian efforts led by governments and NGOs have largely failed. Resources are not reaching the needy due to bureaucratic red tape, and many assets have been squandered. How can efforts intended to help the suffering fail so badly? In this timely and provocative book, Christopher J. Coyne uses the economic way of thinking to explain why this and other humanitarian efforts that intend to do good end up doing nothing or causing harm. In addition to Haiti, Coyne considers a wide range of interventions. He explains why the U.S. government was ineffective following Hurricane Katrina, why the international humanitarian push to remove Muammar Gaddafi in Libya may very well end up causing more problems than prosperity, and why decades of efforts to respond to crises and foster development around the world have resulted in repeated failures. In place of the dominant approach to state-led humanitarian action, this book offers a bold alternative, focused on establishing an environment of economic freedom. If we are willing to experiment with aid—asking questions about how to foster development as a process of societal discovery, or how else we might engage the private sector, for instance—we increase the range of alternatives to help people and empower them to improve their communities. Anyone concerned with and dedicated to alleviating human suffering in the short term or for the long haul, from policymakers and activists to scholars, will find this book to be an insightful and provocative reframing of humanitarian action.","edition":"First Edition","event-place":"Stanford (Calif.)","ISBN":"978-0-8047-7228-0","language":"English","number-of-pages":"272","publisher":"Stanford University Press","publisher-place":"Stanford (Calif.)","source":"Amazon","title":"Doing Bad by Doing Good: Why Humanitarian Action Fails","title-short":"Doing Bad by Doing Good","author":[{"family":"Coyne","given":"Christopher J."}],"issued":{"date-parts":[["2013",5,1]]}}},{"id":1356,"uris":["http://zotero.org/users/6152647/items/ZNPR2W43"],"itemData":{"id":1356,"type":"book","abstract":"Can a “radical free-market” economy help to end poverty and militarism while avoiding the quagmire of central planning? Don Lavoie makes a strong case that it can in National Economic Planning: What Is Left? Avoiding the conventional pitfalls of the Right and the Left, Lavoie argues with a strong social consciousness that liberal and radical arguments for national economic planning fail to solve the basic problem of coordinating knowledge in society. He shows how decentralized markets solve this problem, while no means exist for a central planner to elicit the information needed to coordinate a complex, interrelated economy. National Economic Planning: What Is Left? begins by showing why there is a need for a scientific-radical perspective and why central planning is not the answer. The author systematically and thoroughly critiques Far Left and Marxist positions, as well as the more popular views of macroeconomic planning, economic democracy, and industrial policy. Lavoie’s premise is that economic planning is not a rationally organized, objective system but rather a dynamic process with only very subjective means for determining which product is “best” or preferred by the consumer. The arbiter for “what is best?” must be free-market competition and not a centralized planner. Planning can do nothing but disrupt social and economic coordination and worsen the serious problems of modern economies. Constantly sensitive to the social concerns that have inspired “radicals” from Thomas Jefferson to Karl Marx, Lavoie demonstrates where and why the traditional policies of the Left have failed, why today’s liberal and neoconservative variations on economic planning cannot accomplish their goals, and what alternative policies can produce progressive social change in a prosperous and growing economy. Economic planning, Lavoie contends, is an unworkable and ultimately reactionary policy that must be rejected by the Left if radicals seek to offer real solutions to pressing social problems. This book challenges radicals—and their critics—to begin reformulating their whole conception of progressive economic change without reliance on central planning. National Economic Planning: What Is Left? is as comprehensive as it is controversial. Written for lay readers as well as economists and social analysts, its arguments rely as heavily on common sense as they do on scientific method and will challenge thinkers and policymakers of every political persuasion. Praise for the Book“Don Lavoie’s book will serve a very important function. After more than fifty years of discussion in which the socialists at first just would not listen, their position has now collapsed. Yet this long discussion was not without benefits. We have learnt much from this resistance to seeing the truth, and we shall also learn much from studying this systematic exposition of the present state of our knowledge of the problems.” —F. A. Hayek, Nobel laureate“Lavoie’s superb study develops an immensely powerful case for the irrationality of national economic planning. It is distinctive in showing that conventional ideas of economic planning depend upon conceptions of human knowledge that are philosophically untenable. It will be of great interest to economists, political scientists, philosophers, and all those concerned with current trends in public policy.” —John Gray, Oxford University","edition":"1st edition","event-place":"Arlington, Virginia","ISBN":"978-1-942951-26-1","language":"English","number-of-pages":"322","publisher":"Mercatus Center at George Mason University","publisher-place":"Arlington, Virginia","source":"Amazon","title":"National Economic Planning: What Is Left?","title-short":"National Economic Planning","author":[{"family":"Lavoie","given":"Don"}],"issued":{"date-parts":[["2016",8,5]]}}}],"schema":"https://github.com/citation-style-language/schema/raw/master/csl-citation.json"} </w:instrText>
+        <w:instrText xml:space="preserve"> ADDIN ZOTERO_ITEM CSL_CITATION {"citationID":"eVZipgEk","properties":{"formattedCitation":"(Coyne 2013; Lavoie 2016)","plainCitation":"(Coyne 2013; Lavoie 2016)","noteIndex":0},"citationItems":[{"id":"qFr1r8fZ/EF7fNnck","uris":["http://zotero.org/users/6152647/items/ZRS3JPWR"],"itemData":{"id":1354,"type":"book","abstract":"In 2010, Haiti was ravaged by a brutal earthquake that affected the lives of millions. The call to assist those in need was heard around the globe. Yet two years later humanitarian efforts led by governments and NGOs have largely failed. Resources are not reaching the needy due to bureaucratic red tape, and many assets have been squandered. How can efforts intended to help the suffering fail so badly? In this timely and provocative book, Christopher J. Coyne uses the economic way of thinking to explain why this and other humanitarian efforts that intend to do good end up doing nothing or causing harm. In addition to Haiti, Coyne considers a wide range of interventions. He explains why the U.S. government was ineffective following Hurricane Katrina, why the international humanitarian push to remove Muammar Gaddafi in Libya may very well end up causing more problems than prosperity, and why decades of efforts to respond to crises and foster development around the world have resulted in repeated failures. In place of the dominant approach to state-led humanitarian action, this book offers a bold alternative, focused on establishing an environment of economic freedom. If we are willing to experiment with aid—asking questions about how to foster development as a process of societal discovery, or how else we might engage the private sector, for instance—we increase the range of alternatives to help people and empower them to improve their communities. Anyone concerned with and dedicated to alleviating human suffering in the short term or for the long haul, from policymakers and activists to scholars, will find this book to be an insightful and provocative reframing of humanitarian action.","edition":"First Edition","event-place":"Stanford (Calif.)","ISBN":"978-0-8047-7228-0","language":"English","number-of-pages":"272","publisher":"Stanford University Press","publisher-place":"Stanford (Calif.)","source":"Amazon","title":"Doing Bad by Doing Good: Why Humanitarian Action Fails","title-short":"Doing Bad by Doing Good","author":[{"family":"Coyne","given":"Christopher J."}],"issued":{"date-parts":[["2013",5,1]]}}},{"id":1356,"uris":["http://zotero.org/users/6152647/items/ZNPR2W43"],"itemData":{"id":1356,"type":"book","abstract":"Can a “radical free-market” economy help to end poverty and militarism while avoiding the quagmire of central planning? Don Lavoie makes a strong case that it can in National Economic Planning: What Is Left? Avoiding the conventional pitfalls of the Right and the Left, Lavoie argues with a strong social consciousness that liberal and radical arguments for national economic planning fail to solve the basic problem of coordinating knowledge in society. He shows how decentralized markets solve this problem, while no means exist for a central planner to elicit the information needed to coordinate a complex, interrelated economy. National Economic Planning: What Is Left? begins by showing why there is a need for a scientific-radical perspective and why central planning is not the answer. The author systematically and thoroughly critiques Far Left and Marxist positions, as well as the more popular views of macroeconomic planning, economic democracy, and industrial policy. Lavoie’s premise is that economic planning is not a rationally organized, objective system but rather a dynamic process with only very subjective means for determining which product is “best” or preferred by the consumer. The arbiter for “what is best?” must be free-market competition and not a centralized planner. Planning can do nothing but disrupt social and economic coordination and worsen the serious problems of modern economies. Constantly sensitive to the social concerns that have inspired “radicals” from Thomas Jefferson to Karl Marx, Lavoie demonstrates where and why the traditional policies of the Left have failed, why today’s liberal and neoconservative variations on economic planning cannot accomplish their goals, and what alternative policies can produce progressive social change in a prosperous and growing economy. Economic planning, Lavoie contends, is an unworkable and ultimately reactionary policy that must be rejected by the Left if radicals seek to offer real solutions to pressing social problems. This book challenges radicals—and their critics—to begin reformulating their whole conception of progressive economic change without reliance on central planning. National Economic Planning: What Is Left? is as comprehensive as it is controversial. Written for lay readers as well as economists and social analysts, its arguments rely as heavily on common sense as they do on scientific method and will challenge thinkers and policymakers of every political persuasion. Praise for the Book“Don Lavoie’s book will serve a very important function. After more than fifty years of discussion in which the socialists at first just would not listen, their position has now collapsed. Yet this long discussion was not without benefits. We have learnt much from this resistance to seeing the truth, and we shall also learn much from studying this systematic exposition of the present state of our knowledge of the problems.” —F. A. Hayek, Nobel laureate“Lavoie’s superb study develops an immensely powerful case for the irrationality of national economic planning. It is distinctive in showing that conventional ideas of economic planning depend upon conceptions of human knowledge that are philosophically untenable. It will be of great interest to economists, political scientists, philosophers, and all those concerned with current trends in public policy.” —John Gray, Oxford University","edition":"1st edition","event-place":"Arlington, Virginia","ISBN":"978-1-942951-26-1","language":"English","number-of-pages":"322","publisher":"Mercatus Center at George Mason University","publisher-place":"Arlington, Virginia","source":"Amazon","title":"National Economic Planning: What Is Left?","title-short":"National Economic Planning","author":[{"family":"Lavoie","given":"Don"}],"issued":{"date-parts":[["2016",8,5]]}}}],"schema":"https://github.com/citation-style-language/schema/raw/master/csl-citation.json"} </w:instrText>
       </w:r>
       <w:r>
         <w:rPr>
@@ -3650,7 +3810,14 @@
         <w:rPr>
           <w:rFonts w:ascii="Times New Roman" w:hAnsi="Times New Roman" w:cs="Times New Roman"/>
         </w:rPr>
-        <w:t xml:space="preserve">, but likely over- and under- identifies refugees. The over-identification problem occurs when the small number of migrants from a refugee-imputed arrival-year/sending-country pair are erroneously labeled as refugees when they come through a different process. The under-identification problem arises when refugee generating events do not cover a large enough proportion of out-migrants to meet the arbitrary threshold picked by the researcher. </w:t>
+        <w:t xml:space="preserve">, but likely over- and under- identifies refugees. The over-identification problem occurs when the small number of migrants from a refugee-imputed arrival-year/sending-country pair are erroneously labeled as refugees </w:t>
+      </w:r>
+      <w:r>
+        <w:rPr>
+          <w:rFonts w:ascii="Times New Roman" w:hAnsi="Times New Roman" w:cs="Times New Roman"/>
+        </w:rPr>
+        <w:lastRenderedPageBreak/>
+        <w:t xml:space="preserve">when they come through a different process. The under-identification problem arises when refugee generating events do not cover a large enough proportion of out-migrants to meet the arbitrary threshold picked by the researcher. </w:t>
       </w:r>
     </w:p>
     <w:p>
@@ -3665,14 +3832,7 @@
         <w:rPr>
           <w:rFonts w:ascii="Times New Roman" w:hAnsi="Times New Roman" w:cs="Times New Roman"/>
         </w:rPr>
-        <w:t xml:space="preserve">There is a large dataset that identifies refugees perfectly: the New Immigrant Survey. The main drawback is that the full-cohort survey is only administered twice, both times in 2003. The </w:t>
-      </w:r>
-      <w:r>
-        <w:rPr>
-          <w:rFonts w:ascii="Times New Roman" w:hAnsi="Times New Roman" w:cs="Times New Roman"/>
-        </w:rPr>
-        <w:lastRenderedPageBreak/>
-        <w:t xml:space="preserve">ACS and the New Immigrant Survey are the only national level general datasets with large enough samples for refugee analyses I am aware of </w:t>
+        <w:t xml:space="preserve">There is a large dataset that identifies refugees perfectly: the New Immigrant Survey. The main drawback is that the full-cohort survey is only administered twice, both times in 2003. The ACS and the New Immigrant Survey are the only national level general datasets with large enough samples for refugee analyses I am aware of </w:t>
       </w:r>
       <w:r>
         <w:rPr>
@@ -3768,7 +3928,49 @@
         <w:rPr>
           <w:rFonts w:ascii="Times New Roman" w:hAnsi="Times New Roman" w:cs="Times New Roman"/>
         </w:rPr>
-        <w:t xml:space="preserve"> a census of every migrant, including refugees in their longitudinal iMmigration DataBase (lMDB)</w:t>
+        <w:t xml:space="preserve"> a census of every migrant, including refugees in their longitudinal </w:t>
+      </w:r>
+      <w:proofErr w:type="spellStart"/>
+      <w:r>
+        <w:rPr>
+          <w:rFonts w:ascii="Times New Roman" w:hAnsi="Times New Roman" w:cs="Times New Roman"/>
+        </w:rPr>
+        <w:t>iMmigration</w:t>
+      </w:r>
+      <w:proofErr w:type="spellEnd"/>
+      <w:r>
+        <w:rPr>
+          <w:rFonts w:ascii="Times New Roman" w:hAnsi="Times New Roman" w:cs="Times New Roman"/>
+        </w:rPr>
+        <w:t xml:space="preserve"> </w:t>
+      </w:r>
+      <w:proofErr w:type="spellStart"/>
+      <w:r>
+        <w:rPr>
+          <w:rFonts w:ascii="Times New Roman" w:hAnsi="Times New Roman" w:cs="Times New Roman"/>
+        </w:rPr>
+        <w:t>DataBase</w:t>
+      </w:r>
+      <w:proofErr w:type="spellEnd"/>
+      <w:r>
+        <w:rPr>
+          <w:rFonts w:ascii="Times New Roman" w:hAnsi="Times New Roman" w:cs="Times New Roman"/>
+        </w:rPr>
+        <w:t xml:space="preserve"> (</w:t>
+      </w:r>
+      <w:proofErr w:type="spellStart"/>
+      <w:r>
+        <w:rPr>
+          <w:rFonts w:ascii="Times New Roman" w:hAnsi="Times New Roman" w:cs="Times New Roman"/>
+        </w:rPr>
+        <w:t>lMDB</w:t>
+      </w:r>
+      <w:proofErr w:type="spellEnd"/>
+      <w:r>
+        <w:rPr>
+          <w:rFonts w:ascii="Times New Roman" w:hAnsi="Times New Roman" w:cs="Times New Roman"/>
+        </w:rPr>
+        <w:t>)</w:t>
       </w:r>
       <w:r>
         <w:rPr>
@@ -3868,6 +4070,7 @@
         <w:rPr>
           <w:rFonts w:ascii="Times New Roman" w:hAnsi="Times New Roman" w:cs="Times New Roman"/>
         </w:rPr>
+        <w:lastRenderedPageBreak/>
         <w:t>For the U.S. data, I</w:t>
       </w:r>
       <w:r>
@@ -3943,7 +4146,6 @@
         <w:rPr>
           <w:rFonts w:ascii="Times New Roman" w:hAnsi="Times New Roman" w:cs="Times New Roman"/>
         </w:rPr>
-        <w:lastRenderedPageBreak/>
         <w:t xml:space="preserve">The Canadian data come </w:t>
       </w:r>
       <w:r>
@@ -3958,6 +4160,7 @@
         </w:rPr>
         <w:t xml:space="preserve">the </w:t>
       </w:r>
+      <w:proofErr w:type="spellStart"/>
       <w:r>
         <w:rPr>
           <w:rFonts w:ascii="Times New Roman" w:hAnsi="Times New Roman" w:cs="Times New Roman"/>
@@ -3970,6 +4173,7 @@
         </w:rPr>
         <w:t>MDB</w:t>
       </w:r>
+      <w:proofErr w:type="spellEnd"/>
       <w:r>
         <w:rPr>
           <w:rFonts w:ascii="Times New Roman" w:hAnsi="Times New Roman" w:cs="Times New Roman"/>
@@ -4415,7 +4619,20 @@
         <w:rPr>
           <w:rFonts w:ascii="Times New Roman" w:hAnsi="Times New Roman" w:cs="Times New Roman"/>
         </w:rPr>
-        <w:t>I convert the Canadian and United States dollars to a 2016 U.S. dollar for presentation. I use the Bureau of Labor Statistic</w:t>
+        <w:lastRenderedPageBreak/>
+        <w:t xml:space="preserve">I convert the Canadian and United States dollars to a 2016 U.S. dollar for </w:t>
+      </w:r>
+      <w:r>
+        <w:rPr>
+          <w:rFonts w:ascii="Times New Roman" w:hAnsi="Times New Roman" w:cs="Times New Roman"/>
+        </w:rPr>
+        <w:t>comparability</w:t>
+      </w:r>
+      <w:r>
+        <w:rPr>
+          <w:rFonts w:ascii="Times New Roman" w:hAnsi="Times New Roman" w:cs="Times New Roman"/>
+        </w:rPr>
+        <w:t>. I use the Bureau of Labor Statistic</w:t>
       </w:r>
       <w:r>
         <w:rPr>
@@ -4433,7 +4650,7 @@
         <w:rPr>
           <w:rFonts w:ascii="Times New Roman" w:hAnsi="Times New Roman" w:cs="Times New Roman"/>
         </w:rPr>
-        <w:instrText xml:space="preserve"> ADDIN ZOTERO_ITEM CSL_CITATION {"citationID":"5Lag33VT","properties":{"formattedCitation":"(Bureau of Labor Statistics 2024)","plainCitation":"(Bureau of Labor Statistics 2024)","noteIndex":0},"citationItems":[{"id":1373,"uris":["http://zotero.org/users/6152647/items/NX7M2GXE"],"itemData":{"id":1373,"type":"dataset","title":"Consumer Price Index for All Urban Consumers","URL":"https://data.bls.gov/timeseries/CUUR0000SA0","author":[{"literal":"Bureau of Labor Statistics"}],"issued":{"date-parts":[["2024"]]}}}],"schema":"https://github.com/citation-style-language/schema/raw/master/csl-citation.json"} </w:instrText>
+        <w:instrText xml:space="preserve"> ADDIN ZOTERO_ITEM CSL_CITATION {"citationID":"5Lag33VT","properties":{"formattedCitation":"(Bureau of Labor Statistics 2024)","plainCitation":"(Bureau of Labor Statistics 2024)","dontUpdate":true,"noteIndex":0},"citationItems":[{"id":1373,"uris":["http://zotero.org/users/6152647/items/NX7M2GXE"],"itemData":{"id":1373,"type":"dataset","title":"Consumer Price Index for All Urban Consumers","URL":"https://data.bls.gov/timeseries/CUUR0000SA0","author":[{"literal":"Bureau of Labor Statistics"}],"issued":{"date-parts":[["2024"]]}}}],"schema":"https://github.com/citation-style-language/schema/raw/master/csl-citation.json"} </w:instrText>
       </w:r>
       <w:r>
         <w:rPr>
@@ -4475,7 +4692,7 @@
         <w:rPr>
           <w:rFonts w:ascii="Times New Roman" w:hAnsi="Times New Roman" w:cs="Times New Roman"/>
         </w:rPr>
-        <w:instrText xml:space="preserve"> ADDIN ZOTERO_ITEM CSL_CITATION {"citationID":"5wJfDYGm","properties":{"formattedCitation":"(U.S. Department of the Treasury 2024)","plainCitation":"(U.S. Department of the Treasury 2024)","noteIndex":0},"citationItems":[{"id":1372,"uris":["http://zotero.org/users/6152647/items/D7FDZUQD"],"itemData":{"id":1372,"type":"dataset","title":"Treasury Reporting Rates of Exchange","URL":"https://fiscaldata.treasury.gov/datasets/treasury-reporting-rates-exchange/treasury-reporting-rates-of-exchange","author":[{"literal":"U.S. Department of the Treasury"}],"issued":{"date-parts":[["2024"]]}}}],"schema":"https://github.com/citation-style-language/schema/raw/master/csl-citation.json"} </w:instrText>
+        <w:instrText xml:space="preserve"> ADDIN ZOTERO_ITEM CSL_CITATION {"citationID":"5wJfDYGm","properties":{"formattedCitation":"(U.S. Department of the Treasury 2024)","plainCitation":"(U.S. Department of the Treasury 2024)","dontUpdate":true,"noteIndex":0},"citationItems":[{"id":1372,"uris":["http://zotero.org/users/6152647/items/D7FDZUQD"],"itemData":{"id":1372,"type":"dataset","title":"Treasury Reporting Rates of Exchange","URL":"https://fiscaldata.treasury.gov/datasets/treasury-reporting-rates-exchange/treasury-reporting-rates-of-exchange","author":[{"literal":"U.S. Department of the Treasury"}],"issued":{"date-parts":[["2024"]]}}}],"schema":"https://github.com/citation-style-language/schema/raw/master/csl-citation.json"} </w:instrText>
       </w:r>
       <w:r>
         <w:rPr>
@@ -4533,7 +4750,6 @@
             </w:rPr>
           </w:rPrChange>
         </w:rPr>
-        <w:lastRenderedPageBreak/>
         <w:t>Analytic Approach</w:t>
       </w:r>
     </w:p>
@@ -4663,7 +4879,21 @@
         <w:rPr>
           <w:rFonts w:ascii="Times New Roman" w:hAnsi="Times New Roman" w:cs="Times New Roman"/>
         </w:rPr>
-        <w:t>five year for</w:t>
+        <w:t xml:space="preserve">five </w:t>
+      </w:r>
+      <w:proofErr w:type="gramStart"/>
+      <w:r>
+        <w:rPr>
+          <w:rFonts w:ascii="Times New Roman" w:hAnsi="Times New Roman" w:cs="Times New Roman"/>
+        </w:rPr>
+        <w:t>year</w:t>
+      </w:r>
+      <w:proofErr w:type="gramEnd"/>
+      <w:r>
+        <w:rPr>
+          <w:rFonts w:ascii="Times New Roman" w:hAnsi="Times New Roman" w:cs="Times New Roman"/>
+        </w:rPr>
+        <w:t xml:space="preserve"> for</w:t>
       </w:r>
       <w:r>
         <w:rPr>
@@ -4713,6 +4943,7 @@
         </w:rPr>
         <w:t xml:space="preserve"> </w:t>
       </w:r>
+      <w:proofErr w:type="spellStart"/>
       <w:r>
         <w:rPr>
           <w:rFonts w:ascii="Times New Roman" w:hAnsi="Times New Roman" w:cs="Times New Roman"/>
@@ -4733,6 +4964,7 @@
         </w:rPr>
         <w:t>x</w:t>
       </w:r>
+      <w:proofErr w:type="spellEnd"/>
       <w:r>
         <w:rPr>
           <w:rFonts w:ascii="Times New Roman" w:hAnsi="Times New Roman" w:cs="Times New Roman"/>
@@ -5036,6 +5268,7 @@
         </w:rPr>
         <w:t xml:space="preserve"> </w:t>
       </w:r>
+      <w:proofErr w:type="spellStart"/>
       <w:r>
         <w:rPr>
           <w:rFonts w:ascii="Times New Roman" w:hAnsi="Times New Roman" w:cs="Times New Roman"/>
@@ -5056,6 +5289,7 @@
         </w:rPr>
         <w:t>x</w:t>
       </w:r>
+      <w:proofErr w:type="spellEnd"/>
       <w:r>
         <w:rPr>
           <w:rFonts w:ascii="Times New Roman" w:hAnsi="Times New Roman" w:cs="Times New Roman"/>
@@ -5080,6 +5314,7 @@
         </w:rPr>
         <w:t xml:space="preserve">population of </w:t>
       </w:r>
+      <w:proofErr w:type="spellStart"/>
       <w:r>
         <w:rPr>
           <w:rFonts w:ascii="Times New Roman" w:hAnsi="Times New Roman" w:cs="Times New Roman"/>
@@ -5100,6 +5335,7 @@
         </w:rPr>
         <w:t>x</w:t>
       </w:r>
+      <w:proofErr w:type="spellEnd"/>
       <w:r>
         <w:rPr>
           <w:rFonts w:ascii="Times New Roman" w:hAnsi="Times New Roman" w:cs="Times New Roman"/>
@@ -5532,6 +5768,7 @@
         </w:rPr>
         <w:t xml:space="preserve">here </w:t>
       </w:r>
+      <w:proofErr w:type="spellStart"/>
       <w:r>
         <w:rPr>
           <w:rFonts w:ascii="Times New Roman" w:hAnsi="Times New Roman" w:cs="Times New Roman"/>
@@ -5552,6 +5789,7 @@
         </w:rPr>
         <w:t>x</w:t>
       </w:r>
+      <w:proofErr w:type="spellEnd"/>
       <w:r>
         <w:rPr>
           <w:rFonts w:ascii="Times New Roman" w:hAnsi="Times New Roman" w:cs="Times New Roman"/>
@@ -5618,7 +5856,14 @@
         <w:rPr>
           <w:rFonts w:ascii="Times New Roman" w:hAnsi="Times New Roman" w:cs="Times New Roman"/>
         </w:rPr>
-        <w:t xml:space="preserve"> represents the starting point of the residency interval.</w:t>
+        <w:t xml:space="preserve"> represents the starting point of the residency </w:t>
+      </w:r>
+      <w:r>
+        <w:rPr>
+          <w:rFonts w:ascii="Times New Roman" w:hAnsi="Times New Roman" w:cs="Times New Roman"/>
+        </w:rPr>
+        <w:lastRenderedPageBreak/>
+        <w:t>interval.</w:t>
       </w:r>
       <w:r>
         <w:rPr>
@@ -5831,14 +6076,7 @@
         <w:rPr>
           <w:rFonts w:ascii="Times New Roman" w:hAnsi="Times New Roman" w:cs="Times New Roman"/>
         </w:rPr>
-        <w:t xml:space="preserve"> (combined, </w:t>
-      </w:r>
-      <w:r>
-        <w:rPr>
-          <w:rFonts w:ascii="Times New Roman" w:hAnsi="Times New Roman" w:cs="Times New Roman"/>
-        </w:rPr>
-        <w:lastRenderedPageBreak/>
-        <w:t>male, or female)</w:t>
+        <w:t xml:space="preserve"> (combined, male, or female)</w:t>
       </w:r>
       <w:r>
         <w:rPr>
@@ -6197,6 +6435,7 @@
                 <w:rFonts w:eastAsia="Aptos"/>
                 <w:noProof/>
               </w:rPr>
+              <w:lastRenderedPageBreak/>
               <w:drawing>
                 <wp:inline distT="0" distB="0" distL="0" distR="0" wp14:anchorId="77D8170C" wp14:editId="7061268D">
                   <wp:extent cx="3291840" cy="2033752"/>
@@ -6329,7 +6568,6 @@
                 <w:rFonts w:eastAsia="Aptos"/>
                 <w:noProof/>
               </w:rPr>
-              <w:lastRenderedPageBreak/>
               <w:drawing>
                 <wp:inline distT="0" distB="0" distL="0" distR="0" wp14:anchorId="77D81710" wp14:editId="4B05167C">
                   <wp:extent cx="3291840" cy="2033752"/>
@@ -6459,7 +6697,21 @@
               <w:rPr>
                 <w:rFonts w:eastAsia="Aptos"/>
               </w:rPr>
-              <w:t xml:space="preserve">Note: Canadian data is from the Longitudinal Immigration DataBase is </w:t>
+              <w:t xml:space="preserve">Note: Canadian data is from the Longitudinal Immigration </w:t>
+            </w:r>
+            <w:proofErr w:type="spellStart"/>
+            <w:r>
+              <w:rPr>
+                <w:rFonts w:eastAsia="Aptos"/>
+              </w:rPr>
+              <w:t>DataBase</w:t>
+            </w:r>
+            <w:proofErr w:type="spellEnd"/>
+            <w:r>
+              <w:rPr>
+                <w:rFonts w:eastAsia="Aptos"/>
+              </w:rPr>
+              <w:t xml:space="preserve"> is </w:t>
             </w:r>
             <w:r>
               <w:rPr>
@@ -6492,9 +6744,11 @@
       <w:r>
         <w:t xml:space="preserve"> initial </w:t>
       </w:r>
+      <w:proofErr w:type="gramStart"/>
       <w:r>
         <w:t>drop in</w:t>
       </w:r>
+      <w:proofErr w:type="gramEnd"/>
       <w:r>
         <w:t xml:space="preserve"> public assistance program use over time and then a leveling out </w:t>
       </w:r>
@@ -6554,7 +6808,40 @@
         <w:commentReference w:id="10"/>
       </w:r>
       <w:r>
-        <w:t xml:space="preserve"> Women-headed households, especially the women-headed households sampled in the United States, had more variance. It is hard to tell which sex had higher assistance program use rates at the end of five years. the </w:t>
+        <w:t xml:space="preserve"> Women-headed households, especially </w:t>
+      </w:r>
+      <w:r>
+        <w:lastRenderedPageBreak/>
+        <w:t>the women-headed households sampled in the United States, had more variance.</w:t>
+      </w:r>
+      <w:r>
+        <w:t xml:space="preserve"> This is likely because the female-headed household is rarer: </w:t>
+      </w:r>
+      <w:proofErr w:type="gramStart"/>
+      <w:r>
+        <w:t>typically</w:t>
+      </w:r>
+      <w:proofErr w:type="gramEnd"/>
+      <w:r>
+        <w:t xml:space="preserve"> only making up </w:t>
+      </w:r>
+      <w:r>
+        <w:t>around 25% of the Annual Survey of Refugee’s 1500 households.</w:t>
+      </w:r>
+      <w:r>
+        <w:t xml:space="preserve"> It is hard to tell which sex had higher assistance program use rates at the end of five years</w:t>
+      </w:r>
+      <w:r>
+        <w:t>, especially because it seems to change based on the resettlement system</w:t>
+      </w:r>
+      <w:r>
+        <w:t xml:space="preserve">. </w:t>
+      </w:r>
+      <w:r>
+        <w:t>T</w:t>
+      </w:r>
+      <w:r>
+        <w:t xml:space="preserve">he </w:t>
       </w:r>
       <w:r>
         <w:t>model-based</w:t>
@@ -6620,7 +6907,6 @@
                 <w:bCs/>
                 <w:noProof/>
               </w:rPr>
-              <w:lastRenderedPageBreak/>
               <w:drawing>
                 <wp:inline distT="0" distB="0" distL="0" distR="0" wp14:anchorId="30790350" wp14:editId="7EF431EA">
                   <wp:extent cx="3291840" cy="2463543"/>
@@ -6761,7 +7047,19 @@
         <w:t xml:space="preserve">several times over. </w:t>
       </w:r>
       <w:r>
-        <w:t>The total spending of the countries is similar, and the United States simply resettles more refugees than Canada</w:t>
+        <w:t xml:space="preserve">The total spending of the countries is similar, </w:t>
+      </w:r>
+      <w:r>
+        <w:t>but</w:t>
+      </w:r>
+      <w:r>
+        <w:t xml:space="preserve"> the United States resettles </w:t>
+      </w:r>
+      <w:r>
+        <w:t xml:space="preserve">many </w:t>
+      </w:r>
+      <w:r>
+        <w:t>more refugees than Canada</w:t>
       </w:r>
       <w:r>
         <w:t xml:space="preserve">. </w:t>
@@ -6809,6 +7107,7 @@
                 <w:rFonts w:ascii="Times New Roman" w:hAnsi="Times New Roman" w:cs="Times New Roman"/>
                 <w:color w:val="000000"/>
               </w:rPr>
+              <w:lastRenderedPageBreak/>
               <w:t>TABLE 1. Grouped Funding Per Capita</w:t>
             </w:r>
           </w:p>
@@ -7623,7 +7922,6 @@
               <w:rPr>
                 <w:rFonts w:ascii="Times New Roman" w:hAnsi="Times New Roman" w:cs="Times New Roman"/>
               </w:rPr>
-              <w:lastRenderedPageBreak/>
               <w:t>United States</w:t>
             </w:r>
           </w:p>
@@ -8022,6 +8320,7 @@
         <w:ind w:firstLine="720"/>
       </w:pPr>
       <w:r>
+        <w:lastRenderedPageBreak/>
         <w:t xml:space="preserve">We will avoid interpreting the </w:t>
       </w:r>
       <w:r>
@@ -8058,7 +8357,13 @@
         <w:t xml:space="preserve">others, </w:t>
       </w:r>
       <w:r>
-        <w:t>and especially the</w:t>
+        <w:t xml:space="preserve">and especially </w:t>
+      </w:r>
+      <w:r>
+        <w:t xml:space="preserve">stands out from </w:t>
+      </w:r>
+      <w:r>
+        <w:t>the</w:t>
       </w:r>
       <w:r>
         <w:t xml:space="preserve"> Canadian government-led program</w:t>
@@ -8082,11 +8387,7 @@
         <w:t xml:space="preserve"> </w:t>
       </w:r>
       <w:r>
-        <w:t xml:space="preserve">The </w:t>
-      </w:r>
-      <w:r>
-        <w:lastRenderedPageBreak/>
-        <w:t>Canadian private track is the only resettlement program to differentiate itself form the Canadian government-led program.</w:t>
+        <w:t>The Canadian private track is the only resettlement program to differentiate itself form the Canadian government-led program.</w:t>
       </w:r>
       <w:r>
         <w:t xml:space="preserve"> </w:t>
@@ -8195,12 +8496,14 @@
           <w:p>
             <w:pPr>
               <w:rPr>
+                <w:rFonts w:ascii="Times New Roman" w:hAnsi="Times New Roman" w:cs="Times New Roman"/>
                 <w:b/>
                 <w:bCs/>
               </w:rPr>
             </w:pPr>
             <w:r>
               <w:rPr>
+                <w:rFonts w:ascii="Times New Roman" w:hAnsi="Times New Roman" w:cs="Times New Roman"/>
                 <w:b/>
                 <w:bCs/>
               </w:rPr>
@@ -8208,6 +8511,7 @@
             </w:r>
             <w:r>
               <w:rPr>
+                <w:rFonts w:ascii="Times New Roman" w:hAnsi="Times New Roman" w:cs="Times New Roman"/>
                 <w:b/>
                 <w:bCs/>
               </w:rPr>
@@ -8215,6 +8519,7 @@
             </w:r>
             <w:r>
               <w:rPr>
+                <w:rFonts w:ascii="Times New Roman" w:hAnsi="Times New Roman" w:cs="Times New Roman"/>
                 <w:b/>
                 <w:bCs/>
               </w:rPr>
@@ -8240,8 +8545,15 @@
           <w:p>
             <w:pPr>
               <w:ind w:firstLine="720"/>
+              <w:jc w:val="both"/>
+              <w:rPr>
+                <w:rFonts w:ascii="Times New Roman" w:hAnsi="Times New Roman" w:cs="Times New Roman"/>
+              </w:rPr>
             </w:pPr>
             <w:r>
+              <w:rPr>
+                <w:rFonts w:ascii="Times New Roman" w:hAnsi="Times New Roman" w:cs="Times New Roman"/>
+              </w:rPr>
               <w:t>Variable Name</w:t>
             </w:r>
           </w:p>
@@ -8260,12 +8572,14 @@
             <w:pPr>
               <w:ind w:firstLine="720"/>
               <w:rPr>
+                <w:rFonts w:ascii="Times New Roman" w:hAnsi="Times New Roman" w:cs="Times New Roman"/>
                 <w:b/>
                 <w:bCs/>
               </w:rPr>
             </w:pPr>
             <w:r>
               <w:rPr>
+                <w:rFonts w:ascii="Times New Roman" w:hAnsi="Times New Roman" w:cs="Times New Roman"/>
                 <w:b/>
                 <w:bCs/>
               </w:rPr>
@@ -8287,12 +8601,14 @@
             <w:pPr>
               <w:ind w:firstLine="720"/>
               <w:rPr>
+                <w:rFonts w:ascii="Times New Roman" w:hAnsi="Times New Roman" w:cs="Times New Roman"/>
                 <w:b/>
                 <w:bCs/>
               </w:rPr>
             </w:pPr>
             <w:r>
               <w:rPr>
+                <w:rFonts w:ascii="Times New Roman" w:hAnsi="Times New Roman" w:cs="Times New Roman"/>
                 <w:b/>
                 <w:bCs/>
               </w:rPr>
@@ -8314,10 +8630,14 @@
           <w:p>
             <w:pPr>
               <w:ind w:firstLine="720"/>
+              <w:jc w:val="both"/>
+              <w:rPr>
+                <w:rFonts w:ascii="Times New Roman" w:hAnsi="Times New Roman" w:cs="Times New Roman"/>
+              </w:rPr>
             </w:pPr>
             <w:r>
               <w:rPr>
-                <w:rFonts w:ascii="Segoe UI" w:hAnsi="Segoe UI" w:cs="Segoe UI"/>
+                <w:rFonts w:ascii="Times New Roman" w:hAnsi="Times New Roman" w:cs="Times New Roman"/>
                 <w:color w:val="212529"/>
               </w:rPr>
               <w:t>(Intercept)</w:t>
@@ -8336,11 +8656,13 @@
           <w:p>
             <w:pPr>
               <w:ind w:firstLine="720"/>
-              <w:jc w:val="right"/>
+              <w:rPr>
+                <w:rFonts w:ascii="Times New Roman" w:hAnsi="Times New Roman" w:cs="Times New Roman"/>
+              </w:rPr>
             </w:pPr>
             <w:r>
               <w:rPr>
-                <w:rFonts w:ascii="Segoe UI" w:hAnsi="Segoe UI" w:cs="Segoe UI"/>
+                <w:rFonts w:ascii="Times New Roman" w:hAnsi="Times New Roman" w:cs="Times New Roman"/>
                 <w:color w:val="212529"/>
               </w:rPr>
               <w:t>55.6 (9.9)</w:t>
@@ -8359,11 +8681,13 @@
           <w:p>
             <w:pPr>
               <w:ind w:firstLine="720"/>
-              <w:jc w:val="right"/>
+              <w:rPr>
+                <w:rFonts w:ascii="Times New Roman" w:hAnsi="Times New Roman" w:cs="Times New Roman"/>
+              </w:rPr>
             </w:pPr>
             <w:r>
               <w:rPr>
-                <w:rFonts w:ascii="Segoe UI" w:hAnsi="Segoe UI" w:cs="Segoe UI"/>
+                <w:rFonts w:ascii="Times New Roman" w:hAnsi="Times New Roman" w:cs="Times New Roman"/>
                 <w:color w:val="212529"/>
               </w:rPr>
               <w:t>173.0 (61.0)</w:t>
@@ -8381,10 +8705,14 @@
           <w:p>
             <w:pPr>
               <w:ind w:firstLine="720"/>
+              <w:jc w:val="both"/>
+              <w:rPr>
+                <w:rFonts w:ascii="Times New Roman" w:hAnsi="Times New Roman" w:cs="Times New Roman"/>
+              </w:rPr>
             </w:pPr>
             <w:r>
               <w:rPr>
-                <w:rFonts w:ascii="Segoe UI" w:hAnsi="Segoe UI" w:cs="Segoe UI"/>
+                <w:rFonts w:ascii="Times New Roman" w:hAnsi="Times New Roman" w:cs="Times New Roman"/>
                 <w:color w:val="212529"/>
               </w:rPr>
               <w:t>Years In Country</w:t>
@@ -8400,7 +8728,9 @@
           <w:p>
             <w:pPr>
               <w:ind w:firstLine="720"/>
-              <w:jc w:val="right"/>
+              <w:rPr>
+                <w:rFonts w:ascii="Times New Roman" w:hAnsi="Times New Roman" w:cs="Times New Roman"/>
+              </w:rPr>
             </w:pPr>
           </w:p>
         </w:tc>
@@ -8413,14 +8743,44 @@
           <w:p>
             <w:pPr>
               <w:ind w:firstLine="720"/>
-              <w:jc w:val="right"/>
+              <w:rPr>
+                <w:rFonts w:ascii="Times New Roman" w:hAnsi="Times New Roman" w:cs="Times New Roman"/>
+              </w:rPr>
             </w:pPr>
             <w:r>
               <w:rPr>
-                <w:rFonts w:ascii="Segoe UI" w:hAnsi="Segoe UI" w:cs="Segoe UI"/>
+                <w:rFonts w:ascii="Times New Roman" w:hAnsi="Times New Roman" w:cs="Times New Roman"/>
                 <w:color w:val="212529"/>
               </w:rPr>
-              <w:t>-5.5 (0.59)</w:t>
+              <w:t>-5.</w:t>
+            </w:r>
+            <w:r>
+              <w:rPr>
+                <w:rFonts w:ascii="Times New Roman" w:hAnsi="Times New Roman" w:cs="Times New Roman"/>
+                <w:color w:val="212529"/>
+              </w:rPr>
+              <w:t>7</w:t>
+            </w:r>
+            <w:r>
+              <w:rPr>
+                <w:rFonts w:ascii="Times New Roman" w:hAnsi="Times New Roman" w:cs="Times New Roman"/>
+                <w:color w:val="212529"/>
+              </w:rPr>
+              <w:t xml:space="preserve"> (0.</w:t>
+            </w:r>
+            <w:r>
+              <w:rPr>
+                <w:rFonts w:ascii="Times New Roman" w:hAnsi="Times New Roman" w:cs="Times New Roman"/>
+                <w:color w:val="212529"/>
+              </w:rPr>
+              <w:t>6</w:t>
+            </w:r>
+            <w:r>
+              <w:rPr>
+                <w:rFonts w:ascii="Times New Roman" w:hAnsi="Times New Roman" w:cs="Times New Roman"/>
+                <w:color w:val="212529"/>
+              </w:rPr>
+              <w:t>)</w:t>
             </w:r>
           </w:p>
         </w:tc>
@@ -8433,9 +8793,15 @@
             <w:vAlign w:val="center"/>
           </w:tcPr>
           <w:p>
-            <w:r>
-              <w:rPr>
-                <w:rFonts w:ascii="Segoe UI" w:hAnsi="Segoe UI" w:cs="Segoe UI"/>
+            <w:pPr>
+              <w:jc w:val="both"/>
+              <w:rPr>
+                <w:rFonts w:ascii="Times New Roman" w:hAnsi="Times New Roman" w:cs="Times New Roman"/>
+              </w:rPr>
+            </w:pPr>
+            <w:r>
+              <w:rPr>
+                <w:rFonts w:ascii="Times New Roman" w:hAnsi="Times New Roman" w:cs="Times New Roman"/>
                 <w:color w:val="212529"/>
               </w:rPr>
               <w:t xml:space="preserve">           Females (ref= Male-headed households)</w:t>
@@ -8451,7 +8817,9 @@
           <w:p>
             <w:pPr>
               <w:ind w:firstLine="720"/>
-              <w:jc w:val="right"/>
+              <w:rPr>
+                <w:rFonts w:ascii="Times New Roman" w:hAnsi="Times New Roman" w:cs="Times New Roman"/>
+              </w:rPr>
             </w:pPr>
           </w:p>
         </w:tc>
@@ -8464,14 +8832,30 @@
           <w:p>
             <w:pPr>
               <w:ind w:firstLine="720"/>
-              <w:jc w:val="right"/>
+              <w:rPr>
+                <w:rFonts w:ascii="Times New Roman" w:hAnsi="Times New Roman" w:cs="Times New Roman"/>
+              </w:rPr>
             </w:pPr>
             <w:r>
               <w:rPr>
-                <w:rFonts w:ascii="Segoe UI" w:hAnsi="Segoe UI" w:cs="Segoe UI"/>
+                <w:rFonts w:ascii="Times New Roman" w:hAnsi="Times New Roman" w:cs="Times New Roman"/>
                 <w:color w:val="212529"/>
               </w:rPr>
-              <w:t>6.3 (1.3)</w:t>
+              <w:t>6.</w:t>
+            </w:r>
+            <w:r>
+              <w:rPr>
+                <w:rFonts w:ascii="Times New Roman" w:hAnsi="Times New Roman" w:cs="Times New Roman"/>
+                <w:color w:val="212529"/>
+              </w:rPr>
+              <w:t>4</w:t>
+            </w:r>
+            <w:r>
+              <w:rPr>
+                <w:rFonts w:ascii="Times New Roman" w:hAnsi="Times New Roman" w:cs="Times New Roman"/>
+                <w:color w:val="212529"/>
+              </w:rPr>
+              <w:t xml:space="preserve"> (1.3)</w:t>
             </w:r>
           </w:p>
         </w:tc>
@@ -8486,13 +8870,26 @@
           <w:p>
             <w:pPr>
               <w:ind w:firstLine="720"/>
+              <w:jc w:val="both"/>
+              <w:rPr>
+                <w:rFonts w:ascii="Times New Roman" w:hAnsi="Times New Roman" w:cs="Times New Roman"/>
+              </w:rPr>
             </w:pPr>
-            <w:r>
-              <w:rPr>
-                <w:rFonts w:ascii="Segoe UI" w:hAnsi="Segoe UI" w:cs="Segoe UI"/>
+            <w:proofErr w:type="gramStart"/>
+            <w:r>
+              <w:rPr>
+                <w:rFonts w:ascii="Times New Roman" w:hAnsi="Times New Roman" w:cs="Times New Roman"/>
                 <w:color w:val="212529"/>
               </w:rPr>
-              <w:t>log(Initial funds per household)</w:t>
+              <w:t>log(</w:t>
+            </w:r>
+            <w:proofErr w:type="gramEnd"/>
+            <w:r>
+              <w:rPr>
+                <w:rFonts w:ascii="Times New Roman" w:hAnsi="Times New Roman" w:cs="Times New Roman"/>
+                <w:color w:val="212529"/>
+              </w:rPr>
+              <w:t>Initial funds per household)</w:t>
             </w:r>
           </w:p>
         </w:tc>
@@ -8505,7 +8902,9 @@
           <w:p>
             <w:pPr>
               <w:ind w:firstLine="720"/>
-              <w:jc w:val="right"/>
+              <w:rPr>
+                <w:rFonts w:ascii="Times New Roman" w:hAnsi="Times New Roman" w:cs="Times New Roman"/>
+              </w:rPr>
             </w:pPr>
           </w:p>
         </w:tc>
@@ -8518,14 +8917,72 @@
           <w:p>
             <w:pPr>
               <w:ind w:firstLine="720"/>
-              <w:jc w:val="right"/>
+              <w:rPr>
+                <w:rFonts w:ascii="Times New Roman" w:hAnsi="Times New Roman" w:cs="Times New Roman"/>
+              </w:rPr>
             </w:pPr>
             <w:r>
               <w:rPr>
-                <w:rFonts w:ascii="Segoe UI" w:hAnsi="Segoe UI" w:cs="Segoe UI"/>
+                <w:rFonts w:ascii="Times New Roman" w:hAnsi="Times New Roman" w:cs="Times New Roman"/>
                 <w:color w:val="212529"/>
               </w:rPr>
-              <w:t>-8.7 (5.3)</w:t>
+              <w:t>-</w:t>
+            </w:r>
+            <w:r>
+              <w:rPr>
+                <w:rFonts w:ascii="Times New Roman" w:hAnsi="Times New Roman" w:cs="Times New Roman"/>
+                <w:color w:val="212529"/>
+              </w:rPr>
+              <w:t>6</w:t>
+            </w:r>
+            <w:r>
+              <w:rPr>
+                <w:rFonts w:ascii="Times New Roman" w:hAnsi="Times New Roman" w:cs="Times New Roman"/>
+                <w:color w:val="212529"/>
+              </w:rPr>
+              <w:t>.</w:t>
+            </w:r>
+            <w:r>
+              <w:rPr>
+                <w:rFonts w:ascii="Times New Roman" w:hAnsi="Times New Roman" w:cs="Times New Roman"/>
+                <w:color w:val="212529"/>
+              </w:rPr>
+              <w:t>14</w:t>
+            </w:r>
+            <w:r>
+              <w:rPr>
+                <w:rFonts w:ascii="Times New Roman" w:hAnsi="Times New Roman" w:cs="Times New Roman"/>
+                <w:color w:val="212529"/>
+              </w:rPr>
+              <w:t xml:space="preserve"> (</w:t>
+            </w:r>
+            <w:r>
+              <w:rPr>
+                <w:rFonts w:ascii="Times New Roman" w:hAnsi="Times New Roman" w:cs="Times New Roman"/>
+                <w:color w:val="212529"/>
+              </w:rPr>
+              <w:t>4</w:t>
+            </w:r>
+            <w:r>
+              <w:rPr>
+                <w:rFonts w:ascii="Times New Roman" w:hAnsi="Times New Roman" w:cs="Times New Roman"/>
+                <w:color w:val="212529"/>
+              </w:rPr>
+              <w:t>.</w:t>
+            </w:r>
+            <w:r>
+              <w:rPr>
+                <w:rFonts w:ascii="Times New Roman" w:hAnsi="Times New Roman" w:cs="Times New Roman"/>
+                <w:color w:val="212529"/>
+              </w:rPr>
+              <w:t>9</w:t>
+            </w:r>
+            <w:r>
+              <w:rPr>
+                <w:rFonts w:ascii="Times New Roman" w:hAnsi="Times New Roman" w:cs="Times New Roman"/>
+                <w:color w:val="212529"/>
+              </w:rPr>
+              <w:t>)</w:t>
             </w:r>
           </w:p>
         </w:tc>
@@ -8540,10 +8997,14 @@
           <w:p>
             <w:pPr>
               <w:ind w:firstLine="720"/>
+              <w:jc w:val="both"/>
+              <w:rPr>
+                <w:rFonts w:ascii="Times New Roman" w:hAnsi="Times New Roman" w:cs="Times New Roman"/>
+              </w:rPr>
             </w:pPr>
             <w:r>
               <w:rPr>
-                <w:rFonts w:ascii="Segoe UI" w:hAnsi="Segoe UI" w:cs="Segoe UI"/>
+                <w:rFonts w:ascii="Times New Roman" w:hAnsi="Times New Roman" w:cs="Times New Roman"/>
                 <w:color w:val="212529"/>
               </w:rPr>
               <w:t>CA Blended Resettlement</w:t>
@@ -8559,7 +9020,9 @@
           <w:p>
             <w:pPr>
               <w:ind w:firstLine="720"/>
-              <w:jc w:val="right"/>
+              <w:rPr>
+                <w:rFonts w:ascii="Times New Roman" w:hAnsi="Times New Roman" w:cs="Times New Roman"/>
+              </w:rPr>
             </w:pPr>
           </w:p>
         </w:tc>
@@ -8572,14 +9035,37 @@
           <w:p>
             <w:pPr>
               <w:ind w:firstLine="720"/>
-              <w:jc w:val="right"/>
+              <w:rPr>
+                <w:rFonts w:ascii="Times New Roman" w:hAnsi="Times New Roman" w:cs="Times New Roman"/>
+              </w:rPr>
             </w:pPr>
             <w:r>
               <w:rPr>
-                <w:rFonts w:ascii="Segoe UI" w:hAnsi="Segoe UI" w:cs="Segoe UI"/>
+                <w:rFonts w:ascii="Times New Roman" w:hAnsi="Times New Roman" w:cs="Times New Roman"/>
                 <w:color w:val="212529"/>
               </w:rPr>
-              <w:t>4.2 (52.5)</w:t>
+              <w:t>2.94</w:t>
+            </w:r>
+            <w:r>
+              <w:rPr>
+                <w:rFonts w:ascii="Times New Roman" w:hAnsi="Times New Roman" w:cs="Times New Roman"/>
+                <w:color w:val="212529"/>
+              </w:rPr>
+              <w:t xml:space="preserve"> (52.</w:t>
+            </w:r>
+            <w:r>
+              <w:rPr>
+                <w:rFonts w:ascii="Times New Roman" w:hAnsi="Times New Roman" w:cs="Times New Roman"/>
+                <w:color w:val="212529"/>
+              </w:rPr>
+              <w:t>6</w:t>
+            </w:r>
+            <w:r>
+              <w:rPr>
+                <w:rFonts w:ascii="Times New Roman" w:hAnsi="Times New Roman" w:cs="Times New Roman"/>
+                <w:color w:val="212529"/>
+              </w:rPr>
+              <w:t>)</w:t>
             </w:r>
           </w:p>
         </w:tc>
@@ -8593,13 +9079,17 @@
           </w:tcPr>
           <w:p>
             <w:pPr>
-              <w:ind w:firstLine="720"/>
+              <w:jc w:val="both"/>
+              <w:rPr>
+                <w:rFonts w:ascii="Times New Roman" w:hAnsi="Times New Roman" w:cs="Times New Roman"/>
+              </w:rPr>
             </w:pPr>
             <w:r>
               <w:rPr>
-                <w:rFonts w:ascii="Segoe UI" w:hAnsi="Segoe UI" w:cs="Segoe UI"/>
+                <w:rFonts w:ascii="Times New Roman" w:hAnsi="Times New Roman" w:cs="Times New Roman"/>
                 <w:color w:val="212529"/>
               </w:rPr>
+              <w:lastRenderedPageBreak/>
               <w:t>CA Private Resettlement</w:t>
             </w:r>
           </w:p>
@@ -8613,7 +9103,9 @@
           <w:p>
             <w:pPr>
               <w:ind w:firstLine="720"/>
-              <w:jc w:val="right"/>
+              <w:rPr>
+                <w:rFonts w:ascii="Times New Roman" w:hAnsi="Times New Roman" w:cs="Times New Roman"/>
+              </w:rPr>
             </w:pPr>
           </w:p>
         </w:tc>
@@ -8626,14 +9118,58 @@
           <w:p>
             <w:pPr>
               <w:ind w:firstLine="720"/>
-              <w:jc w:val="right"/>
+              <w:rPr>
+                <w:rFonts w:ascii="Times New Roman" w:hAnsi="Times New Roman" w:cs="Times New Roman"/>
+              </w:rPr>
             </w:pPr>
             <w:r>
               <w:rPr>
-                <w:rFonts w:ascii="Segoe UI" w:hAnsi="Segoe UI" w:cs="Segoe UI"/>
+                <w:rFonts w:ascii="Times New Roman" w:hAnsi="Times New Roman" w:cs="Times New Roman"/>
                 <w:color w:val="212529"/>
               </w:rPr>
-              <w:t>25.5 (52.5)</w:t>
+              <w:t>2</w:t>
+            </w:r>
+            <w:r>
+              <w:rPr>
+                <w:rFonts w:ascii="Times New Roman" w:hAnsi="Times New Roman" w:cs="Times New Roman"/>
+                <w:color w:val="212529"/>
+              </w:rPr>
+              <w:t>1</w:t>
+            </w:r>
+            <w:r>
+              <w:rPr>
+                <w:rFonts w:ascii="Times New Roman" w:hAnsi="Times New Roman" w:cs="Times New Roman"/>
+                <w:color w:val="212529"/>
+              </w:rPr>
+              <w:t>.</w:t>
+            </w:r>
+            <w:r>
+              <w:rPr>
+                <w:rFonts w:ascii="Times New Roman" w:hAnsi="Times New Roman" w:cs="Times New Roman"/>
+                <w:color w:val="212529"/>
+              </w:rPr>
+              <w:t>0</w:t>
+            </w:r>
+            <w:r>
+              <w:rPr>
+                <w:rFonts w:ascii="Times New Roman" w:hAnsi="Times New Roman" w:cs="Times New Roman"/>
+                <w:color w:val="212529"/>
+              </w:rPr>
+              <w:t xml:space="preserve"> (52.</w:t>
+            </w:r>
+            <w:r>
+              <w:rPr>
+                <w:rFonts w:ascii="Times New Roman" w:hAnsi="Times New Roman" w:cs="Times New Roman"/>
+                <w:color w:val="212529"/>
+              </w:rPr>
+              <w:t>6</w:t>
+            </w:r>
+            <w:r>
+              <w:rPr>
+                <w:rFonts w:ascii="Times New Roman" w:hAnsi="Times New Roman" w:cs="Times New Roman"/>
+                <w:color w:val="212529"/>
+              </w:rPr>
+              <w:t>)</w:t>
             </w:r>
           </w:p>
         </w:tc>
@@ -8647,11 +9183,14 @@
           </w:tcPr>
           <w:p>
             <w:pPr>
-              <w:ind w:firstLine="720"/>
+              <w:jc w:val="both"/>
+              <w:rPr>
+                <w:rFonts w:ascii="Times New Roman" w:hAnsi="Times New Roman" w:cs="Times New Roman"/>
+              </w:rPr>
             </w:pPr>
             <w:r>
               <w:rPr>
-                <w:rFonts w:ascii="Segoe UI" w:hAnsi="Segoe UI" w:cs="Segoe UI"/>
+                <w:rFonts w:ascii="Times New Roman" w:hAnsi="Times New Roman" w:cs="Times New Roman"/>
                 <w:color w:val="212529"/>
               </w:rPr>
               <w:t>U.S. Government Resettlement</w:t>
@@ -8667,7 +9206,9 @@
           <w:p>
             <w:pPr>
               <w:ind w:firstLine="720"/>
-              <w:jc w:val="right"/>
+              <w:rPr>
+                <w:rFonts w:ascii="Times New Roman" w:hAnsi="Times New Roman" w:cs="Times New Roman"/>
+              </w:rPr>
             </w:pPr>
           </w:p>
         </w:tc>
@@ -8680,14 +9221,72 @@
           <w:p>
             <w:pPr>
               <w:ind w:firstLine="720"/>
-              <w:jc w:val="right"/>
+              <w:rPr>
+                <w:rFonts w:ascii="Times New Roman" w:hAnsi="Times New Roman" w:cs="Times New Roman"/>
+              </w:rPr>
             </w:pPr>
             <w:r>
               <w:rPr>
-                <w:rFonts w:ascii="Segoe UI" w:hAnsi="Segoe UI" w:cs="Segoe UI"/>
+                <w:rFonts w:ascii="Times New Roman" w:hAnsi="Times New Roman" w:cs="Times New Roman"/>
                 <w:color w:val="212529"/>
               </w:rPr>
-              <w:t>-39.7 (60.1)</w:t>
+              <w:t>-</w:t>
+            </w:r>
+            <w:r>
+              <w:rPr>
+                <w:rFonts w:ascii="Times New Roman" w:hAnsi="Times New Roman" w:cs="Times New Roman"/>
+                <w:color w:val="212529"/>
+              </w:rPr>
+              <w:t>22</w:t>
+            </w:r>
+            <w:r>
+              <w:rPr>
+                <w:rFonts w:ascii="Times New Roman" w:hAnsi="Times New Roman" w:cs="Times New Roman"/>
+                <w:color w:val="212529"/>
+              </w:rPr>
+              <w:t>.</w:t>
+            </w:r>
+            <w:r>
+              <w:rPr>
+                <w:rFonts w:ascii="Times New Roman" w:hAnsi="Times New Roman" w:cs="Times New Roman"/>
+                <w:color w:val="212529"/>
+              </w:rPr>
+              <w:t>8</w:t>
+            </w:r>
+            <w:r>
+              <w:rPr>
+                <w:rFonts w:ascii="Times New Roman" w:hAnsi="Times New Roman" w:cs="Times New Roman"/>
+                <w:color w:val="212529"/>
+              </w:rPr>
+              <w:t xml:space="preserve"> (</w:t>
+            </w:r>
+            <w:r>
+              <w:rPr>
+                <w:rFonts w:ascii="Times New Roman" w:hAnsi="Times New Roman" w:cs="Times New Roman"/>
+                <w:color w:val="212529"/>
+              </w:rPr>
+              <w:t>58</w:t>
+            </w:r>
+            <w:r>
+              <w:rPr>
+                <w:rFonts w:ascii="Times New Roman" w:hAnsi="Times New Roman" w:cs="Times New Roman"/>
+                <w:color w:val="212529"/>
+              </w:rPr>
+              <w:t>.</w:t>
+            </w:r>
+            <w:r>
+              <w:rPr>
+                <w:rFonts w:ascii="Times New Roman" w:hAnsi="Times New Roman" w:cs="Times New Roman"/>
+                <w:color w:val="212529"/>
+              </w:rPr>
+              <w:t>7</w:t>
+            </w:r>
+            <w:r>
+              <w:rPr>
+                <w:rFonts w:ascii="Times New Roman" w:hAnsi="Times New Roman" w:cs="Times New Roman"/>
+                <w:color w:val="212529"/>
+              </w:rPr>
+              <w:t>)</w:t>
             </w:r>
           </w:p>
         </w:tc>
@@ -8701,14 +9300,26 @@
           </w:tcPr>
           <w:p>
             <w:pPr>
-              <w:ind w:firstLine="720"/>
+              <w:jc w:val="both"/>
+              <w:rPr>
+                <w:rFonts w:ascii="Times New Roman" w:hAnsi="Times New Roman" w:cs="Times New Roman"/>
+              </w:rPr>
             </w:pPr>
-            <w:r>
-              <w:rPr>
-                <w:rFonts w:ascii="Segoe UI" w:hAnsi="Segoe UI" w:cs="Segoe UI"/>
+            <w:proofErr w:type="gramStart"/>
+            <w:r>
+              <w:rPr>
+                <w:rFonts w:ascii="Times New Roman" w:hAnsi="Times New Roman" w:cs="Times New Roman"/>
                 <w:color w:val="212529"/>
               </w:rPr>
-              <w:t>log(Initial funds per) × CA Blended</w:t>
+              <w:t>log(</w:t>
+            </w:r>
+            <w:proofErr w:type="gramEnd"/>
+            <w:r>
+              <w:rPr>
+                <w:rFonts w:ascii="Times New Roman" w:hAnsi="Times New Roman" w:cs="Times New Roman"/>
+                <w:color w:val="212529"/>
+              </w:rPr>
+              <w:t>Initial funds per) × CA Blended</w:t>
             </w:r>
           </w:p>
         </w:tc>
@@ -8721,7 +9332,9 @@
           <w:p>
             <w:pPr>
               <w:ind w:firstLine="720"/>
-              <w:jc w:val="right"/>
+              <w:rPr>
+                <w:rFonts w:ascii="Times New Roman" w:hAnsi="Times New Roman" w:cs="Times New Roman"/>
+              </w:rPr>
             </w:pPr>
           </w:p>
         </w:tc>
@@ -8734,14 +9347,30 @@
           <w:p>
             <w:pPr>
               <w:ind w:firstLine="720"/>
-              <w:jc w:val="right"/>
+              <w:rPr>
+                <w:rFonts w:ascii="Times New Roman" w:hAnsi="Times New Roman" w:cs="Times New Roman"/>
+              </w:rPr>
             </w:pPr>
             <w:r>
               <w:rPr>
-                <w:rFonts w:ascii="Segoe UI" w:hAnsi="Segoe UI" w:cs="Segoe UI"/>
+                <w:rFonts w:ascii="Times New Roman" w:hAnsi="Times New Roman" w:cs="Times New Roman"/>
                 <w:color w:val="212529"/>
               </w:rPr>
-              <w:t>-1.6 (2.3)</w:t>
+              <w:t>-1.</w:t>
+            </w:r>
+            <w:r>
+              <w:rPr>
+                <w:rFonts w:ascii="Times New Roman" w:hAnsi="Times New Roman" w:cs="Times New Roman"/>
+                <w:color w:val="212529"/>
+              </w:rPr>
+              <w:t>5</w:t>
+            </w:r>
+            <w:r>
+              <w:rPr>
+                <w:rFonts w:ascii="Times New Roman" w:hAnsi="Times New Roman" w:cs="Times New Roman"/>
+                <w:color w:val="212529"/>
+              </w:rPr>
+              <w:t xml:space="preserve"> (2.3)</w:t>
             </w:r>
           </w:p>
         </w:tc>
@@ -8755,14 +9384,26 @@
           </w:tcPr>
           <w:p>
             <w:pPr>
-              <w:ind w:firstLine="720"/>
+              <w:jc w:val="both"/>
+              <w:rPr>
+                <w:rFonts w:ascii="Times New Roman" w:hAnsi="Times New Roman" w:cs="Times New Roman"/>
+              </w:rPr>
             </w:pPr>
-            <w:r>
-              <w:rPr>
-                <w:rFonts w:ascii="Segoe UI" w:hAnsi="Segoe UI" w:cs="Segoe UI"/>
+            <w:proofErr w:type="gramStart"/>
+            <w:r>
+              <w:rPr>
+                <w:rFonts w:ascii="Times New Roman" w:hAnsi="Times New Roman" w:cs="Times New Roman"/>
                 <w:color w:val="212529"/>
               </w:rPr>
-              <w:t>log(Initial funds per) × CA Private</w:t>
+              <w:t>log(</w:t>
+            </w:r>
+            <w:proofErr w:type="gramEnd"/>
+            <w:r>
+              <w:rPr>
+                <w:rFonts w:ascii="Times New Roman" w:hAnsi="Times New Roman" w:cs="Times New Roman"/>
+                <w:color w:val="212529"/>
+              </w:rPr>
+              <w:t>Initial funds per) × CA Private</w:t>
             </w:r>
           </w:p>
         </w:tc>
@@ -8775,7 +9416,9 @@
           <w:p>
             <w:pPr>
               <w:ind w:firstLine="720"/>
-              <w:jc w:val="right"/>
+              <w:rPr>
+                <w:rFonts w:ascii="Times New Roman" w:hAnsi="Times New Roman" w:cs="Times New Roman"/>
+              </w:rPr>
             </w:pPr>
           </w:p>
         </w:tc>
@@ -8788,14 +9431,30 @@
           <w:p>
             <w:pPr>
               <w:ind w:firstLine="720"/>
-              <w:jc w:val="right"/>
+              <w:rPr>
+                <w:rFonts w:ascii="Times New Roman" w:hAnsi="Times New Roman" w:cs="Times New Roman"/>
+              </w:rPr>
             </w:pPr>
             <w:r>
               <w:rPr>
-                <w:rFonts w:ascii="Segoe UI" w:hAnsi="Segoe UI" w:cs="Segoe UI"/>
+                <w:rFonts w:ascii="Times New Roman" w:hAnsi="Times New Roman" w:cs="Times New Roman"/>
                 <w:color w:val="212529"/>
               </w:rPr>
-              <w:t>-7.2 (2.3)</w:t>
+              <w:t>-</w:t>
+            </w:r>
+            <w:r>
+              <w:rPr>
+                <w:rFonts w:ascii="Times New Roman" w:hAnsi="Times New Roman" w:cs="Times New Roman"/>
+                <w:color w:val="212529"/>
+              </w:rPr>
+              <w:t>7.0</w:t>
+            </w:r>
+            <w:r>
+              <w:rPr>
+                <w:rFonts w:ascii="Times New Roman" w:hAnsi="Times New Roman" w:cs="Times New Roman"/>
+                <w:color w:val="212529"/>
+              </w:rPr>
+              <w:t xml:space="preserve"> (2.3)</w:t>
             </w:r>
           </w:p>
         </w:tc>
@@ -8809,14 +9468,35 @@
           </w:tcPr>
           <w:p>
             <w:pPr>
-              <w:ind w:firstLine="720"/>
+              <w:jc w:val="both"/>
+              <w:rPr>
+                <w:rFonts w:ascii="Times New Roman" w:hAnsi="Times New Roman" w:cs="Times New Roman"/>
+              </w:rPr>
             </w:pPr>
-            <w:r>
-              <w:rPr>
-                <w:rFonts w:ascii="Segoe UI" w:hAnsi="Segoe UI" w:cs="Segoe UI"/>
+            <w:proofErr w:type="gramStart"/>
+            <w:r>
+              <w:rPr>
+                <w:rFonts w:ascii="Times New Roman" w:hAnsi="Times New Roman" w:cs="Times New Roman"/>
                 <w:color w:val="212529"/>
               </w:rPr>
-              <w:t>log(Initial_funds_per) × US Gov</w:t>
+              <w:t>log(</w:t>
+            </w:r>
+            <w:proofErr w:type="spellStart"/>
+            <w:proofErr w:type="gramEnd"/>
+            <w:r>
+              <w:rPr>
+                <w:rFonts w:ascii="Times New Roman" w:hAnsi="Times New Roman" w:cs="Times New Roman"/>
+                <w:color w:val="212529"/>
+              </w:rPr>
+              <w:t>Initial_funds_per</w:t>
+            </w:r>
+            <w:proofErr w:type="spellEnd"/>
+            <w:r>
+              <w:rPr>
+                <w:rFonts w:ascii="Times New Roman" w:hAnsi="Times New Roman" w:cs="Times New Roman"/>
+                <w:color w:val="212529"/>
+              </w:rPr>
+              <w:t>) × US Gov</w:t>
             </w:r>
           </w:p>
         </w:tc>
@@ -8829,7 +9509,9 @@
           <w:p>
             <w:pPr>
               <w:ind w:firstLine="720"/>
-              <w:jc w:val="right"/>
+              <w:rPr>
+                <w:rFonts w:ascii="Times New Roman" w:hAnsi="Times New Roman" w:cs="Times New Roman"/>
+              </w:rPr>
             </w:pPr>
           </w:p>
         </w:tc>
@@ -8842,14 +9524,37 @@
           <w:p>
             <w:pPr>
               <w:ind w:firstLine="720"/>
-              <w:jc w:val="right"/>
+              <w:rPr>
+                <w:rFonts w:ascii="Times New Roman" w:hAnsi="Times New Roman" w:cs="Times New Roman"/>
+              </w:rPr>
             </w:pPr>
             <w:r>
               <w:rPr>
-                <w:rFonts w:ascii="Segoe UI" w:hAnsi="Segoe UI" w:cs="Segoe UI"/>
+                <w:rFonts w:ascii="Times New Roman" w:hAnsi="Times New Roman" w:cs="Times New Roman"/>
                 <w:color w:val="212529"/>
               </w:rPr>
-              <w:t>2.7 (3.7)</w:t>
+              <w:t>1.36</w:t>
+            </w:r>
+            <w:r>
+              <w:rPr>
+                <w:rFonts w:ascii="Times New Roman" w:hAnsi="Times New Roman" w:cs="Times New Roman"/>
+                <w:color w:val="212529"/>
+              </w:rPr>
+              <w:t xml:space="preserve"> (3.</w:t>
+            </w:r>
+            <w:r>
+              <w:rPr>
+                <w:rFonts w:ascii="Times New Roman" w:hAnsi="Times New Roman" w:cs="Times New Roman"/>
+                <w:color w:val="212529"/>
+              </w:rPr>
+              <w:t>6</w:t>
+            </w:r>
+            <w:r>
+              <w:rPr>
+                <w:rFonts w:ascii="Times New Roman" w:hAnsi="Times New Roman" w:cs="Times New Roman"/>
+                <w:color w:val="212529"/>
+              </w:rPr>
+              <w:t>)</w:t>
             </w:r>
           </w:p>
         </w:tc>
@@ -8866,10 +9571,24 @@
           </w:tcPr>
           <w:p>
             <w:pPr>
-              <w:ind w:firstLine="720"/>
+              <w:jc w:val="both"/>
+              <w:rPr>
+                <w:rFonts w:ascii="Times New Roman" w:hAnsi="Times New Roman" w:cs="Times New Roman"/>
+              </w:rPr>
             </w:pPr>
-            <w:r>
-              <w:t>Num.Obs.</w:t>
+            <w:proofErr w:type="spellStart"/>
+            <w:r>
+              <w:rPr>
+                <w:rFonts w:ascii="Times New Roman" w:hAnsi="Times New Roman" w:cs="Times New Roman"/>
+              </w:rPr>
+              <w:t>Num.Obs</w:t>
+            </w:r>
+            <w:proofErr w:type="spellEnd"/>
+            <w:r>
+              <w:rPr>
+                <w:rFonts w:ascii="Times New Roman" w:hAnsi="Times New Roman" w:cs="Times New Roman"/>
+              </w:rPr>
+              <w:t>.</w:t>
             </w:r>
           </w:p>
         </w:tc>
@@ -8885,10 +9604,15 @@
           <w:p>
             <w:pPr>
               <w:ind w:firstLine="720"/>
-              <w:jc w:val="right"/>
+              <w:rPr>
+                <w:rFonts w:ascii="Times New Roman" w:hAnsi="Times New Roman" w:cs="Times New Roman"/>
+              </w:rPr>
             </w:pPr>
             <w:r>
-              <w:t>326</w:t>
+              <w:rPr>
+                <w:rFonts w:ascii="Times New Roman" w:hAnsi="Times New Roman" w:cs="Times New Roman"/>
+              </w:rPr>
+              <w:t>217</w:t>
             </w:r>
           </w:p>
         </w:tc>
@@ -8904,10 +9628,15 @@
           <w:p>
             <w:pPr>
               <w:ind w:firstLine="720"/>
-              <w:jc w:val="right"/>
+              <w:rPr>
+                <w:rFonts w:ascii="Times New Roman" w:hAnsi="Times New Roman" w:cs="Times New Roman"/>
+              </w:rPr>
             </w:pPr>
             <w:r>
-              <w:t>326</w:t>
+              <w:rPr>
+                <w:rFonts w:ascii="Times New Roman" w:hAnsi="Times New Roman" w:cs="Times New Roman"/>
+              </w:rPr>
+              <w:t>217</w:t>
             </w:r>
           </w:p>
         </w:tc>
@@ -8921,19 +9650,28 @@
           </w:tcPr>
           <w:p>
             <w:pPr>
-              <w:ind w:firstLine="720"/>
+              <w:jc w:val="both"/>
+              <w:rPr>
+                <w:rFonts w:ascii="Times New Roman" w:hAnsi="Times New Roman" w:cs="Times New Roman"/>
+              </w:rPr>
             </w:pPr>
             <w:r>
-              <w:lastRenderedPageBreak/>
+              <w:rPr>
+                <w:rFonts w:ascii="Times New Roman" w:hAnsi="Times New Roman" w:cs="Times New Roman"/>
+              </w:rPr>
               <w:t>R</w:t>
             </w:r>
             <w:r>
               <w:rPr>
+                <w:rFonts w:ascii="Times New Roman" w:hAnsi="Times New Roman" w:cs="Times New Roman"/>
                 <w:vertAlign w:val="superscript"/>
               </w:rPr>
               <w:t>2</w:t>
             </w:r>
             <w:r>
+              <w:rPr>
+                <w:rFonts w:ascii="Times New Roman" w:hAnsi="Times New Roman" w:cs="Times New Roman"/>
+              </w:rPr>
               <w:t xml:space="preserve"> Marg.</w:t>
             </w:r>
           </w:p>
@@ -8947,9 +9685,14 @@
           <w:p>
             <w:pPr>
               <w:ind w:firstLine="720"/>
-              <w:jc w:val="right"/>
+              <w:rPr>
+                <w:rFonts w:ascii="Times New Roman" w:hAnsi="Times New Roman" w:cs="Times New Roman"/>
+              </w:rPr>
             </w:pPr>
             <w:r>
+              <w:rPr>
+                <w:rFonts w:ascii="Times New Roman" w:hAnsi="Times New Roman" w:cs="Times New Roman"/>
+              </w:rPr>
               <w:t>0.000</w:t>
             </w:r>
           </w:p>
@@ -8963,10 +9706,21 @@
           <w:p>
             <w:pPr>
               <w:ind w:firstLine="720"/>
-              <w:jc w:val="right"/>
+              <w:rPr>
+                <w:rFonts w:ascii="Times New Roman" w:hAnsi="Times New Roman" w:cs="Times New Roman"/>
+              </w:rPr>
             </w:pPr>
             <w:r>
-              <w:t>0.382</w:t>
+              <w:rPr>
+                <w:rFonts w:ascii="Times New Roman" w:hAnsi="Times New Roman" w:cs="Times New Roman"/>
+              </w:rPr>
+              <w:t>0.</w:t>
+            </w:r>
+            <w:r>
+              <w:rPr>
+                <w:rFonts w:ascii="Times New Roman" w:hAnsi="Times New Roman" w:cs="Times New Roman"/>
+              </w:rPr>
+              <w:t>24</w:t>
             </w:r>
           </w:p>
         </w:tc>
@@ -8980,21 +9734,34 @@
           </w:tcPr>
           <w:p>
             <w:pPr>
-              <w:ind w:firstLine="720"/>
+              <w:jc w:val="both"/>
+              <w:rPr>
+                <w:rFonts w:ascii="Times New Roman" w:hAnsi="Times New Roman" w:cs="Times New Roman"/>
+              </w:rPr>
             </w:pPr>
             <w:r>
+              <w:rPr>
+                <w:rFonts w:ascii="Times New Roman" w:hAnsi="Times New Roman" w:cs="Times New Roman"/>
+              </w:rPr>
               <w:t>R</w:t>
             </w:r>
             <w:r>
               <w:rPr>
+                <w:rFonts w:ascii="Times New Roman" w:hAnsi="Times New Roman" w:cs="Times New Roman"/>
                 <w:vertAlign w:val="superscript"/>
               </w:rPr>
               <w:t>2</w:t>
             </w:r>
             <w:r>
+              <w:rPr>
+                <w:rFonts w:ascii="Times New Roman" w:hAnsi="Times New Roman" w:cs="Times New Roman"/>
+              </w:rPr>
               <w:t xml:space="preserve"> Cond</w:t>
             </w:r>
             <w:r>
+              <w:rPr>
+                <w:rFonts w:ascii="Times New Roman" w:hAnsi="Times New Roman" w:cs="Times New Roman"/>
+              </w:rPr>
               <w:t>itional</w:t>
             </w:r>
           </w:p>
@@ -9008,10 +9775,21 @@
           <w:p>
             <w:pPr>
               <w:ind w:firstLine="720"/>
-              <w:jc w:val="right"/>
+              <w:rPr>
+                <w:rFonts w:ascii="Times New Roman" w:hAnsi="Times New Roman" w:cs="Times New Roman"/>
+              </w:rPr>
             </w:pPr>
             <w:r>
-              <w:t>0.737</w:t>
+              <w:rPr>
+                <w:rFonts w:ascii="Times New Roman" w:hAnsi="Times New Roman" w:cs="Times New Roman"/>
+              </w:rPr>
+              <w:t>0.7</w:t>
+            </w:r>
+            <w:r>
+              <w:rPr>
+                <w:rFonts w:ascii="Times New Roman" w:hAnsi="Times New Roman" w:cs="Times New Roman"/>
+              </w:rPr>
+              <w:t>2</w:t>
             </w:r>
           </w:p>
         </w:tc>
@@ -9024,10 +9802,21 @@
           <w:p>
             <w:pPr>
               <w:ind w:firstLine="720"/>
-              <w:jc w:val="right"/>
+              <w:rPr>
+                <w:rFonts w:ascii="Times New Roman" w:hAnsi="Times New Roman" w:cs="Times New Roman"/>
+              </w:rPr>
             </w:pPr>
             <w:r>
-              <w:t>0.921</w:t>
+              <w:rPr>
+                <w:rFonts w:ascii="Times New Roman" w:hAnsi="Times New Roman" w:cs="Times New Roman"/>
+              </w:rPr>
+              <w:t>0.9</w:t>
+            </w:r>
+            <w:r>
+              <w:rPr>
+                <w:rFonts w:ascii="Times New Roman" w:hAnsi="Times New Roman" w:cs="Times New Roman"/>
+              </w:rPr>
+              <w:t>5</w:t>
             </w:r>
           </w:p>
         </w:tc>
@@ -9041,9 +9830,15 @@
           </w:tcPr>
           <w:p>
             <w:pPr>
-              <w:ind w:firstLine="720"/>
+              <w:jc w:val="both"/>
+              <w:rPr>
+                <w:rFonts w:ascii="Times New Roman" w:hAnsi="Times New Roman" w:cs="Times New Roman"/>
+              </w:rPr>
             </w:pPr>
             <w:r>
+              <w:rPr>
+                <w:rFonts w:ascii="Times New Roman" w:hAnsi="Times New Roman" w:cs="Times New Roman"/>
+              </w:rPr>
               <w:t>AIC</w:t>
             </w:r>
           </w:p>
@@ -9052,15 +9847,21 @@
           <w:tcPr>
             <w:tcW w:w="2430" w:type="dxa"/>
             <w:shd w:val="clear" w:color="auto" w:fill="FFFFFF"/>
-            <w:vAlign w:val="center"/>
+            <w:vAlign w:val="bottom"/>
           </w:tcPr>
           <w:p>
             <w:pPr>
               <w:ind w:firstLine="720"/>
-              <w:jc w:val="right"/>
+              <w:rPr>
+                <w:rFonts w:ascii="Times New Roman" w:hAnsi="Times New Roman" w:cs="Times New Roman"/>
+              </w:rPr>
             </w:pPr>
             <w:r>
-              <w:t>2557.2</w:t>
+              <w:rPr>
+                <w:rFonts w:ascii="Times New Roman" w:hAnsi="Times New Roman" w:cs="Times New Roman"/>
+                <w:color w:val="000000"/>
+              </w:rPr>
+              <w:t>1722.8</w:t>
             </w:r>
           </w:p>
         </w:tc>
@@ -9068,15 +9869,21 @@
           <w:tcPr>
             <w:tcW w:w="2424" w:type="dxa"/>
             <w:shd w:val="clear" w:color="auto" w:fill="FFFFFF"/>
-            <w:vAlign w:val="center"/>
+            <w:vAlign w:val="bottom"/>
           </w:tcPr>
           <w:p>
             <w:pPr>
               <w:ind w:firstLine="720"/>
-              <w:jc w:val="right"/>
+              <w:rPr>
+                <w:rFonts w:ascii="Times New Roman" w:hAnsi="Times New Roman" w:cs="Times New Roman"/>
+              </w:rPr>
             </w:pPr>
             <w:r>
-              <w:t>2320.8</w:t>
+              <w:rPr>
+                <w:rFonts w:ascii="Times New Roman" w:hAnsi="Times New Roman" w:cs="Times New Roman"/>
+                <w:color w:val="000000"/>
+              </w:rPr>
+              <w:t>1548.2</w:t>
             </w:r>
           </w:p>
         </w:tc>
@@ -9090,9 +9897,15 @@
           </w:tcPr>
           <w:p>
             <w:pPr>
-              <w:ind w:firstLine="720"/>
+              <w:jc w:val="both"/>
+              <w:rPr>
+                <w:rFonts w:ascii="Times New Roman" w:hAnsi="Times New Roman" w:cs="Times New Roman"/>
+              </w:rPr>
             </w:pPr>
             <w:r>
+              <w:rPr>
+                <w:rFonts w:ascii="Times New Roman" w:hAnsi="Times New Roman" w:cs="Times New Roman"/>
+              </w:rPr>
               <w:t>BIC</w:t>
             </w:r>
           </w:p>
@@ -9101,15 +9914,21 @@
           <w:tcPr>
             <w:tcW w:w="2430" w:type="dxa"/>
             <w:shd w:val="clear" w:color="auto" w:fill="FFFFFF"/>
-            <w:vAlign w:val="center"/>
+            <w:vAlign w:val="bottom"/>
           </w:tcPr>
           <w:p>
             <w:pPr>
               <w:ind w:firstLine="720"/>
-              <w:jc w:val="right"/>
+              <w:rPr>
+                <w:rFonts w:ascii="Times New Roman" w:hAnsi="Times New Roman" w:cs="Times New Roman"/>
+              </w:rPr>
             </w:pPr>
             <w:r>
-              <w:t>2568.5</w:t>
+              <w:rPr>
+                <w:rFonts w:ascii="Times New Roman" w:hAnsi="Times New Roman" w:cs="Times New Roman"/>
+                <w:color w:val="000000"/>
+              </w:rPr>
+              <w:t>1732.9</w:t>
             </w:r>
           </w:p>
         </w:tc>
@@ -9117,15 +9936,21 @@
           <w:tcPr>
             <w:tcW w:w="2424" w:type="dxa"/>
             <w:shd w:val="clear" w:color="auto" w:fill="FFFFFF"/>
-            <w:vAlign w:val="center"/>
+            <w:vAlign w:val="bottom"/>
           </w:tcPr>
           <w:p>
             <w:pPr>
               <w:ind w:firstLine="720"/>
-              <w:jc w:val="right"/>
+              <w:rPr>
+                <w:rFonts w:ascii="Times New Roman" w:hAnsi="Times New Roman" w:cs="Times New Roman"/>
+              </w:rPr>
             </w:pPr>
             <w:r>
-              <w:t>2404.2</w:t>
+              <w:rPr>
+                <w:rFonts w:ascii="Times New Roman" w:hAnsi="Times New Roman" w:cs="Times New Roman"/>
+                <w:color w:val="000000"/>
+              </w:rPr>
+              <w:t>1619.2</w:t>
             </w:r>
           </w:p>
         </w:tc>
@@ -9139,9 +9964,15 @@
           </w:tcPr>
           <w:p>
             <w:pPr>
-              <w:ind w:firstLine="720"/>
+              <w:jc w:val="both"/>
+              <w:rPr>
+                <w:rFonts w:ascii="Times New Roman" w:hAnsi="Times New Roman" w:cs="Times New Roman"/>
+              </w:rPr>
             </w:pPr>
             <w:r>
+              <w:rPr>
+                <w:rFonts w:ascii="Times New Roman" w:hAnsi="Times New Roman" w:cs="Times New Roman"/>
+              </w:rPr>
               <w:t>ICC</w:t>
             </w:r>
           </w:p>
@@ -9150,14 +9981,20 @@
           <w:tcPr>
             <w:tcW w:w="2430" w:type="dxa"/>
             <w:shd w:val="clear" w:color="auto" w:fill="FFFFFF"/>
-            <w:vAlign w:val="center"/>
+            <w:vAlign w:val="bottom"/>
           </w:tcPr>
           <w:p>
             <w:pPr>
               <w:ind w:firstLine="720"/>
-              <w:jc w:val="right"/>
+              <w:rPr>
+                <w:rFonts w:ascii="Times New Roman" w:hAnsi="Times New Roman" w:cs="Times New Roman"/>
+              </w:rPr>
             </w:pPr>
             <w:r>
+              <w:rPr>
+                <w:rFonts w:ascii="Times New Roman" w:hAnsi="Times New Roman" w:cs="Times New Roman"/>
+                <w:color w:val="000000"/>
+              </w:rPr>
               <w:t>0.7</w:t>
             </w:r>
           </w:p>
@@ -9166,14 +10003,20 @@
           <w:tcPr>
             <w:tcW w:w="2424" w:type="dxa"/>
             <w:shd w:val="clear" w:color="auto" w:fill="FFFFFF"/>
-            <w:vAlign w:val="center"/>
+            <w:vAlign w:val="bottom"/>
           </w:tcPr>
           <w:p>
             <w:pPr>
               <w:ind w:firstLine="720"/>
-              <w:jc w:val="right"/>
+              <w:rPr>
+                <w:rFonts w:ascii="Times New Roman" w:hAnsi="Times New Roman" w:cs="Times New Roman"/>
+              </w:rPr>
             </w:pPr>
             <w:r>
+              <w:rPr>
+                <w:rFonts w:ascii="Times New Roman" w:hAnsi="Times New Roman" w:cs="Times New Roman"/>
+                <w:color w:val="000000"/>
+              </w:rPr>
               <w:t>0.9</w:t>
             </w:r>
           </w:p>
@@ -9188,9 +10031,15 @@
           </w:tcPr>
           <w:p>
             <w:pPr>
-              <w:ind w:firstLine="720"/>
+              <w:jc w:val="both"/>
+              <w:rPr>
+                <w:rFonts w:ascii="Times New Roman" w:hAnsi="Times New Roman" w:cs="Times New Roman"/>
+              </w:rPr>
             </w:pPr>
             <w:r>
+              <w:rPr>
+                <w:rFonts w:ascii="Times New Roman" w:hAnsi="Times New Roman" w:cs="Times New Roman"/>
+              </w:rPr>
               <w:t>RMSE</w:t>
             </w:r>
           </w:p>
@@ -9199,15 +10048,21 @@
           <w:tcPr>
             <w:tcW w:w="2430" w:type="dxa"/>
             <w:shd w:val="clear" w:color="auto" w:fill="FFFFFF"/>
-            <w:vAlign w:val="center"/>
+            <w:vAlign w:val="bottom"/>
           </w:tcPr>
           <w:p>
             <w:pPr>
               <w:ind w:firstLine="720"/>
-              <w:jc w:val="right"/>
+              <w:rPr>
+                <w:rFonts w:ascii="Times New Roman" w:hAnsi="Times New Roman" w:cs="Times New Roman"/>
+              </w:rPr>
             </w:pPr>
             <w:r>
-              <w:t>11.77</w:t>
+              <w:rPr>
+                <w:rFonts w:ascii="Times New Roman" w:hAnsi="Times New Roman" w:cs="Times New Roman"/>
+                <w:color w:val="000000"/>
+              </w:rPr>
+              <w:t>12.17</w:t>
             </w:r>
           </w:p>
         </w:tc>
@@ -9215,15 +10070,21 @@
           <w:tcPr>
             <w:tcW w:w="2424" w:type="dxa"/>
             <w:shd w:val="clear" w:color="auto" w:fill="FFFFFF"/>
-            <w:vAlign w:val="center"/>
+            <w:vAlign w:val="bottom"/>
           </w:tcPr>
           <w:p>
             <w:pPr>
               <w:ind w:firstLine="720"/>
-              <w:jc w:val="right"/>
+              <w:rPr>
+                <w:rFonts w:ascii="Times New Roman" w:hAnsi="Times New Roman" w:cs="Times New Roman"/>
+              </w:rPr>
             </w:pPr>
             <w:r>
-              <w:t>8.62</w:t>
+              <w:rPr>
+                <w:rFonts w:ascii="Times New Roman" w:hAnsi="Times New Roman" w:cs="Times New Roman"/>
+                <w:color w:val="000000"/>
+              </w:rPr>
+              <w:t>8.93</w:t>
             </w:r>
           </w:p>
         </w:tc>
@@ -9237,8 +10098,17 @@
             <w:vAlign w:val="center"/>
           </w:tcPr>
           <w:p>
-            <w:r>
-              <w:t>Notes: The full model includes the admission year as a control.</w:t>
+            <w:pPr>
+              <w:jc w:val="both"/>
+            </w:pPr>
+            <w:r>
+              <w:t>Notes: The full model includes the admission year</w:t>
+            </w:r>
+            <w:r>
+              <w:t>s</w:t>
+            </w:r>
+            <w:r>
+              <w:t xml:space="preserve"> as a control.</w:t>
             </w:r>
           </w:p>
         </w:tc>
@@ -9290,6 +10160,7 @@
         <w:ind w:firstLine="720"/>
       </w:pPr>
       <w:r>
+        <w:lastRenderedPageBreak/>
         <w:t xml:space="preserve">While most hypotheses were supported, I found evidence against </w:t>
       </w:r>
       <w:r>
@@ -9335,11 +10206,7 @@
         <w:t>considers</w:t>
       </w:r>
       <w:r>
-        <w:t xml:space="preserve"> all the years and not </w:t>
-      </w:r>
-      <w:r>
-        <w:lastRenderedPageBreak/>
-        <w:t xml:space="preserve">just the </w:t>
+        <w:t xml:space="preserve"> all the years and not just the </w:t>
       </w:r>
       <w:r>
         <w:t>fifth-year</w:t>
@@ -9360,13 +10227,31 @@
         <w:ind w:firstLine="720"/>
       </w:pPr>
       <w:r>
-        <w:t xml:space="preserve">The exception to the </w:t>
+        <w:t>The</w:t>
+      </w:r>
+      <w:r>
+        <w:t>re a couple</w:t>
+      </w:r>
+      <w:r>
+        <w:t xml:space="preserve"> exception</w:t>
+      </w:r>
+      <w:r>
+        <w:t>s, or limitations,</w:t>
+      </w:r>
+      <w:r>
+        <w:t xml:space="preserve"> to </w:t>
       </w:r>
       <w:r>
         <w:t>Canadian/U.S. equivalen</w:t>
       </w:r>
       <w:r>
-        <w:t xml:space="preserve">ce is in the resettlement </w:t>
+        <w:t>ce</w:t>
+      </w:r>
+      <w:r>
+        <w:t>. Canada has a few variations on government-led resettlement, most importantly they support their refugees for a full year while the U.S. for only a couple of months. The next difference</w:t>
+      </w:r>
+      <w:r>
+        <w:t xml:space="preserve"> is in the resettlement </w:t>
       </w:r>
       <w:r>
         <w:t xml:space="preserve">programs </w:t>
@@ -9429,7 +10314,13 @@
         <w:t>incorporate</w:t>
       </w:r>
       <w:r>
-        <w:t xml:space="preserve"> this would be more inline with other </w:t>
+        <w:t xml:space="preserve"> this would be more </w:t>
+      </w:r>
+      <w:r>
+        <w:t>in line</w:t>
+      </w:r>
+      <w:r>
+        <w:t xml:space="preserve"> with other </w:t>
       </w:r>
       <w:r>
         <w:t xml:space="preserve">economic studies. </w:t>
@@ -9462,7 +10353,11 @@
         <w:t>capita</w:t>
       </w:r>
       <w:r>
-        <w:t xml:space="preserve"> funding than Canada, which has higher, in the short term. The arguments raised by researchers focus on the long term. This study simply identifies that</w:t>
+        <w:t xml:space="preserve"> </w:t>
+      </w:r>
+      <w:r>
+        <w:lastRenderedPageBreak/>
+        <w:t>funding than Canada, which has higher, in the short term. The arguments raised by researchers focus on the long term. This study simply identifies that</w:t>
       </w:r>
       <w:r>
         <w:t xml:space="preserve"> in the short term, we don’t see much gain increasing the funding per capita nor in increasing the </w:t>
@@ -9486,47 +10381,123 @@
         <w:ind w:firstLine="720"/>
       </w:pPr>
       <w:r>
-        <w:t xml:space="preserve">These results have policy implications. Male-headed households are not using public assistance programs at the same rate as female ones. Perhaps this is an advantage </w:t>
+        <w:t>These results have</w:t>
+      </w:r>
+      <w:r>
+        <w:t xml:space="preserve"> urgent</w:t>
+      </w:r>
+      <w:r>
+        <w:t xml:space="preserve"> policy implications. Male-headed households are not using public assistance programs at the same rate as female ones. Perhaps this is an advantage or privileged male</w:t>
+      </w:r>
+      <w:r>
+        <w:t xml:space="preserve"> </w:t>
+      </w:r>
+      <w:r>
+        <w:t>households have, or alternatively an unwillingness to use public assistance programs that may hold these households back</w:t>
+      </w:r>
+      <w:r>
+        <w:t xml:space="preserve"> in the future</w:t>
+      </w:r>
+      <w:r>
+        <w:t>. The U.S. invests much less money into its government resettlement program per refugee but still receives comparable outcomes to the Canadian counterpart.</w:t>
+      </w:r>
+      <w:r>
+        <w:t xml:space="preserve"> Identifying why this might be the case beyond these exploratory </w:t>
+      </w:r>
+      <w:r>
+        <w:t>thoughts can help governments be more efficient.</w:t>
+      </w:r>
+      <w:r>
+        <w:t xml:space="preserve"> Additionally, the superior outcomes of the private assistance program are a good sign for the start of the U.S. private resettlement route</w:t>
+      </w:r>
+      <w:r>
+        <w:t xml:space="preserve"> in 2023</w:t>
+      </w:r>
+      <w:r>
+        <w:t xml:space="preserve">: </w:t>
+      </w:r>
+      <w:commentRangeStart w:id="14"/>
+      <w:r>
+        <w:t>the Welcome Corps</w:t>
+      </w:r>
+      <w:commentRangeEnd w:id="14"/>
+      <w:r>
+        <w:rPr>
+          <w:rStyle w:val="CommentReference"/>
+        </w:rPr>
+        <w:commentReference w:id="14"/>
+      </w:r>
+      <w:r>
+        <w:t>.</w:t>
+      </w:r>
+      <w:r>
+        <w:t xml:space="preserve"> The Welcome Corps is the American private resettlement system set up after the Canadian model. Five citizens/permeant residents can band together to support refugees for 90 days in the stead of the State Department. The whole U.S. Refugee Assistance program, including the  Welcome Corps, is currently suspended and under review</w:t>
+      </w:r>
+      <w:r>
+        <w:t xml:space="preserve"> for its existence</w:t>
+      </w:r>
+      <w:r>
+        <w:t xml:space="preserve"> due to the Trump administration’s “</w:t>
+      </w:r>
+      <w:r>
+        <w:t>Executive Order on “Realigning the United States Refugee Admissions Program</w:t>
+      </w:r>
+      <w:r>
+        <w:t xml:space="preserve">” </w:t>
+      </w:r>
+      <w:r>
+        <w:fldChar w:fldCharType="begin"/>
+      </w:r>
+      <w:r>
+        <w:instrText xml:space="preserve"> ADDIN ZOTERO_ITEM CSL_CITATION {"citationID":"wTPgO09b","properties":{"formattedCitation":"(The White House 2025)","plainCitation":"(The White House 2025)","noteIndex":0},"citationItems":[{"id":1374,"uris":["http://zotero.org/users/6152647/items/7VEVPZLJ"],"itemData":{"id":1374,"type":"webpage","abstract":"REALIGNING THE United States REFUGEE ADMISSIONS PROGRAM By the authority vested in me as President by the Constitution and the laws of the United States","container-title":"The White House","language":"en-US","title":"Realigning the United States Refugee Admissions Program","URL":"https://www.whitehouse.gov/presidential-actions/2025/01/realigning-the-united-states-refugee-admissions-program/","author":[{"literal":"The White House"}],"accessed":{"date-parts":[["2025",1,24]]},"issued":{"date-parts":[["2025",1,21]]}}}],"schema":"https://github.com/citation-style-language/schema/raw/master/csl-citation.json"} </w:instrText>
+      </w:r>
+      <w:r>
+        <w:fldChar w:fldCharType="separate"/>
+      </w:r>
+      <w:r>
+        <w:rPr>
+          <w:rFonts w:ascii="Aptos" w:hAnsi="Aptos"/>
+        </w:rPr>
+        <w:t>(The White House 2025)</w:t>
+      </w:r>
+      <w:r>
+        <w:fldChar w:fldCharType="end"/>
+      </w:r>
+      <w:r>
+        <w:t xml:space="preserve">. This is </w:t>
+      </w:r>
+      <w:r>
+        <w:t>unfortunate, as</w:t>
+      </w:r>
+      <w:r>
+        <w:t xml:space="preserve"> the U.S. resettlement program is not only the largest </w:t>
+      </w:r>
+      <w:proofErr w:type="spellStart"/>
+      <w:r>
+        <w:t>resettler</w:t>
+      </w:r>
+      <w:proofErr w:type="spellEnd"/>
+      <w:r>
+        <w:t xml:space="preserve"> of refugees, but also the most efficient</w:t>
+      </w:r>
+      <w:r>
+        <w:t xml:space="preserve"> </w:t>
       </w:r>
       <w:r>
         <w:lastRenderedPageBreak/>
-        <w:t>or privileged male</w:t>
-      </w:r>
-      <w:ins w:id="14" w:author="Lariscy, Joseph" w:date="2024-12-18T10:37:00Z" w16du:dateUtc="2024-12-18T16:37:00Z">
-        <w:r>
-          <w:t xml:space="preserve"> </w:t>
-        </w:r>
-      </w:ins>
-      <w:del w:id="15" w:author="Lariscy, Joseph" w:date="2024-12-18T10:37:00Z" w16du:dateUtc="2024-12-18T16:37:00Z">
-        <w:r>
-          <w:delText>-</w:delText>
-        </w:r>
-      </w:del>
-      <w:r>
-        <w:t>households have, or alternatively an unwillingness to use public assistance programs that may hold these households back. The U.S. invests much less money into its government resettlement program per refugee but still receives comparable outcomes to the Canadian counterpart.</w:t>
-      </w:r>
-      <w:r>
-        <w:t xml:space="preserve"> Identifying why this might be the case beyond these exploratory </w:t>
-      </w:r>
-      <w:r>
-        <w:t>thoughts can help governments be more efficient.</w:t>
-      </w:r>
-      <w:r>
-        <w:t xml:space="preserve"> Additionally, the superior outcomes of the private assistance program are a good sign for the start of the U.S. private resettlement route</w:t>
-      </w:r>
-      <w:r>
-        <w:t xml:space="preserve">: </w:t>
-      </w:r>
-      <w:commentRangeStart w:id="16"/>
-      <w:r>
-        <w:t>the Welcome Corps</w:t>
-      </w:r>
-      <w:commentRangeEnd w:id="16"/>
-      <w:r>
-        <w:rPr>
-          <w:rStyle w:val="CommentReference"/>
-        </w:rPr>
-        <w:commentReference w:id="16"/>
+        <w:t>government-led resettlement</w:t>
+      </w:r>
+      <w:r>
+        <w:t xml:space="preserve"> in per capita spending. Based on this evidence, the Welcome Corp </w:t>
+      </w:r>
+      <w:r>
+        <w:t>is</w:t>
+      </w:r>
+      <w:r>
+        <w:t xml:space="preserve"> likely even more efficient</w:t>
+      </w:r>
+      <w:r>
+        <w:t xml:space="preserve"> and with better outcomes</w:t>
       </w:r>
       <w:r>
         <w:t xml:space="preserve">. </w:t>
@@ -9535,18 +10506,24 @@
     <w:p>
       <w:pPr>
         <w:spacing w:line="480" w:lineRule="auto"/>
+        <w:ind w:firstLine="720"/>
       </w:pPr>
     </w:p>
     <w:p>
       <w:pPr>
-        <w:spacing w:after="0" w:line="240" w:lineRule="auto"/>
-      </w:pPr>
-      <w:r>
-        <w:br w:type="page"/>
-      </w:r>
+        <w:spacing w:line="480" w:lineRule="auto"/>
+      </w:pPr>
     </w:p>
     <w:p>
       <w:pPr>
+        <w:spacing w:after="0" w:line="240" w:lineRule="auto"/>
+      </w:pPr>
+      <w:r>
+        <w:br w:type="page"/>
+      </w:r>
+    </w:p>
+    <w:p>
+      <w:pPr>
         <w:pStyle w:val="Bibliography"/>
         <w:spacing w:line="480" w:lineRule="auto"/>
       </w:pPr>
@@ -9602,11 +10579,19 @@
           <w:rFonts w:ascii="Aptos" w:hAnsi="Aptos"/>
         </w:rPr>
       </w:pPr>
-      <w:r>
-        <w:rPr>
-          <w:rFonts w:ascii="Aptos" w:hAnsi="Aptos"/>
-        </w:rPr>
-        <w:t xml:space="preserve">Bloemraad, Irene. 2011. “‘Two Peas in a Pod,’ ‘Apples and Oranges,’ and Other Food Metaphors: Comparing Canada and the United States.” </w:t>
+      <w:proofErr w:type="spellStart"/>
+      <w:r>
+        <w:rPr>
+          <w:rFonts w:ascii="Aptos" w:hAnsi="Aptos"/>
+        </w:rPr>
+        <w:t>Bloemraad</w:t>
+      </w:r>
+      <w:proofErr w:type="spellEnd"/>
+      <w:r>
+        <w:rPr>
+          <w:rFonts w:ascii="Aptos" w:hAnsi="Aptos"/>
+        </w:rPr>
+        <w:t xml:space="preserve">, Irene. 2011. “‘Two Peas in a Pod,’ ‘Apples and Oranges,’ and Other Food Metaphors: Comparing Canada and the United States.” </w:t>
       </w:r>
       <w:r>
         <w:rPr>
@@ -9620,7 +10605,21 @@
         <w:rPr>
           <w:rFonts w:ascii="Aptos" w:hAnsi="Aptos"/>
         </w:rPr>
-        <w:t xml:space="preserve"> 55(9):1131–59. doi: 10.1177/0002764211407844.</w:t>
+        <w:t xml:space="preserve"> 55(9):1131–59. </w:t>
+      </w:r>
+      <w:proofErr w:type="spellStart"/>
+      <w:r>
+        <w:rPr>
+          <w:rFonts w:ascii="Aptos" w:hAnsi="Aptos"/>
+        </w:rPr>
+        <w:t>doi</w:t>
+      </w:r>
+      <w:proofErr w:type="spellEnd"/>
+      <w:r>
+        <w:rPr>
+          <w:rFonts w:ascii="Aptos" w:hAnsi="Aptos"/>
+        </w:rPr>
+        <w:t>: 10.1177/0002764211407844.</w:t>
       </w:r>
     </w:p>
     <w:p>
@@ -9630,11 +10629,19 @@
           <w:rFonts w:ascii="Aptos" w:hAnsi="Aptos"/>
         </w:rPr>
       </w:pPr>
-      <w:r>
-        <w:rPr>
-          <w:rFonts w:ascii="Aptos" w:hAnsi="Aptos"/>
-        </w:rPr>
-        <w:t xml:space="preserve">Bloemraad, Irene. 2013. “The Promise and Pitfalls of Comparative Research Design in the Study of Migration.” </w:t>
+      <w:proofErr w:type="spellStart"/>
+      <w:r>
+        <w:rPr>
+          <w:rFonts w:ascii="Aptos" w:hAnsi="Aptos"/>
+        </w:rPr>
+        <w:t>Bloemraad</w:t>
+      </w:r>
+      <w:proofErr w:type="spellEnd"/>
+      <w:r>
+        <w:rPr>
+          <w:rFonts w:ascii="Aptos" w:hAnsi="Aptos"/>
+        </w:rPr>
+        <w:t xml:space="preserve">, Irene. 2013. “The Promise and Pitfalls of Comparative Research Design in the Study of Migration.” </w:t>
       </w:r>
       <w:r>
         <w:rPr>
@@ -9648,7 +10655,21 @@
         <w:rPr>
           <w:rFonts w:ascii="Aptos" w:hAnsi="Aptos"/>
         </w:rPr>
-        <w:t xml:space="preserve"> 1(1):27–46. doi: 10.1093/migration/mns035.</w:t>
+        <w:t xml:space="preserve"> 1(1):27–46. </w:t>
+      </w:r>
+      <w:proofErr w:type="spellStart"/>
+      <w:r>
+        <w:rPr>
+          <w:rFonts w:ascii="Aptos" w:hAnsi="Aptos"/>
+        </w:rPr>
+        <w:t>doi</w:t>
+      </w:r>
+      <w:proofErr w:type="spellEnd"/>
+      <w:r>
+        <w:rPr>
+          <w:rFonts w:ascii="Aptos" w:hAnsi="Aptos"/>
+        </w:rPr>
+        <w:t>: 10.1093/migration/mns035.</w:t>
       </w:r>
     </w:p>
     <w:p>
@@ -9676,7 +10697,21 @@
         <w:rPr>
           <w:rFonts w:ascii="Aptos" w:hAnsi="Aptos"/>
         </w:rPr>
-        <w:t>. doi: 10.1080/14650045.2020.1781820.</w:t>
+        <w:t xml:space="preserve">. </w:t>
+      </w:r>
+      <w:proofErr w:type="spellStart"/>
+      <w:r>
+        <w:rPr>
+          <w:rFonts w:ascii="Aptos" w:hAnsi="Aptos"/>
+        </w:rPr>
+        <w:t>doi</w:t>
+      </w:r>
+      <w:proofErr w:type="spellEnd"/>
+      <w:r>
+        <w:rPr>
+          <w:rFonts w:ascii="Aptos" w:hAnsi="Aptos"/>
+        </w:rPr>
+        <w:t>: 10.1080/14650045.2020.1781820.</w:t>
       </w:r>
     </w:p>
     <w:p>
@@ -9802,7 +10837,21 @@
         <w:rPr>
           <w:rFonts w:ascii="Aptos" w:hAnsi="Aptos"/>
         </w:rPr>
-        <w:t xml:space="preserve">Connor, Jynnah Radford and Phillip. 2019. “Canada Now Leads the World in Refugee Resettlement, Surpassing the U.S.” </w:t>
+        <w:t xml:space="preserve">Connor, </w:t>
+      </w:r>
+      <w:proofErr w:type="spellStart"/>
+      <w:r>
+        <w:rPr>
+          <w:rFonts w:ascii="Aptos" w:hAnsi="Aptos"/>
+        </w:rPr>
+        <w:t>Jynnah</w:t>
+      </w:r>
+      <w:proofErr w:type="spellEnd"/>
+      <w:r>
+        <w:rPr>
+          <w:rFonts w:ascii="Aptos" w:hAnsi="Aptos"/>
+        </w:rPr>
+        <w:t xml:space="preserve"> Radford and Phillip. 2019. “Canada Now Leads the World in Refugee Resettlement, Surpassing the U.S.” </w:t>
       </w:r>
       <w:r>
         <w:rPr>
@@ -9901,7 +10950,21 @@
         <w:rPr>
           <w:rFonts w:ascii="Aptos" w:hAnsi="Aptos"/>
         </w:rPr>
-        <w:t xml:space="preserve"> 690(1):7–35. doi: 10.1177/0002716220943169.</w:t>
+        <w:t xml:space="preserve"> 690(1):7–35. </w:t>
+      </w:r>
+      <w:proofErr w:type="spellStart"/>
+      <w:r>
+        <w:rPr>
+          <w:rFonts w:ascii="Aptos" w:hAnsi="Aptos"/>
+        </w:rPr>
+        <w:t>doi</w:t>
+      </w:r>
+      <w:proofErr w:type="spellEnd"/>
+      <w:r>
+        <w:rPr>
+          <w:rFonts w:ascii="Aptos" w:hAnsi="Aptos"/>
+        </w:rPr>
+        <w:t>: 10.1177/0002716220943169.</w:t>
       </w:r>
     </w:p>
     <w:p>
@@ -9929,7 +10992,21 @@
         <w:rPr>
           <w:rFonts w:ascii="Aptos" w:hAnsi="Aptos"/>
         </w:rPr>
-        <w:t>. w23498. National Bureau of Economic Research. doi: 10.3386/w23498.</w:t>
+        <w:t xml:space="preserve">. w23498. National Bureau of Economic Research. </w:t>
+      </w:r>
+      <w:proofErr w:type="spellStart"/>
+      <w:r>
+        <w:rPr>
+          <w:rFonts w:ascii="Aptos" w:hAnsi="Aptos"/>
+        </w:rPr>
+        <w:t>doi</w:t>
+      </w:r>
+      <w:proofErr w:type="spellEnd"/>
+      <w:r>
+        <w:rPr>
+          <w:rFonts w:ascii="Aptos" w:hAnsi="Aptos"/>
+        </w:rPr>
+        <w:t>: 10.3386/w23498.</w:t>
       </w:r>
     </w:p>
     <w:p>
@@ -10027,7 +11104,21 @@
         <w:rPr>
           <w:rFonts w:ascii="Aptos" w:hAnsi="Aptos"/>
         </w:rPr>
-        <w:t xml:space="preserve">International Organization For Migration. 2023. “Refugees and Asylum-Seekers.” </w:t>
+        <w:t xml:space="preserve">International Organization </w:t>
+      </w:r>
+      <w:proofErr w:type="gramStart"/>
+      <w:r>
+        <w:rPr>
+          <w:rFonts w:ascii="Aptos" w:hAnsi="Aptos"/>
+        </w:rPr>
+        <w:t>For</w:t>
+      </w:r>
+      <w:proofErr w:type="gramEnd"/>
+      <w:r>
+        <w:rPr>
+          <w:rFonts w:ascii="Aptos" w:hAnsi="Aptos"/>
+        </w:rPr>
+        <w:t xml:space="preserve"> Migration. 2023. “Refugees and Asylum-Seekers.” </w:t>
       </w:r>
       <w:r>
         <w:rPr>
@@ -10055,7 +11146,21 @@
         <w:rPr>
           <w:rFonts w:ascii="Aptos" w:hAnsi="Aptos"/>
         </w:rPr>
-        <w:t xml:space="preserve">Kneebone, Susan, and Felicity Rawlings-Sanaei, eds. 2007. </w:t>
+        <w:t>Kneebone, Susan, and Felicity Rawlings-</w:t>
+      </w:r>
+      <w:proofErr w:type="spellStart"/>
+      <w:r>
+        <w:rPr>
+          <w:rFonts w:ascii="Aptos" w:hAnsi="Aptos"/>
+        </w:rPr>
+        <w:t>Sanaei</w:t>
+      </w:r>
+      <w:proofErr w:type="spellEnd"/>
+      <w:r>
+        <w:rPr>
+          <w:rFonts w:ascii="Aptos" w:hAnsi="Aptos"/>
+        </w:rPr>
+        <w:t xml:space="preserve">, eds. 2007. </w:t>
       </w:r>
       <w:r>
         <w:rPr>
@@ -10069,7 +11174,21 @@
         <w:rPr>
           <w:rFonts w:ascii="Aptos" w:hAnsi="Aptos"/>
         </w:rPr>
-        <w:t>. 1st edition. New York: Berghahn Books.</w:t>
+        <w:t xml:space="preserve">. 1st edition. New York: </w:t>
+      </w:r>
+      <w:proofErr w:type="spellStart"/>
+      <w:r>
+        <w:rPr>
+          <w:rFonts w:ascii="Aptos" w:hAnsi="Aptos"/>
+        </w:rPr>
+        <w:t>Berghahn</w:t>
+      </w:r>
+      <w:proofErr w:type="spellEnd"/>
+      <w:r>
+        <w:rPr>
+          <w:rFonts w:ascii="Aptos" w:hAnsi="Aptos"/>
+        </w:rPr>
+        <w:t xml:space="preserve"> Books.</w:t>
       </w:r>
     </w:p>
     <w:p>
@@ -10097,7 +11216,21 @@
         <w:rPr>
           <w:rFonts w:ascii="Aptos" w:hAnsi="Aptos"/>
         </w:rPr>
-        <w:t xml:space="preserve"> 1st edition. Arlington, Virginia: Mercatus Center at George Mason University.</w:t>
+        <w:t xml:space="preserve"> 1st edition. Arlington, Virginia: </w:t>
+      </w:r>
+      <w:proofErr w:type="spellStart"/>
+      <w:r>
+        <w:rPr>
+          <w:rFonts w:ascii="Aptos" w:hAnsi="Aptos"/>
+        </w:rPr>
+        <w:t>Mercatus</w:t>
+      </w:r>
+      <w:proofErr w:type="spellEnd"/>
+      <w:r>
+        <w:rPr>
+          <w:rFonts w:ascii="Aptos" w:hAnsi="Aptos"/>
+        </w:rPr>
+        <w:t xml:space="preserve"> Center at George Mason University.</w:t>
       </w:r>
     </w:p>
     <w:p>
@@ -10111,7 +11244,49 @@
         <w:rPr>
           <w:rFonts w:ascii="Aptos" w:hAnsi="Aptos"/>
         </w:rPr>
-        <w:t xml:space="preserve">Nam, Yunju, Amanda Hausmann, Wooksoo Kim, and Sarah Richards-Desai. 2021. “Welfare-Dependent Refugees?: Evidence from County Welfare Management System Data in Western New York.” </w:t>
+        <w:t xml:space="preserve">Nam, </w:t>
+      </w:r>
+      <w:proofErr w:type="spellStart"/>
+      <w:r>
+        <w:rPr>
+          <w:rFonts w:ascii="Aptos" w:hAnsi="Aptos"/>
+        </w:rPr>
+        <w:t>Yunju</w:t>
+      </w:r>
+      <w:proofErr w:type="spellEnd"/>
+      <w:r>
+        <w:rPr>
+          <w:rFonts w:ascii="Aptos" w:hAnsi="Aptos"/>
+        </w:rPr>
+        <w:t xml:space="preserve">, Amanda Hausmann, </w:t>
+      </w:r>
+      <w:proofErr w:type="spellStart"/>
+      <w:r>
+        <w:rPr>
+          <w:rFonts w:ascii="Aptos" w:hAnsi="Aptos"/>
+        </w:rPr>
+        <w:t>Wooksoo</w:t>
+      </w:r>
+      <w:proofErr w:type="spellEnd"/>
+      <w:r>
+        <w:rPr>
+          <w:rFonts w:ascii="Aptos" w:hAnsi="Aptos"/>
+        </w:rPr>
+        <w:t xml:space="preserve"> Kim, and Sarah Richards-Desai. 2021. “Welfare-Dependent </w:t>
+      </w:r>
+      <w:proofErr w:type="gramStart"/>
+      <w:r>
+        <w:rPr>
+          <w:rFonts w:ascii="Aptos" w:hAnsi="Aptos"/>
+        </w:rPr>
+        <w:t>Refugees?:</w:t>
+      </w:r>
+      <w:proofErr w:type="gramEnd"/>
+      <w:r>
+        <w:rPr>
+          <w:rFonts w:ascii="Aptos" w:hAnsi="Aptos"/>
+        </w:rPr>
+        <w:t xml:space="preserve"> Evidence from County Welfare Management System Data in Western New York.” </w:t>
       </w:r>
       <w:r>
         <w:rPr>
@@ -10125,7 +11300,21 @@
         <w:rPr>
           <w:rFonts w:ascii="Aptos" w:hAnsi="Aptos"/>
         </w:rPr>
-        <w:t xml:space="preserve"> 0(0):1–14. doi: 10.1080/15562948.2021.1923880.</w:t>
+        <w:t xml:space="preserve"> 0(0):1–14. </w:t>
+      </w:r>
+      <w:proofErr w:type="spellStart"/>
+      <w:r>
+        <w:rPr>
+          <w:rFonts w:ascii="Aptos" w:hAnsi="Aptos"/>
+        </w:rPr>
+        <w:t>doi</w:t>
+      </w:r>
+      <w:proofErr w:type="spellEnd"/>
+      <w:r>
+        <w:rPr>
+          <w:rFonts w:ascii="Aptos" w:hAnsi="Aptos"/>
+        </w:rPr>
+        <w:t>: 10.1080/15562948.2021.1923880.</w:t>
       </w:r>
     </w:p>
     <w:p>
@@ -10154,7 +11343,35 @@
         <w:rPr>
           <w:rFonts w:ascii="Aptos" w:hAnsi="Aptos"/>
         </w:rPr>
-        <w:t xml:space="preserve"> (12). doi: 10.1093/jrs/feaa012.</w:t>
+        <w:t xml:space="preserve"> (12). </w:t>
+      </w:r>
+      <w:proofErr w:type="spellStart"/>
+      <w:r>
+        <w:rPr>
+          <w:rFonts w:ascii="Aptos" w:hAnsi="Aptos"/>
+        </w:rPr>
+        <w:t>doi</w:t>
+      </w:r>
+      <w:proofErr w:type="spellEnd"/>
+      <w:r>
+        <w:rPr>
+          <w:rFonts w:ascii="Aptos" w:hAnsi="Aptos"/>
+        </w:rPr>
+        <w:t>: 10.1093/</w:t>
+      </w:r>
+      <w:proofErr w:type="spellStart"/>
+      <w:r>
+        <w:rPr>
+          <w:rFonts w:ascii="Aptos" w:hAnsi="Aptos"/>
+        </w:rPr>
+        <w:t>jrs</w:t>
+      </w:r>
+      <w:proofErr w:type="spellEnd"/>
+      <w:r>
+        <w:rPr>
+          <w:rFonts w:ascii="Aptos" w:hAnsi="Aptos"/>
+        </w:rPr>
+        <w:t>/feaa012.</w:t>
       </w:r>
     </w:p>
     <w:p>
@@ -10196,7 +11413,35 @@
         <w:rPr>
           <w:rFonts w:ascii="Aptos" w:hAnsi="Aptos"/>
         </w:rPr>
-        <w:t xml:space="preserve"> 23(4):589–607. doi: 10.1093/jrs/feq046.</w:t>
+        <w:t xml:space="preserve"> 23(4):589–607. </w:t>
+      </w:r>
+      <w:proofErr w:type="spellStart"/>
+      <w:r>
+        <w:rPr>
+          <w:rFonts w:ascii="Aptos" w:hAnsi="Aptos"/>
+        </w:rPr>
+        <w:t>doi</w:t>
+      </w:r>
+      <w:proofErr w:type="spellEnd"/>
+      <w:r>
+        <w:rPr>
+          <w:rFonts w:ascii="Aptos" w:hAnsi="Aptos"/>
+        </w:rPr>
+        <w:t>: 10.1093/</w:t>
+      </w:r>
+      <w:proofErr w:type="spellStart"/>
+      <w:r>
+        <w:rPr>
+          <w:rFonts w:ascii="Aptos" w:hAnsi="Aptos"/>
+        </w:rPr>
+        <w:t>jrs</w:t>
+      </w:r>
+      <w:proofErr w:type="spellEnd"/>
+      <w:r>
+        <w:rPr>
+          <w:rFonts w:ascii="Aptos" w:hAnsi="Aptos"/>
+        </w:rPr>
+        <w:t>/feq046.</w:t>
       </w:r>
     </w:p>
     <w:p>
@@ -10238,7 +11483,21 @@
         <w:rPr>
           <w:rFonts w:ascii="Aptos" w:hAnsi="Aptos"/>
         </w:rPr>
-        <w:t xml:space="preserve"> 7(3):221–27. doi: 10.1080/15562940903150030.</w:t>
+        <w:t xml:space="preserve"> 7(3):221–27. </w:t>
+      </w:r>
+      <w:proofErr w:type="spellStart"/>
+      <w:r>
+        <w:rPr>
+          <w:rFonts w:ascii="Aptos" w:hAnsi="Aptos"/>
+        </w:rPr>
+        <w:t>doi</w:t>
+      </w:r>
+      <w:proofErr w:type="spellEnd"/>
+      <w:r>
+        <w:rPr>
+          <w:rFonts w:ascii="Aptos" w:hAnsi="Aptos"/>
+        </w:rPr>
+        <w:t>: 10.1080/15562940903150030.</w:t>
       </w:r>
     </w:p>
     <w:p>
@@ -10252,7 +11511,7 @@
         <w:rPr>
           <w:rFonts w:ascii="Aptos" w:hAnsi="Aptos"/>
         </w:rPr>
-        <w:t xml:space="preserve">Tran, Van C., and Francisco Lara-García. 2020. “A New Beginning: Early Refugee Integration in the United States.” </w:t>
+        <w:t xml:space="preserve">The White House. 2025. “Realigning the United States Refugee Admissions Program.” </w:t>
       </w:r>
       <w:r>
         <w:rPr>
@@ -10260,13 +11519,13 @@
           <w:i/>
           <w:iCs/>
         </w:rPr>
-        <w:t>RSF: The Russell Sage Foundation Journal of the Social Sciences</w:t>
-      </w:r>
-      <w:r>
-        <w:rPr>
-          <w:rFonts w:ascii="Aptos" w:hAnsi="Aptos"/>
-        </w:rPr>
-        <w:t xml:space="preserve"> 6(3):117–49. doi: 10.7758/RSF.2020.6.3.06.</w:t>
+        <w:t>The White House</w:t>
+      </w:r>
+      <w:r>
+        <w:rPr>
+          <w:rFonts w:ascii="Aptos" w:hAnsi="Aptos"/>
+        </w:rPr>
+        <w:t>. Retrieved January 24, 2025 (https://www.whitehouse.gov/presidential-actions/2025/01/realigning-the-united-states-refugee-admissions-program/).</w:t>
       </w:r>
     </w:p>
     <w:p>
@@ -10280,7 +11539,7 @@
         <w:rPr>
           <w:rFonts w:ascii="Aptos" w:hAnsi="Aptos"/>
         </w:rPr>
-        <w:t xml:space="preserve">UNHCR Canada. 2024. “Refugee Resettlement to Canada.” </w:t>
+        <w:t xml:space="preserve">Tran, Van C., and Francisco Lara-García. 2020. “A New Beginning: Early Refugee Integration in the United States.” </w:t>
       </w:r>
       <w:r>
         <w:rPr>
@@ -10288,13 +11547,27 @@
           <w:i/>
           <w:iCs/>
         </w:rPr>
-        <w:t>UNHCR Canada</w:t>
-      </w:r>
-      <w:r>
-        <w:rPr>
-          <w:rFonts w:ascii="Aptos" w:hAnsi="Aptos"/>
-        </w:rPr>
-        <w:t>. Retrieved December 12, 2024 (https://help.unhcr.org/canada/refugee-resettlement-to-canada/).</w:t>
+        <w:t>RSF: The Russell Sage Foundation Journal of the Social Sciences</w:t>
+      </w:r>
+      <w:r>
+        <w:rPr>
+          <w:rFonts w:ascii="Aptos" w:hAnsi="Aptos"/>
+        </w:rPr>
+        <w:t xml:space="preserve"> 6(3):117–49. </w:t>
+      </w:r>
+      <w:proofErr w:type="spellStart"/>
+      <w:r>
+        <w:rPr>
+          <w:rFonts w:ascii="Aptos" w:hAnsi="Aptos"/>
+        </w:rPr>
+        <w:t>doi</w:t>
+      </w:r>
+      <w:proofErr w:type="spellEnd"/>
+      <w:r>
+        <w:rPr>
+          <w:rFonts w:ascii="Aptos" w:hAnsi="Aptos"/>
+        </w:rPr>
+        <w:t>: 10.7758/RSF.2020.6.3.06.</w:t>
       </w:r>
     </w:p>
     <w:p>
@@ -10308,7 +11581,7 @@
         <w:rPr>
           <w:rFonts w:ascii="Aptos" w:hAnsi="Aptos"/>
         </w:rPr>
-        <w:t xml:space="preserve">United States Department of State. 2021. “Reception and Placement.” </w:t>
+        <w:t xml:space="preserve">UNHCR Canada. 2024. “Refugee Resettlement to Canada.” </w:t>
       </w:r>
       <w:r>
         <w:rPr>
@@ -10316,13 +11589,13 @@
           <w:i/>
           <w:iCs/>
         </w:rPr>
-        <w:t>United States Department of State</w:t>
-      </w:r>
-      <w:r>
-        <w:rPr>
-          <w:rFonts w:ascii="Aptos" w:hAnsi="Aptos"/>
-        </w:rPr>
-        <w:t>. Retrieved October 28, 2021 (https://www.state.gov/refugee-admissions/reception-and-placement/).</w:t>
+        <w:t>UNHCR Canada</w:t>
+      </w:r>
+      <w:r>
+        <w:rPr>
+          <w:rFonts w:ascii="Aptos" w:hAnsi="Aptos"/>
+        </w:rPr>
+        <w:t>. Retrieved December 12, 2024 (https://help.unhcr.org/canada/refugee-resettlement-to-canada/).</w:t>
       </w:r>
     </w:p>
     <w:p>
@@ -10336,7 +11609,7 @@
         <w:rPr>
           <w:rFonts w:ascii="Aptos" w:hAnsi="Aptos"/>
         </w:rPr>
-        <w:t xml:space="preserve">United States Office of Refugee Resettlement. 2021. </w:t>
+        <w:t xml:space="preserve">United States Department of State. 2021. “Reception and Placement.” </w:t>
       </w:r>
       <w:r>
         <w:rPr>
@@ -10344,13 +11617,13 @@
           <w:i/>
           <w:iCs/>
         </w:rPr>
-        <w:t>Annual Report to Congress 2018</w:t>
-      </w:r>
-      <w:r>
-        <w:rPr>
-          <w:rFonts w:ascii="Aptos" w:hAnsi="Aptos"/>
-        </w:rPr>
-        <w:t>. Office of Refugee Resettlement.</w:t>
+        <w:t>United States Department of State</w:t>
+      </w:r>
+      <w:r>
+        <w:rPr>
+          <w:rFonts w:ascii="Aptos" w:hAnsi="Aptos"/>
+        </w:rPr>
+        <w:t>. Retrieved October 28, 2021 (https://www.state.gov/refugee-admissions/reception-and-placement/).</w:t>
       </w:r>
     </w:p>
     <w:p>
@@ -10364,7 +11637,7 @@
         <w:rPr>
           <w:rFonts w:ascii="Aptos" w:hAnsi="Aptos"/>
         </w:rPr>
-        <w:t xml:space="preserve">U.S. Department of Homeland Security. 2022. “Public Charge Ground of Inadmissibility.” </w:t>
+        <w:t xml:space="preserve">United States Office of Refugee Resettlement. 2021. </w:t>
       </w:r>
       <w:r>
         <w:rPr>
@@ -10372,13 +11645,13 @@
           <w:i/>
           <w:iCs/>
         </w:rPr>
-        <w:t>Federal Register</w:t>
-      </w:r>
-      <w:r>
-        <w:rPr>
-          <w:rFonts w:ascii="Aptos" w:hAnsi="Aptos"/>
-        </w:rPr>
-        <w:t>. Retrieved December 11, 2024 (https://www.federalregister.gov/documents/2022/09/09/2022-18867/public-charge-ground-of-inadmissibility).</w:t>
+        <w:t>Annual Report to Congress 2018</w:t>
+      </w:r>
+      <w:r>
+        <w:rPr>
+          <w:rFonts w:ascii="Aptos" w:hAnsi="Aptos"/>
+        </w:rPr>
+        <w:t>. Office of Refugee Resettlement.</w:t>
       </w:r>
     </w:p>
     <w:p>
@@ -10392,14 +11665,43 @@
         <w:rPr>
           <w:rFonts w:ascii="Aptos" w:hAnsi="Aptos"/>
         </w:rPr>
-        <w:t>U.S. Department of the Treasury. 2024. “Treasury Reporting Rates of Exchange.”</w:t>
+        <w:t xml:space="preserve">U.S. Department of Homeland Security. 2022. “Public Charge Ground of Inadmissibility.” </w:t>
+      </w:r>
+      <w:r>
+        <w:rPr>
+          <w:rFonts w:ascii="Aptos" w:hAnsi="Aptos"/>
+          <w:i/>
+          <w:iCs/>
+        </w:rPr>
+        <w:t>Federal Register</w:t>
+      </w:r>
+      <w:r>
+        <w:rPr>
+          <w:rFonts w:ascii="Aptos" w:hAnsi="Aptos"/>
+        </w:rPr>
+        <w:t>. Retrieved December 11, 2024 (https://www.federalregister.gov/documents/2022/09/09/2022-18867/public-charge-ground-of-inadmissibility).</w:t>
       </w:r>
     </w:p>
     <w:p>
       <w:pPr>
+        <w:pStyle w:val="Bibliography"/>
+        <w:rPr>
+          <w:rFonts w:ascii="Aptos" w:hAnsi="Aptos"/>
+        </w:rPr>
+      </w:pPr>
+      <w:r>
+        <w:rPr>
+          <w:rFonts w:ascii="Aptos" w:hAnsi="Aptos"/>
+        </w:rPr>
+        <w:t>U.S. Department of the Treasury. 2024. “Treasury Reporting Rates of Exchange.”</w:t>
+      </w:r>
+    </w:p>
+    <w:p>
+      <w:pPr>
         <w:spacing w:line="480" w:lineRule="auto"/>
       </w:pPr>
       <w:r>
+        <w:lastRenderedPageBreak/>
         <w:fldChar w:fldCharType="end"/>
       </w:r>
     </w:p>
@@ -10533,7 +11835,7 @@
       </w:r>
     </w:p>
   </w:comment>
-  <w:comment w:id="16" w:author="Lariscy, Joseph" w:date="2024-12-18T10:38:00Z" w:initials="JL">
+  <w:comment w:id="14" w:author="Lariscy, Joseph" w:date="2024-12-18T10:38:00Z" w:initials="JL">
     <w:p>
       <w:pPr>
         <w:pStyle w:val="CommentText"/>
@@ -10545,7 +11847,15 @@
         <w:annotationRef/>
       </w:r>
       <w:r>
-        <w:t>I recommend adding a short blurb about the Welcome Corps here. You could note that it’s a American private resettlement system based on the Canadian model, as you mention in the Abstract.</w:t>
+        <w:t xml:space="preserve">I recommend adding a short blurb about the Welcome Corps here. You could note that it’s </w:t>
+      </w:r>
+      <w:proofErr w:type="gramStart"/>
+      <w:r>
+        <w:t>a</w:t>
+      </w:r>
+      <w:proofErr w:type="gramEnd"/>
+      <w:r>
+        <w:t xml:space="preserve"> American private resettlement system based on the Canadian model, as you mention in the Abstract.</w:t>
       </w:r>
     </w:p>
   </w:comment>
@@ -11356,7 +12666,6 @@
   <w:style w:type="character" w:default="1" w:styleId="DefaultParagraphFont">
     <w:name w:val="Default Paragraph Font"/>
     <w:uiPriority w:val="1"/>
-    <w:semiHidden/>
     <w:unhideWhenUsed/>
   </w:style>
   <w:style w:type="table" w:default="1" w:styleId="TableNormal">

</xml_diff>